<commit_message>
Add site plan, location choice and realistic 3D plant site
- 3D model now shows the full 1.8 ha site in Chirchiq: production hall
  with roof and cutaway, warehouse with racks, admin building, gate and
  weighbridge, oil tank farm with bund, transformer and generator, gas
  cabinet, fire water, wastewater, phase-3 reserve, roads, trees,
  vehicles and people, with sky lighting and procedural textures
- Location panel compares Chirchiq technopark, Qo'qon FEZ and Angren FEZ
- Business plan: new chapter on region choice, land balance, site
  objects, utilities and rent-vs-build costs; deck gets a site-plan slide

Co-Authored-By: Claude Opus 5.5 <noreply@anthropic.com>
Claude-Session: https://claude.ai/code/session_013QoaMd49UrmVzrcKY35rVy
</commit_message>
<xml_diff>
--- a/projects/bioplast-tech/BioPlast_Tech_biznes_reja.docx
+++ b/projects/bioplast-tech/BioPlast_Tech_biznes_reja.docx
@@ -1155,7 +1155,7 @@
         <w:rPr>
           <w:rFonts w:ascii="Arial" w:cs="Arial" w:eastAsia="Arial" w:hAnsi="Arial"/>
         </w:rPr>
-        <w:t xml:space="preserve"> — Toshkent viloyatida joylashadigan kichik biotexnologik korxona. U ikki narsani birlashtiradi: (1) mahalliy yog‘-moy chiqindilaridan bakteriyalar yordamida </w:t>
+        <w:t xml:space="preserve"> — Toshkent viloyati, Chirchiq shahridagi kimyo-industrial texnoparkda joylashadigan kichik biotexnologik korxona (hudud 1,8 ga). U ikki narsani birlashtiradi: (1) mahalliy yog‘-moy chiqindilaridan bakteriyalar yordamida </w:t>
       </w:r>
       <w:r>
         <w:rPr>
@@ -1750,6 +1750,114 @@
                 <w:szCs w:val="16"/>
               </w:rPr>
               <w:t xml:space="preserve">paket/plyonka; PHA ~58 t/yil</w:t>
+            </w:r>
+          </w:p>
+        </w:tc>
+      </w:tr>
+      <w:tr>
+        <w:tc>
+          <w:tcPr>
+            <w:tcW w:type="dxa" w:w="4819"/>
+            <w:tcBorders>
+              <w:top w:val="single" w:color="B7C4CC" w:sz="4"/>
+              <w:left w:val="single" w:color="B7C4CC" w:sz="4"/>
+              <w:bottom w:val="single" w:color="B7C4CC" w:sz="4"/>
+              <w:right w:val="single" w:color="B7C4CC" w:sz="4"/>
+            </w:tcBorders>
+            <w:shd w:fill="E3EEF3" w:color="auto" w:val="clear"/>
+            <w:tcMar>
+              <w:top w:type="dxa" w:w="100"/>
+              <w:left w:type="dxa" w:w="140"/>
+              <w:bottom w:type="dxa" w:w="100"/>
+              <w:right w:type="dxa" w:w="140"/>
+            </w:tcMar>
+          </w:tcPr>
+          <w:p>
+            <w:r>
+              <w:rPr>
+                <w:rFonts w:ascii="Arial" w:cs="Arial" w:eastAsia="Arial" w:hAnsi="Arial"/>
+                <w:color w:val="555555"/>
+                <w:sz w:val="18"/>
+                <w:szCs w:val="18"/>
+              </w:rPr>
+              <w:t xml:space="preserve">Joylashuv</w:t>
+            </w:r>
+          </w:p>
+          <w:p>
+            <w:r>
+              <w:rPr>
+                <w:rFonts w:ascii="Arial" w:cs="Arial" w:eastAsia="Arial" w:hAnsi="Arial"/>
+                <w:b/>
+                <w:bCs/>
+                <w:color w:val="0B3D5C"/>
+                <w:sz w:val="30"/>
+                <w:szCs w:val="30"/>
+              </w:rPr>
+              <w:t xml:space="preserve">Chirchiq</w:t>
+            </w:r>
+          </w:p>
+          <w:p>
+            <w:r>
+              <w:rPr>
+                <w:rFonts w:ascii="Arial" w:cs="Arial" w:eastAsia="Arial" w:hAnsi="Arial"/>
+                <w:color w:val="555555"/>
+                <w:sz w:val="16"/>
+                <w:szCs w:val="16"/>
+              </w:rPr>
+              <w:t xml:space="preserve">Toshkent viloyati, kimyo-industrial texnopark</w:t>
+            </w:r>
+          </w:p>
+        </w:tc>
+        <w:tc>
+          <w:tcPr>
+            <w:tcW w:type="dxa" w:w="4819"/>
+            <w:tcBorders>
+              <w:top w:val="single" w:color="B7C4CC" w:sz="4"/>
+              <w:left w:val="single" w:color="B7C4CC" w:sz="4"/>
+              <w:bottom w:val="single" w:color="B7C4CC" w:sz="4"/>
+              <w:right w:val="single" w:color="B7C4CC" w:sz="4"/>
+            </w:tcBorders>
+            <w:shd w:fill="E3EEF3" w:color="auto" w:val="clear"/>
+            <w:tcMar>
+              <w:top w:type="dxa" w:w="100"/>
+              <w:left w:type="dxa" w:w="140"/>
+              <w:bottom w:type="dxa" w:w="100"/>
+              <w:right w:type="dxa" w:w="140"/>
+            </w:tcMar>
+          </w:tcPr>
+          <w:p>
+            <w:r>
+              <w:rPr>
+                <w:rFonts w:ascii="Arial" w:cs="Arial" w:eastAsia="Arial" w:hAnsi="Arial"/>
+                <w:color w:val="555555"/>
+                <w:sz w:val="18"/>
+                <w:szCs w:val="18"/>
+              </w:rPr>
+              <w:t xml:space="preserve">Yer maydoni</w:t>
+            </w:r>
+          </w:p>
+          <w:p>
+            <w:r>
+              <w:rPr>
+                <w:rFonts w:ascii="Arial" w:cs="Arial" w:eastAsia="Arial" w:hAnsi="Arial"/>
+                <w:b/>
+                <w:bCs/>
+                <w:color w:val="0B3D5C"/>
+                <w:sz w:val="30"/>
+                <w:szCs w:val="30"/>
+              </w:rPr>
+              <w:t xml:space="preserve">1,8 ga</w:t>
+            </w:r>
+          </w:p>
+          <w:p>
+            <w:r>
+              <w:rPr>
+                <w:rFonts w:ascii="Arial" w:cs="Arial" w:eastAsia="Arial" w:hAnsi="Arial"/>
+                <w:color w:val="555555"/>
+                <w:sz w:val="16"/>
+                <w:szCs w:val="16"/>
+              </w:rPr>
+              <w:t xml:space="preserve">150 × 120 m; minimal 1,2 ga (1–2-faza)</w:t>
             </w:r>
           </w:p>
         </w:tc>
@@ -15253,7 +15361,7 @@
         </w:rPr>
         <w:t xml:space="preserve">Bioreaktorlar (laboratoriya, pilot): Sartorius BIOSTAT — </w:t>
       </w:r>
-      <w:hyperlink w:history="1" r:id="rIdfih2f2pvs4ev5t2fmd3qf">
+      <w:hyperlink w:history="1" r:id="rIdlhwv5uqepq_nnrzt2crai">
         <w:r>
           <w:rPr>
             <w:rStyle w:val="Hyperlink"/>
@@ -15278,7 +15386,7 @@
         </w:rPr>
         <w:t xml:space="preserve">Bioreaktorlar: Eppendorf BioFlo / Innova shakerlar — </w:t>
       </w:r>
-      <w:hyperlink w:history="1" r:id="rIdxizct8-orvpkdytwkrxhg">
+      <w:hyperlink w:history="1" r:id="rIdtfqtzwn316nigjoadcv2f">
         <w:r>
           <w:rPr>
             <w:rStyle w:val="Hyperlink"/>
@@ -15303,7 +15411,7 @@
         </w:rPr>
         <w:t xml:space="preserve">Disk separatorlar: Alfa Laval — </w:t>
       </w:r>
-      <w:hyperlink w:history="1" r:id="rIdwjqzp5eeejxcrdwogl0ps">
+      <w:hyperlink w:history="1" r:id="rIdfwj8fowwcugz9_nit2kbr">
         <w:r>
           <w:rPr>
             <w:rStyle w:val="Hyperlink"/>
@@ -15328,7 +15436,7 @@
         </w:rPr>
         <w:t xml:space="preserve">Separatorlar, purkab quritgichlar: GEA — </w:t>
       </w:r>
-      <w:hyperlink w:history="1" r:id="rIdfnr6iytowcytmiane01r2">
+      <w:hyperlink w:history="1" r:id="rIdfxsqnrdsm_u6m5fnevpas">
         <w:r>
           <w:rPr>
             <w:rStyle w:val="Hyperlink"/>
@@ -15353,7 +15461,7 @@
         </w:rPr>
         <w:t xml:space="preserve">Ikki shnekli ekstruderlar: Coperion ZSK — </w:t>
       </w:r>
-      <w:hyperlink w:history="1" r:id="rIdtarqji3diffnyox3r4dex">
+      <w:hyperlink w:history="1" r:id="rIdxnodpfe968jp33rqjoquk">
         <w:r>
           <w:rPr>
             <w:rStyle w:val="Hyperlink"/>
@@ -15378,7 +15486,7 @@
         </w:rPr>
         <w:t xml:space="preserve">Havo kompressor/puflagichlari: Atlas Copco — </w:t>
       </w:r>
-      <w:hyperlink w:history="1" r:id="rId_9bxbcmtpckfvxmfgknnw">
+      <w:hyperlink w:history="1" r:id="rIdnjc5fp9t7tnnjcuaxjczv">
         <w:r>
           <w:rPr>
             <w:rStyle w:val="Hyperlink"/>
@@ -15403,7 +15511,7 @@
         </w:rPr>
         <w:t xml:space="preserve">Gaz xromatograf: Agilent — </w:t>
       </w:r>
-      <w:hyperlink w:history="1" r:id="rIdq1vjcxdpmtejaqndcajwp">
+      <w:hyperlink w:history="1" r:id="rIdbroyzq-2r3ygidsyg1z8x">
         <w:r>
           <w:rPr>
             <w:rStyle w:val="Hyperlink"/>
@@ -15428,7 +15536,7 @@
         </w:rPr>
         <w:t xml:space="preserve">Gaz xromatograf, spektrofotometr: Shimadzu — </w:t>
       </w:r>
-      <w:hyperlink w:history="1" r:id="rIda12g5msvc_nbjgc4sda0g">
+      <w:hyperlink w:history="1" r:id="rId-k8if4mju1bxtat5safav">
         <w:r>
           <w:rPr>
             <w:rStyle w:val="Hyperlink"/>
@@ -15453,7 +15561,7 @@
         </w:rPr>
         <w:t xml:space="preserve">Mexanik sinov mashinalari: ZwickRoell — </w:t>
       </w:r>
-      <w:hyperlink w:history="1" r:id="rIdc9yjlc0yzu7pvy7o8v4ey">
+      <w:hyperlink w:history="1" r:id="rIdw1srna8xu2e_vf7ae0_cj">
         <w:r>
           <w:rPr>
             <w:rStyle w:val="Hyperlink"/>
@@ -15478,7 +15586,7 @@
         </w:rPr>
         <w:t xml:space="preserve">Avtoklavlar: Tuttnauer — </w:t>
       </w:r>
-      <w:hyperlink w:history="1" r:id="rId1oax_aoqgjbop4qxhbymb">
+      <w:hyperlink w:history="1" r:id="rIdw1zdvv5zts3gfuymeylws">
         <w:r>
           <w:rPr>
             <w:rStyle w:val="Hyperlink"/>
@@ -15515,7 +15623,7 @@
         </w:rPr>
         <w:t xml:space="preserve">Alibaba — «stainless steel fermenter 5000L» qidiruvi — </w:t>
       </w:r>
-      <w:hyperlink w:history="1" r:id="rIdedjoja2i-d2ktqmsajjnh">
+      <w:hyperlink w:history="1" r:id="rIdpsaimsddsm-_2m_irt6wq">
         <w:r>
           <w:rPr>
             <w:rStyle w:val="Hyperlink"/>
@@ -15540,7 +15648,7 @@
         </w:rPr>
         <w:t xml:space="preserve">Alibaba — «biodegradable blown film machine» — </w:t>
       </w:r>
-      <w:hyperlink w:history="1" r:id="rIdtycwua6gbl3r_8wpqg6id">
+      <w:hyperlink w:history="1" r:id="rId1_m_-cebgaty0jiefjotq">
         <w:r>
           <w:rPr>
             <w:rStyle w:val="Hyperlink"/>
@@ -15565,7 +15673,7 @@
         </w:rPr>
         <w:t xml:space="preserve">Made-in-China — bioreaktor ishlab chiqaruvchilari — </w:t>
       </w:r>
-      <w:hyperlink w:history="1" r:id="rIdi4j99lyzu19kc3iwznfnf">
+      <w:hyperlink w:history="1" r:id="rId8jffjosfocbfttnxj9awv">
         <w:r>
           <w:rPr>
             <w:rStyle w:val="Hyperlink"/>
@@ -15590,7 +15698,7 @@
         </w:rPr>
         <w:t xml:space="preserve">Shanghai Bailun / Bailun Biotechnology (Jiangsu) profili — </w:t>
       </w:r>
-      <w:hyperlink w:history="1" r:id="rIdbrfrfinkkyjphjuzssxr3">
+      <w:hyperlink w:history="1" r:id="rIdf749u1pjonbo4ewxkrhxy">
         <w:r>
           <w:rPr>
             <w:rStyle w:val="Hyperlink"/>
@@ -15639,7 +15747,7 @@
         </w:rPr>
         <w:t xml:space="preserve">Wikimedia Commons (CC litsenziyali; «Bioreactor», «Disc stack centrifuge», «Spray dryer», «Blown film extrusion» deb qidiring) — </w:t>
       </w:r>
-      <w:hyperlink w:history="1" r:id="rIdg0--bs_tv2w2omyhu5acj">
+      <w:hyperlink w:history="1" r:id="rIdidqgnvnztpxyz3auygzcx">
         <w:r>
           <w:rPr>
             <w:rStyle w:val="Hyperlink"/>
@@ -15747,7 +15855,7 @@
         <w:rPr>
           <w:rFonts w:ascii="Arial" w:cs="Arial" w:eastAsia="Arial" w:hAnsi="Arial"/>
         </w:rPr>
-        <w:t xml:space="preserve">7. Joylashuv, infratuzilma va xodimlar</w:t>
+        <w:t xml:space="preserve">7. Joylashuv, yer maydoni va bosh reja</w:t>
       </w:r>
     </w:p>
     <w:p>
@@ -15759,7 +15867,7 @@
         <w:rPr>
           <w:rFonts w:ascii="Arial" w:cs="Arial" w:eastAsia="Arial" w:hAnsi="Arial"/>
         </w:rPr>
-        <w:t xml:space="preserve">7.1. Joylashuv</w:t>
+        <w:t xml:space="preserve">7.1. Qaysi viloyat: tanlov mezonlari</w:t>
       </w:r>
     </w:p>
     <w:p>
@@ -15771,21 +15879,7 @@
         <w:rPr>
           <w:rFonts w:ascii="Arial" w:cs="Arial" w:eastAsia="Arial" w:hAnsi="Arial"/>
         </w:rPr>
-        <w:t xml:space="preserve">Tavsiya: </w:t>
-      </w:r>
-      <w:r>
-        <w:rPr>
-          <w:rFonts w:ascii="Arial" w:cs="Arial" w:eastAsia="Arial" w:hAnsi="Arial"/>
-          <w:b/>
-          <w:bCs/>
-        </w:rPr>
-        <w:t xml:space="preserve">Toshkent viloyatidagi sanoat zonasi yoki erkin iqtisodiy zona</w:t>
-      </w:r>
-      <w:r>
-        <w:rPr>
-          <w:rFonts w:ascii="Arial" w:cs="Arial" w:eastAsia="Arial" w:hAnsi="Arial"/>
-        </w:rPr>
-        <w:t xml:space="preserve"> (masalan, Chirchiq, Olmaliq, Yangiyo‘l yo‘nalishlari). Sabablari: TKTI va laboratoriyalarga yaqinlik, asosiy mijozlar (Toshkent savdo tarmoqlari) 50 km radiusda, yog‘-moy korxonalari va HoReCa chiqindilari ko‘p, gaz va uch fazali elektr ulanishi mavjud. Farg‘ona vodiysi — qishloq xo‘jaligi mulcha plyonkasi bozori uchun ikkinchi bosqichdagi filial.</w:t>
+        <w:t xml:space="preserve">Joy 6 ta mezon bo‘yicha tanlandi: xomashyo manbai, asosiy bozor, ilmiy hamkor, kimyo infratuzilmasi, imtiyozlar va logistika. Uchta real variant solishtirildi:</w:t>
       </w:r>
     </w:p>
     <w:tbl>
@@ -15802,8 +15896,10 @@
         <w:tblLayout w:type="fixed"/>
       </w:tblPr>
       <w:tblGrid>
-        <w:gridCol w:w="3855"/>
-        <w:gridCol w:w="5783"/>
+        <w:gridCol w:w="1542"/>
+        <w:gridCol w:w="2891"/>
+        <w:gridCol w:w="2698"/>
+        <w:gridCol w:w="2507"/>
       </w:tblGrid>
       <w:tr>
         <w:trPr>
@@ -15811,7 +15907,7 @@
         </w:trPr>
         <w:tc>
           <w:tcPr>
-            <w:tcW w:type="dxa" w:w="3855"/>
+            <w:tcW w:type="dxa" w:w="1542"/>
             <w:tcBorders>
               <w:top w:val="single" w:color="B7C4CC" w:sz="4"/>
               <w:left w:val="single" w:color="B7C4CC" w:sz="4"/>
@@ -15839,13 +15935,13 @@
                 <w:sz w:val="18"/>
                 <w:szCs w:val="18"/>
               </w:rPr>
-              <w:t xml:space="preserve">Talab</w:t>
-            </w:r>
-          </w:p>
-        </w:tc>
-        <w:tc>
-          <w:tcPr>
-            <w:tcW w:type="dxa" w:w="5783"/>
+              <w:t xml:space="preserve">Mezon</w:t>
+            </w:r>
+          </w:p>
+        </w:tc>
+        <w:tc>
+          <w:tcPr>
+            <w:tcW w:type="dxa" w:w="2891"/>
             <w:tcBorders>
               <w:top w:val="single" w:color="B7C4CC" w:sz="4"/>
               <w:left w:val="single" w:color="B7C4CC" w:sz="4"/>
@@ -15873,7 +15969,75 @@
                 <w:sz w:val="18"/>
                 <w:szCs w:val="18"/>
               </w:rPr>
-              <w:t xml:space="preserve">Miqdor</w:t>
+              <w:t xml:space="preserve">Chirchiq kimyo-industrial texnoparki (Toshkent vil.)</w:t>
+            </w:r>
+          </w:p>
+        </w:tc>
+        <w:tc>
+          <w:tcPr>
+            <w:tcW w:type="dxa" w:w="2698"/>
+            <w:tcBorders>
+              <w:top w:val="single" w:color="B7C4CC" w:sz="4"/>
+              <w:left w:val="single" w:color="B7C4CC" w:sz="4"/>
+              <w:bottom w:val="single" w:color="B7C4CC" w:sz="4"/>
+              <w:right w:val="single" w:color="B7C4CC" w:sz="4"/>
+            </w:tcBorders>
+            <w:shd w:fill="1F6F5C" w:color="auto" w:val="clear"/>
+            <w:tcMar>
+              <w:top w:type="dxa" w:w="60"/>
+              <w:left w:type="dxa" w:w="90"/>
+              <w:bottom w:type="dxa" w:w="60"/>
+              <w:right w:type="dxa" w:w="90"/>
+            </w:tcMar>
+          </w:tcPr>
+          <w:p>
+            <w:pPr>
+              <w:jc w:val="left"/>
+            </w:pPr>
+            <w:r>
+              <w:rPr>
+                <w:rFonts w:ascii="Arial" w:cs="Arial" w:eastAsia="Arial" w:hAnsi="Arial"/>
+                <w:b/>
+                <w:bCs/>
+                <w:color w:val="FFFFFF"/>
+                <w:sz w:val="18"/>
+                <w:szCs w:val="18"/>
+              </w:rPr>
+              <w:t xml:space="preserve">«Qo‘qon» EIZ (Farg‘ona vil.)</w:t>
+            </w:r>
+          </w:p>
+        </w:tc>
+        <w:tc>
+          <w:tcPr>
+            <w:tcW w:type="dxa" w:w="2507"/>
+            <w:tcBorders>
+              <w:top w:val="single" w:color="B7C4CC" w:sz="4"/>
+              <w:left w:val="single" w:color="B7C4CC" w:sz="4"/>
+              <w:bottom w:val="single" w:color="B7C4CC" w:sz="4"/>
+              <w:right w:val="single" w:color="B7C4CC" w:sz="4"/>
+            </w:tcBorders>
+            <w:shd w:fill="1F6F5C" w:color="auto" w:val="clear"/>
+            <w:tcMar>
+              <w:top w:type="dxa" w:w="60"/>
+              <w:left w:type="dxa" w:w="90"/>
+              <w:bottom w:type="dxa" w:w="60"/>
+              <w:right w:type="dxa" w:w="90"/>
+            </w:tcMar>
+          </w:tcPr>
+          <w:p>
+            <w:pPr>
+              <w:jc w:val="left"/>
+            </w:pPr>
+            <w:r>
+              <w:rPr>
+                <w:rFonts w:ascii="Arial" w:cs="Arial" w:eastAsia="Arial" w:hAnsi="Arial"/>
+                <w:b/>
+                <w:bCs/>
+                <w:color w:val="FFFFFF"/>
+                <w:sz w:val="18"/>
+                <w:szCs w:val="18"/>
+              </w:rPr>
+              <w:t xml:space="preserve">Angren EIZ (Toshkent vil.)</w:t>
             </w:r>
           </w:p>
         </w:tc>
@@ -15881,61 +16045,125 @@
       <w:tr>
         <w:tc>
           <w:tcPr>
-            <w:tcW w:type="dxa" w:w="3855"/>
-            <w:tcBorders>
-              <w:top w:val="single" w:color="B7C4CC" w:sz="4"/>
-              <w:left w:val="single" w:color="B7C4CC" w:sz="4"/>
-              <w:bottom w:val="single" w:color="B7C4CC" w:sz="4"/>
-              <w:right w:val="single" w:color="B7C4CC" w:sz="4"/>
-            </w:tcBorders>
-            <w:tcMar>
-              <w:top w:type="dxa" w:w="60"/>
-              <w:left w:type="dxa" w:w="90"/>
-              <w:bottom w:type="dxa" w:w="60"/>
-              <w:right w:type="dxa" w:w="90"/>
-            </w:tcMar>
-          </w:tcPr>
-          <w:p>
-            <w:pPr>
-              <w:jc w:val="left"/>
-            </w:pPr>
-            <w:r>
-              <w:rPr>
-                <w:rFonts w:ascii="Arial" w:cs="Arial" w:eastAsia="Arial" w:hAnsi="Arial"/>
-                <w:sz w:val="18"/>
-                <w:szCs w:val="18"/>
-              </w:rPr>
-              <w:t xml:space="preserve">Ishlab chiqarish maydoni</w:t>
-            </w:r>
-          </w:p>
-        </w:tc>
-        <w:tc>
-          <w:tcPr>
-            <w:tcW w:type="dxa" w:w="5783"/>
-            <w:tcBorders>
-              <w:top w:val="single" w:color="B7C4CC" w:sz="4"/>
-              <w:left w:val="single" w:color="B7C4CC" w:sz="4"/>
-              <w:bottom w:val="single" w:color="B7C4CC" w:sz="4"/>
-              <w:right w:val="single" w:color="B7C4CC" w:sz="4"/>
-            </w:tcBorders>
-            <w:tcMar>
-              <w:top w:type="dxa" w:w="60"/>
-              <w:left w:type="dxa" w:w="90"/>
-              <w:bottom w:type="dxa" w:w="60"/>
-              <w:right w:type="dxa" w:w="90"/>
-            </w:tcMar>
-          </w:tcPr>
-          <w:p>
-            <w:pPr>
-              <w:jc w:val="left"/>
-            </w:pPr>
-            <w:r>
-              <w:rPr>
-                <w:rFonts w:ascii="Arial" w:cs="Arial" w:eastAsia="Arial" w:hAnsi="Arial"/>
-                <w:sz w:val="18"/>
-                <w:szCs w:val="18"/>
-              </w:rPr>
-              <w:t xml:space="preserve">1 500 m² (shundan ~150 m² laboratoriya va toza xona)</w:t>
+            <w:tcW w:type="dxa" w:w="1542"/>
+            <w:tcBorders>
+              <w:top w:val="single" w:color="B7C4CC" w:sz="4"/>
+              <w:left w:val="single" w:color="B7C4CC" w:sz="4"/>
+              <w:bottom w:val="single" w:color="B7C4CC" w:sz="4"/>
+              <w:right w:val="single" w:color="B7C4CC" w:sz="4"/>
+            </w:tcBorders>
+            <w:tcMar>
+              <w:top w:type="dxa" w:w="60"/>
+              <w:left w:type="dxa" w:w="90"/>
+              <w:bottom w:type="dxa" w:w="60"/>
+              <w:right w:type="dxa" w:w="90"/>
+            </w:tcMar>
+          </w:tcPr>
+          <w:p>
+            <w:pPr>
+              <w:jc w:val="left"/>
+            </w:pPr>
+            <w:r>
+              <w:rPr>
+                <w:rFonts w:ascii="Arial" w:cs="Arial" w:eastAsia="Arial" w:hAnsi="Arial"/>
+                <w:sz w:val="18"/>
+                <w:szCs w:val="18"/>
+              </w:rPr>
+              <w:t xml:space="preserve">Xomashyo (yog‘)</w:t>
+            </w:r>
+          </w:p>
+        </w:tc>
+        <w:tc>
+          <w:tcPr>
+            <w:tcW w:type="dxa" w:w="2891"/>
+            <w:tcBorders>
+              <w:top w:val="single" w:color="B7C4CC" w:sz="4"/>
+              <w:left w:val="single" w:color="B7C4CC" w:sz="4"/>
+              <w:bottom w:val="single" w:color="B7C4CC" w:sz="4"/>
+              <w:right w:val="single" w:color="B7C4CC" w:sz="4"/>
+            </w:tcBorders>
+            <w:tcMar>
+              <w:top w:type="dxa" w:w="60"/>
+              <w:left w:type="dxa" w:w="90"/>
+              <w:bottom w:type="dxa" w:w="60"/>
+              <w:right w:type="dxa" w:w="90"/>
+            </w:tcMar>
+          </w:tcPr>
+          <w:p>
+            <w:pPr>
+              <w:jc w:val="left"/>
+            </w:pPr>
+            <w:r>
+              <w:rPr>
+                <w:rFonts w:ascii="Arial" w:cs="Arial" w:eastAsia="Arial" w:hAnsi="Arial"/>
+                <w:b/>
+                <w:bCs/>
+                <w:sz w:val="18"/>
+                <w:szCs w:val="18"/>
+              </w:rPr>
+              <w:t xml:space="preserve">Toshkent HoReCa sektorining ishlatilgan yog‘i, ≈35 km</w:t>
+            </w:r>
+          </w:p>
+        </w:tc>
+        <w:tc>
+          <w:tcPr>
+            <w:tcW w:type="dxa" w:w="2698"/>
+            <w:tcBorders>
+              <w:top w:val="single" w:color="B7C4CC" w:sz="4"/>
+              <w:left w:val="single" w:color="B7C4CC" w:sz="4"/>
+              <w:bottom w:val="single" w:color="B7C4CC" w:sz="4"/>
+              <w:right w:val="single" w:color="B7C4CC" w:sz="4"/>
+            </w:tcBorders>
+            <w:tcMar>
+              <w:top w:type="dxa" w:w="60"/>
+              <w:left w:type="dxa" w:w="90"/>
+              <w:bottom w:type="dxa" w:w="60"/>
+              <w:right w:type="dxa" w:w="90"/>
+            </w:tcMar>
+          </w:tcPr>
+          <w:p>
+            <w:pPr>
+              <w:jc w:val="left"/>
+            </w:pPr>
+            <w:r>
+              <w:rPr>
+                <w:rFonts w:ascii="Arial" w:cs="Arial" w:eastAsia="Arial" w:hAnsi="Arial"/>
+                <w:b/>
+                <w:bCs/>
+                <w:sz w:val="18"/>
+                <w:szCs w:val="18"/>
+              </w:rPr>
+              <w:t xml:space="preserve">Farg‘ona va Qo‘qon yog‘-moy zavodlari soapstoki</w:t>
+            </w:r>
+          </w:p>
+        </w:tc>
+        <w:tc>
+          <w:tcPr>
+            <w:tcW w:type="dxa" w:w="2507"/>
+            <w:tcBorders>
+              <w:top w:val="single" w:color="B7C4CC" w:sz="4"/>
+              <w:left w:val="single" w:color="B7C4CC" w:sz="4"/>
+              <w:bottom w:val="single" w:color="B7C4CC" w:sz="4"/>
+              <w:right w:val="single" w:color="B7C4CC" w:sz="4"/>
+            </w:tcBorders>
+            <w:tcMar>
+              <w:top w:type="dxa" w:w="60"/>
+              <w:left w:type="dxa" w:w="90"/>
+              <w:bottom w:type="dxa" w:w="60"/>
+              <w:right w:type="dxa" w:w="90"/>
+            </w:tcMar>
+          </w:tcPr>
+          <w:p>
+            <w:pPr>
+              <w:jc w:val="left"/>
+            </w:pPr>
+            <w:r>
+              <w:rPr>
+                <w:rFonts w:ascii="Arial" w:cs="Arial" w:eastAsia="Arial" w:hAnsi="Arial"/>
+                <w:sz w:val="18"/>
+                <w:szCs w:val="18"/>
+              </w:rPr>
+              <w:t xml:space="preserve">Uzoq, ≈110 km</w:t>
             </w:r>
           </w:p>
         </w:tc>
@@ -15943,63 +16171,127 @@
       <w:tr>
         <w:tc>
           <w:tcPr>
-            <w:tcW w:type="dxa" w:w="3855"/>
-            <w:tcBorders>
-              <w:top w:val="single" w:color="B7C4CC" w:sz="4"/>
-              <w:left w:val="single" w:color="B7C4CC" w:sz="4"/>
-              <w:bottom w:val="single" w:color="B7C4CC" w:sz="4"/>
-              <w:right w:val="single" w:color="B7C4CC" w:sz="4"/>
-            </w:tcBorders>
-            <w:shd w:fill="F4F8FA" w:color="auto" w:val="clear"/>
-            <w:tcMar>
-              <w:top w:type="dxa" w:w="60"/>
-              <w:left w:type="dxa" w:w="90"/>
-              <w:bottom w:type="dxa" w:w="60"/>
-              <w:right w:type="dxa" w:w="90"/>
-            </w:tcMar>
-          </w:tcPr>
-          <w:p>
-            <w:pPr>
-              <w:jc w:val="left"/>
-            </w:pPr>
-            <w:r>
-              <w:rPr>
-                <w:rFonts w:ascii="Arial" w:cs="Arial" w:eastAsia="Arial" w:hAnsi="Arial"/>
-                <w:sz w:val="18"/>
-                <w:szCs w:val="18"/>
-              </w:rPr>
-              <w:t xml:space="preserve">Elektr quvvati</w:t>
-            </w:r>
-          </w:p>
-        </w:tc>
-        <w:tc>
-          <w:tcPr>
-            <w:tcW w:type="dxa" w:w="5783"/>
-            <w:tcBorders>
-              <w:top w:val="single" w:color="B7C4CC" w:sz="4"/>
-              <w:left w:val="single" w:color="B7C4CC" w:sz="4"/>
-              <w:bottom w:val="single" w:color="B7C4CC" w:sz="4"/>
-              <w:right w:val="single" w:color="B7C4CC" w:sz="4"/>
-            </w:tcBorders>
-            <w:shd w:fill="F4F8FA" w:color="auto" w:val="clear"/>
-            <w:tcMar>
-              <w:top w:type="dxa" w:w="60"/>
-              <w:left w:type="dxa" w:w="90"/>
-              <w:bottom w:type="dxa" w:w="60"/>
-              <w:right w:type="dxa" w:w="90"/>
-            </w:tcMar>
-          </w:tcPr>
-          <w:p>
-            <w:pPr>
-              <w:jc w:val="left"/>
-            </w:pPr>
-            <w:r>
-              <w:rPr>
-                <w:rFonts w:ascii="Arial" w:cs="Arial" w:eastAsia="Arial" w:hAnsi="Arial"/>
-                <w:sz w:val="18"/>
-                <w:szCs w:val="18"/>
-              </w:rPr>
-              <w:t xml:space="preserve">≈400–500 kVt o‘rnatilgan quvvat, uch faza 0,4 kV</w:t>
+            <w:tcW w:type="dxa" w:w="1542"/>
+            <w:tcBorders>
+              <w:top w:val="single" w:color="B7C4CC" w:sz="4"/>
+              <w:left w:val="single" w:color="B7C4CC" w:sz="4"/>
+              <w:bottom w:val="single" w:color="B7C4CC" w:sz="4"/>
+              <w:right w:val="single" w:color="B7C4CC" w:sz="4"/>
+            </w:tcBorders>
+            <w:shd w:fill="F4F8FA" w:color="auto" w:val="clear"/>
+            <w:tcMar>
+              <w:top w:type="dxa" w:w="60"/>
+              <w:left w:type="dxa" w:w="90"/>
+              <w:bottom w:type="dxa" w:w="60"/>
+              <w:right w:type="dxa" w:w="90"/>
+            </w:tcMar>
+          </w:tcPr>
+          <w:p>
+            <w:pPr>
+              <w:jc w:val="left"/>
+            </w:pPr>
+            <w:r>
+              <w:rPr>
+                <w:rFonts w:ascii="Arial" w:cs="Arial" w:eastAsia="Arial" w:hAnsi="Arial"/>
+                <w:sz w:val="18"/>
+                <w:szCs w:val="18"/>
+              </w:rPr>
+              <w:t xml:space="preserve">Paket bozori</w:t>
+            </w:r>
+          </w:p>
+        </w:tc>
+        <w:tc>
+          <w:tcPr>
+            <w:tcW w:type="dxa" w:w="2891"/>
+            <w:tcBorders>
+              <w:top w:val="single" w:color="B7C4CC" w:sz="4"/>
+              <w:left w:val="single" w:color="B7C4CC" w:sz="4"/>
+              <w:bottom w:val="single" w:color="B7C4CC" w:sz="4"/>
+              <w:right w:val="single" w:color="B7C4CC" w:sz="4"/>
+            </w:tcBorders>
+            <w:shd w:fill="F4F8FA" w:color="auto" w:val="clear"/>
+            <w:tcMar>
+              <w:top w:type="dxa" w:w="60"/>
+              <w:left w:type="dxa" w:w="90"/>
+              <w:bottom w:type="dxa" w:w="60"/>
+              <w:right w:type="dxa" w:w="90"/>
+            </w:tcMar>
+          </w:tcPr>
+          <w:p>
+            <w:pPr>
+              <w:jc w:val="left"/>
+            </w:pPr>
+            <w:r>
+              <w:rPr>
+                <w:rFonts w:ascii="Arial" w:cs="Arial" w:eastAsia="Arial" w:hAnsi="Arial"/>
+                <w:b/>
+                <w:bCs/>
+                <w:sz w:val="18"/>
+                <w:szCs w:val="18"/>
+              </w:rPr>
+              <w:t xml:space="preserve">Toshkent savdo tarmoqlari, ≈35 km</w:t>
+            </w:r>
+          </w:p>
+        </w:tc>
+        <w:tc>
+          <w:tcPr>
+            <w:tcW w:type="dxa" w:w="2698"/>
+            <w:tcBorders>
+              <w:top w:val="single" w:color="B7C4CC" w:sz="4"/>
+              <w:left w:val="single" w:color="B7C4CC" w:sz="4"/>
+              <w:bottom w:val="single" w:color="B7C4CC" w:sz="4"/>
+              <w:right w:val="single" w:color="B7C4CC" w:sz="4"/>
+            </w:tcBorders>
+            <w:shd w:fill="F4F8FA" w:color="auto" w:val="clear"/>
+            <w:tcMar>
+              <w:top w:type="dxa" w:w="60"/>
+              <w:left w:type="dxa" w:w="90"/>
+              <w:bottom w:type="dxa" w:w="60"/>
+              <w:right w:type="dxa" w:w="90"/>
+            </w:tcMar>
+          </w:tcPr>
+          <w:p>
+            <w:pPr>
+              <w:jc w:val="left"/>
+            </w:pPr>
+            <w:r>
+              <w:rPr>
+                <w:rFonts w:ascii="Arial" w:cs="Arial" w:eastAsia="Arial" w:hAnsi="Arial"/>
+                <w:sz w:val="18"/>
+                <w:szCs w:val="18"/>
+              </w:rPr>
+              <w:t xml:space="preserve">Vodiy bozori; Toshkentgacha ≈230 km, dovon orqali</w:t>
+            </w:r>
+          </w:p>
+        </w:tc>
+        <w:tc>
+          <w:tcPr>
+            <w:tcW w:type="dxa" w:w="2507"/>
+            <w:tcBorders>
+              <w:top w:val="single" w:color="B7C4CC" w:sz="4"/>
+              <w:left w:val="single" w:color="B7C4CC" w:sz="4"/>
+              <w:bottom w:val="single" w:color="B7C4CC" w:sz="4"/>
+              <w:right w:val="single" w:color="B7C4CC" w:sz="4"/>
+            </w:tcBorders>
+            <w:shd w:fill="F4F8FA" w:color="auto" w:val="clear"/>
+            <w:tcMar>
+              <w:top w:type="dxa" w:w="60"/>
+              <w:left w:type="dxa" w:w="90"/>
+              <w:bottom w:type="dxa" w:w="60"/>
+              <w:right w:type="dxa" w:w="90"/>
+            </w:tcMar>
+          </w:tcPr>
+          <w:p>
+            <w:pPr>
+              <w:jc w:val="left"/>
+            </w:pPr>
+            <w:r>
+              <w:rPr>
+                <w:rFonts w:ascii="Arial" w:cs="Arial" w:eastAsia="Arial" w:hAnsi="Arial"/>
+                <w:sz w:val="18"/>
+                <w:szCs w:val="18"/>
+              </w:rPr>
+              <w:t xml:space="preserve">Toshkentgacha ≈110 km</w:t>
             </w:r>
           </w:p>
         </w:tc>
@@ -16007,61 +16299,123 @@
       <w:tr>
         <w:tc>
           <w:tcPr>
-            <w:tcW w:type="dxa" w:w="3855"/>
-            <w:tcBorders>
-              <w:top w:val="single" w:color="B7C4CC" w:sz="4"/>
-              <w:left w:val="single" w:color="B7C4CC" w:sz="4"/>
-              <w:bottom w:val="single" w:color="B7C4CC" w:sz="4"/>
-              <w:right w:val="single" w:color="B7C4CC" w:sz="4"/>
-            </w:tcBorders>
-            <w:tcMar>
-              <w:top w:type="dxa" w:w="60"/>
-              <w:left w:type="dxa" w:w="90"/>
-              <w:bottom w:type="dxa" w:w="60"/>
-              <w:right w:type="dxa" w:w="90"/>
-            </w:tcMar>
-          </w:tcPr>
-          <w:p>
-            <w:pPr>
-              <w:jc w:val="left"/>
-            </w:pPr>
-            <w:r>
-              <w:rPr>
-                <w:rFonts w:ascii="Arial" w:cs="Arial" w:eastAsia="Arial" w:hAnsi="Arial"/>
-                <w:sz w:val="18"/>
-                <w:szCs w:val="18"/>
-              </w:rPr>
-              <w:t xml:space="preserve">Tabiiy gaz</w:t>
-            </w:r>
-          </w:p>
-        </w:tc>
-        <w:tc>
-          <w:tcPr>
-            <w:tcW w:type="dxa" w:w="5783"/>
-            <w:tcBorders>
-              <w:top w:val="single" w:color="B7C4CC" w:sz="4"/>
-              <w:left w:val="single" w:color="B7C4CC" w:sz="4"/>
-              <w:bottom w:val="single" w:color="B7C4CC" w:sz="4"/>
-              <w:right w:val="single" w:color="B7C4CC" w:sz="4"/>
-            </w:tcBorders>
-            <w:tcMar>
-              <w:top w:type="dxa" w:w="60"/>
-              <w:left w:type="dxa" w:w="90"/>
-              <w:bottom w:type="dxa" w:w="60"/>
-              <w:right w:type="dxa" w:w="90"/>
-            </w:tcMar>
-          </w:tcPr>
-          <w:p>
-            <w:pPr>
-              <w:jc w:val="left"/>
-            </w:pPr>
-            <w:r>
-              <w:rPr>
-                <w:rFonts w:ascii="Arial" w:cs="Arial" w:eastAsia="Arial" w:hAnsi="Arial"/>
-                <w:sz w:val="18"/>
-                <w:szCs w:val="18"/>
-              </w:rPr>
-              <w:t xml:space="preserve">≈60–80 m³/soat (1 t/soat bug‘ qozoni)</w:t>
+            <w:tcW w:type="dxa" w:w="1542"/>
+            <w:tcBorders>
+              <w:top w:val="single" w:color="B7C4CC" w:sz="4"/>
+              <w:left w:val="single" w:color="B7C4CC" w:sz="4"/>
+              <w:bottom w:val="single" w:color="B7C4CC" w:sz="4"/>
+              <w:right w:val="single" w:color="B7C4CC" w:sz="4"/>
+            </w:tcBorders>
+            <w:tcMar>
+              <w:top w:type="dxa" w:w="60"/>
+              <w:left w:type="dxa" w:w="90"/>
+              <w:bottom w:type="dxa" w:w="60"/>
+              <w:right w:type="dxa" w:w="90"/>
+            </w:tcMar>
+          </w:tcPr>
+          <w:p>
+            <w:pPr>
+              <w:jc w:val="left"/>
+            </w:pPr>
+            <w:r>
+              <w:rPr>
+                <w:rFonts w:ascii="Arial" w:cs="Arial" w:eastAsia="Arial" w:hAnsi="Arial"/>
+                <w:sz w:val="18"/>
+                <w:szCs w:val="18"/>
+              </w:rPr>
+              <w:t xml:space="preserve">Mulcha plyonka bozori</w:t>
+            </w:r>
+          </w:p>
+        </w:tc>
+        <w:tc>
+          <w:tcPr>
+            <w:tcW w:type="dxa" w:w="2891"/>
+            <w:tcBorders>
+              <w:top w:val="single" w:color="B7C4CC" w:sz="4"/>
+              <w:left w:val="single" w:color="B7C4CC" w:sz="4"/>
+              <w:bottom w:val="single" w:color="B7C4CC" w:sz="4"/>
+              <w:right w:val="single" w:color="B7C4CC" w:sz="4"/>
+            </w:tcBorders>
+            <w:tcMar>
+              <w:top w:type="dxa" w:w="60"/>
+              <w:left w:type="dxa" w:w="90"/>
+              <w:bottom w:type="dxa" w:w="60"/>
+              <w:right w:type="dxa" w:w="90"/>
+            </w:tcMar>
+          </w:tcPr>
+          <w:p>
+            <w:pPr>
+              <w:jc w:val="left"/>
+            </w:pPr>
+            <w:r>
+              <w:rPr>
+                <w:rFonts w:ascii="Arial" w:cs="Arial" w:eastAsia="Arial" w:hAnsi="Arial"/>
+                <w:sz w:val="18"/>
+                <w:szCs w:val="18"/>
+              </w:rPr>
+              <w:t xml:space="preserve">Toshkent viloyati fermerlari</w:t>
+            </w:r>
+          </w:p>
+        </w:tc>
+        <w:tc>
+          <w:tcPr>
+            <w:tcW w:type="dxa" w:w="2698"/>
+            <w:tcBorders>
+              <w:top w:val="single" w:color="B7C4CC" w:sz="4"/>
+              <w:left w:val="single" w:color="B7C4CC" w:sz="4"/>
+              <w:bottom w:val="single" w:color="B7C4CC" w:sz="4"/>
+              <w:right w:val="single" w:color="B7C4CC" w:sz="4"/>
+            </w:tcBorders>
+            <w:tcMar>
+              <w:top w:type="dxa" w:w="60"/>
+              <w:left w:type="dxa" w:w="90"/>
+              <w:bottom w:type="dxa" w:w="60"/>
+              <w:right w:type="dxa" w:w="90"/>
+            </w:tcMar>
+          </w:tcPr>
+          <w:p>
+            <w:pPr>
+              <w:jc w:val="left"/>
+            </w:pPr>
+            <w:r>
+              <w:rPr>
+                <w:rFonts w:ascii="Arial" w:cs="Arial" w:eastAsia="Arial" w:hAnsi="Arial"/>
+                <w:b/>
+                <w:bCs/>
+                <w:sz w:val="18"/>
+                <w:szCs w:val="18"/>
+              </w:rPr>
+              <w:t xml:space="preserve">Farg‘ona vodiysi — eng zich dehqonchilik hududi</w:t>
+            </w:r>
+          </w:p>
+        </w:tc>
+        <w:tc>
+          <w:tcPr>
+            <w:tcW w:type="dxa" w:w="2507"/>
+            <w:tcBorders>
+              <w:top w:val="single" w:color="B7C4CC" w:sz="4"/>
+              <w:left w:val="single" w:color="B7C4CC" w:sz="4"/>
+              <w:bottom w:val="single" w:color="B7C4CC" w:sz="4"/>
+              <w:right w:val="single" w:color="B7C4CC" w:sz="4"/>
+            </w:tcBorders>
+            <w:tcMar>
+              <w:top w:type="dxa" w:w="60"/>
+              <w:left w:type="dxa" w:w="90"/>
+              <w:bottom w:type="dxa" w:w="60"/>
+              <w:right w:type="dxa" w:w="90"/>
+            </w:tcMar>
+          </w:tcPr>
+          <w:p>
+            <w:pPr>
+              <w:jc w:val="left"/>
+            </w:pPr>
+            <w:r>
+              <w:rPr>
+                <w:rFonts w:ascii="Arial" w:cs="Arial" w:eastAsia="Arial" w:hAnsi="Arial"/>
+                <w:sz w:val="18"/>
+                <w:szCs w:val="18"/>
+              </w:rPr>
+              <w:t xml:space="preserve">Cheklangan</w:t>
             </w:r>
           </w:p>
         </w:tc>
@@ -16069,63 +16423,127 @@
       <w:tr>
         <w:tc>
           <w:tcPr>
-            <w:tcW w:type="dxa" w:w="3855"/>
-            <w:tcBorders>
-              <w:top w:val="single" w:color="B7C4CC" w:sz="4"/>
-              <w:left w:val="single" w:color="B7C4CC" w:sz="4"/>
-              <w:bottom w:val="single" w:color="B7C4CC" w:sz="4"/>
-              <w:right w:val="single" w:color="B7C4CC" w:sz="4"/>
-            </w:tcBorders>
-            <w:shd w:fill="F4F8FA" w:color="auto" w:val="clear"/>
-            <w:tcMar>
-              <w:top w:type="dxa" w:w="60"/>
-              <w:left w:type="dxa" w:w="90"/>
-              <w:bottom w:type="dxa" w:w="60"/>
-              <w:right w:type="dxa" w:w="90"/>
-            </w:tcMar>
-          </w:tcPr>
-          <w:p>
-            <w:pPr>
-              <w:jc w:val="left"/>
-            </w:pPr>
-            <w:r>
-              <w:rPr>
-                <w:rFonts w:ascii="Arial" w:cs="Arial" w:eastAsia="Arial" w:hAnsi="Arial"/>
-                <w:sz w:val="18"/>
-                <w:szCs w:val="18"/>
-              </w:rPr>
-              <w:t xml:space="preserve">Suv</w:t>
-            </w:r>
-          </w:p>
-        </w:tc>
-        <w:tc>
-          <w:tcPr>
-            <w:tcW w:type="dxa" w:w="5783"/>
-            <w:tcBorders>
-              <w:top w:val="single" w:color="B7C4CC" w:sz="4"/>
-              <w:left w:val="single" w:color="B7C4CC" w:sz="4"/>
-              <w:bottom w:val="single" w:color="B7C4CC" w:sz="4"/>
-              <w:right w:val="single" w:color="B7C4CC" w:sz="4"/>
-            </w:tcBorders>
-            <w:shd w:fill="F4F8FA" w:color="auto" w:val="clear"/>
-            <w:tcMar>
-              <w:top w:type="dxa" w:w="60"/>
-              <w:left w:type="dxa" w:w="90"/>
-              <w:bottom w:type="dxa" w:w="60"/>
-              <w:right w:type="dxa" w:w="90"/>
-            </w:tcMar>
-          </w:tcPr>
-          <w:p>
-            <w:pPr>
-              <w:jc w:val="left"/>
-            </w:pPr>
-            <w:r>
-              <w:rPr>
-                <w:rFonts w:ascii="Arial" w:cs="Arial" w:eastAsia="Arial" w:hAnsi="Arial"/>
-                <w:sz w:val="18"/>
-                <w:szCs w:val="18"/>
-              </w:rPr>
-              <w:t xml:space="preserve">≈30–50 m³/sutka; kanalizatsiyaga ulanish</w:t>
+            <w:tcW w:type="dxa" w:w="1542"/>
+            <w:tcBorders>
+              <w:top w:val="single" w:color="B7C4CC" w:sz="4"/>
+              <w:left w:val="single" w:color="B7C4CC" w:sz="4"/>
+              <w:bottom w:val="single" w:color="B7C4CC" w:sz="4"/>
+              <w:right w:val="single" w:color="B7C4CC" w:sz="4"/>
+            </w:tcBorders>
+            <w:shd w:fill="F4F8FA" w:color="auto" w:val="clear"/>
+            <w:tcMar>
+              <w:top w:type="dxa" w:w="60"/>
+              <w:left w:type="dxa" w:w="90"/>
+              <w:bottom w:type="dxa" w:w="60"/>
+              <w:right w:type="dxa" w:w="90"/>
+            </w:tcMar>
+          </w:tcPr>
+          <w:p>
+            <w:pPr>
+              <w:jc w:val="left"/>
+            </w:pPr>
+            <w:r>
+              <w:rPr>
+                <w:rFonts w:ascii="Arial" w:cs="Arial" w:eastAsia="Arial" w:hAnsi="Arial"/>
+                <w:sz w:val="18"/>
+                <w:szCs w:val="18"/>
+              </w:rPr>
+              <w:t xml:space="preserve">Ilmiy hamkor</w:t>
+            </w:r>
+          </w:p>
+        </w:tc>
+        <w:tc>
+          <w:tcPr>
+            <w:tcW w:type="dxa" w:w="2891"/>
+            <w:tcBorders>
+              <w:top w:val="single" w:color="B7C4CC" w:sz="4"/>
+              <w:left w:val="single" w:color="B7C4CC" w:sz="4"/>
+              <w:bottom w:val="single" w:color="B7C4CC" w:sz="4"/>
+              <w:right w:val="single" w:color="B7C4CC" w:sz="4"/>
+            </w:tcBorders>
+            <w:shd w:fill="F4F8FA" w:color="auto" w:val="clear"/>
+            <w:tcMar>
+              <w:top w:type="dxa" w:w="60"/>
+              <w:left w:type="dxa" w:w="90"/>
+              <w:bottom w:type="dxa" w:w="60"/>
+              <w:right w:type="dxa" w:w="90"/>
+            </w:tcMar>
+          </w:tcPr>
+          <w:p>
+            <w:pPr>
+              <w:jc w:val="left"/>
+            </w:pPr>
+            <w:r>
+              <w:rPr>
+                <w:rFonts w:ascii="Arial" w:cs="Arial" w:eastAsia="Arial" w:hAnsi="Arial"/>
+                <w:b/>
+                <w:bCs/>
+                <w:sz w:val="18"/>
+                <w:szCs w:val="18"/>
+              </w:rPr>
+              <w:t xml:space="preserve">TKTI va laboratoriyalar yaqin</w:t>
+            </w:r>
+          </w:p>
+        </w:tc>
+        <w:tc>
+          <w:tcPr>
+            <w:tcW w:type="dxa" w:w="2698"/>
+            <w:tcBorders>
+              <w:top w:val="single" w:color="B7C4CC" w:sz="4"/>
+              <w:left w:val="single" w:color="B7C4CC" w:sz="4"/>
+              <w:bottom w:val="single" w:color="B7C4CC" w:sz="4"/>
+              <w:right w:val="single" w:color="B7C4CC" w:sz="4"/>
+            </w:tcBorders>
+            <w:shd w:fill="F4F8FA" w:color="auto" w:val="clear"/>
+            <w:tcMar>
+              <w:top w:type="dxa" w:w="60"/>
+              <w:left w:type="dxa" w:w="90"/>
+              <w:bottom w:type="dxa" w:w="60"/>
+              <w:right w:type="dxa" w:w="90"/>
+            </w:tcMar>
+          </w:tcPr>
+          <w:p>
+            <w:pPr>
+              <w:jc w:val="left"/>
+            </w:pPr>
+            <w:r>
+              <w:rPr>
+                <w:rFonts w:ascii="Arial" w:cs="Arial" w:eastAsia="Arial" w:hAnsi="Arial"/>
+                <w:sz w:val="18"/>
+                <w:szCs w:val="18"/>
+              </w:rPr>
+              <w:t xml:space="preserve">Farg‘ona politexnika instituti</w:t>
+            </w:r>
+          </w:p>
+        </w:tc>
+        <w:tc>
+          <w:tcPr>
+            <w:tcW w:type="dxa" w:w="2507"/>
+            <w:tcBorders>
+              <w:top w:val="single" w:color="B7C4CC" w:sz="4"/>
+              <w:left w:val="single" w:color="B7C4CC" w:sz="4"/>
+              <w:bottom w:val="single" w:color="B7C4CC" w:sz="4"/>
+              <w:right w:val="single" w:color="B7C4CC" w:sz="4"/>
+            </w:tcBorders>
+            <w:shd w:fill="F4F8FA" w:color="auto" w:val="clear"/>
+            <w:tcMar>
+              <w:top w:type="dxa" w:w="60"/>
+              <w:left w:type="dxa" w:w="90"/>
+              <w:bottom w:type="dxa" w:w="60"/>
+              <w:right w:type="dxa" w:w="90"/>
+            </w:tcMar>
+          </w:tcPr>
+          <w:p>
+            <w:pPr>
+              <w:jc w:val="left"/>
+            </w:pPr>
+            <w:r>
+              <w:rPr>
+                <w:rFonts w:ascii="Arial" w:cs="Arial" w:eastAsia="Arial" w:hAnsi="Arial"/>
+                <w:sz w:val="18"/>
+                <w:szCs w:val="18"/>
+              </w:rPr>
+              <w:t xml:space="preserve">TKTI uzoqroq</w:t>
             </w:r>
           </w:p>
         </w:tc>
@@ -16133,61 +16551,2192 @@
       <w:tr>
         <w:tc>
           <w:tcPr>
-            <w:tcW w:type="dxa" w:w="3855"/>
-            <w:tcBorders>
-              <w:top w:val="single" w:color="B7C4CC" w:sz="4"/>
-              <w:left w:val="single" w:color="B7C4CC" w:sz="4"/>
-              <w:bottom w:val="single" w:color="B7C4CC" w:sz="4"/>
-              <w:right w:val="single" w:color="B7C4CC" w:sz="4"/>
-            </w:tcBorders>
-            <w:tcMar>
-              <w:top w:type="dxa" w:w="60"/>
-              <w:left w:type="dxa" w:w="90"/>
-              <w:bottom w:type="dxa" w:w="60"/>
-              <w:right w:type="dxa" w:w="90"/>
-            </w:tcMar>
-          </w:tcPr>
-          <w:p>
-            <w:pPr>
-              <w:jc w:val="left"/>
-            </w:pPr>
-            <w:r>
-              <w:rPr>
-                <w:rFonts w:ascii="Arial" w:cs="Arial" w:eastAsia="Arial" w:hAnsi="Arial"/>
-                <w:sz w:val="18"/>
-                <w:szCs w:val="18"/>
-              </w:rPr>
-              <w:t xml:space="preserve">Transport</w:t>
-            </w:r>
-          </w:p>
-        </w:tc>
-        <w:tc>
-          <w:tcPr>
-            <w:tcW w:type="dxa" w:w="5783"/>
-            <w:tcBorders>
-              <w:top w:val="single" w:color="B7C4CC" w:sz="4"/>
-              <w:left w:val="single" w:color="B7C4CC" w:sz="4"/>
-              <w:bottom w:val="single" w:color="B7C4CC" w:sz="4"/>
-              <w:right w:val="single" w:color="B7C4CC" w:sz="4"/>
-            </w:tcBorders>
-            <w:tcMar>
-              <w:top w:type="dxa" w:w="60"/>
-              <w:left w:type="dxa" w:w="90"/>
-              <w:bottom w:type="dxa" w:w="60"/>
-              <w:right w:type="dxa" w:w="90"/>
-            </w:tcMar>
-          </w:tcPr>
-          <w:p>
-            <w:pPr>
-              <w:jc w:val="left"/>
-            </w:pPr>
-            <w:r>
-              <w:rPr>
-                <w:rFonts w:ascii="Arial" w:cs="Arial" w:eastAsia="Arial" w:hAnsi="Arial"/>
-                <w:sz w:val="18"/>
-                <w:szCs w:val="18"/>
-              </w:rPr>
-              <w:t xml:space="preserve">Yuk mashinasi kirishi, avtomobil yo‘liga yaqinlik</w:t>
+            <w:tcW w:type="dxa" w:w="1542"/>
+            <w:tcBorders>
+              <w:top w:val="single" w:color="B7C4CC" w:sz="4"/>
+              <w:left w:val="single" w:color="B7C4CC" w:sz="4"/>
+              <w:bottom w:val="single" w:color="B7C4CC" w:sz="4"/>
+              <w:right w:val="single" w:color="B7C4CC" w:sz="4"/>
+            </w:tcBorders>
+            <w:tcMar>
+              <w:top w:type="dxa" w:w="60"/>
+              <w:left w:type="dxa" w:w="90"/>
+              <w:bottom w:type="dxa" w:w="60"/>
+              <w:right w:type="dxa" w:w="90"/>
+            </w:tcMar>
+          </w:tcPr>
+          <w:p>
+            <w:pPr>
+              <w:jc w:val="left"/>
+            </w:pPr>
+            <w:r>
+              <w:rPr>
+                <w:rFonts w:ascii="Arial" w:cs="Arial" w:eastAsia="Arial" w:hAnsi="Arial"/>
+                <w:sz w:val="18"/>
+                <w:szCs w:val="18"/>
+              </w:rPr>
+              <w:t xml:space="preserve">Infratuzilma</w:t>
+            </w:r>
+          </w:p>
+        </w:tc>
+        <w:tc>
+          <w:tcPr>
+            <w:tcW w:type="dxa" w:w="2891"/>
+            <w:tcBorders>
+              <w:top w:val="single" w:color="B7C4CC" w:sz="4"/>
+              <w:left w:val="single" w:color="B7C4CC" w:sz="4"/>
+              <w:bottom w:val="single" w:color="B7C4CC" w:sz="4"/>
+              <w:right w:val="single" w:color="B7C4CC" w:sz="4"/>
+            </w:tcBorders>
+            <w:tcMar>
+              <w:top w:type="dxa" w:w="60"/>
+              <w:left w:type="dxa" w:w="90"/>
+              <w:bottom w:type="dxa" w:w="60"/>
+              <w:right w:type="dxa" w:w="90"/>
+            </w:tcMar>
+          </w:tcPr>
+          <w:p>
+            <w:pPr>
+              <w:jc w:val="left"/>
+            </w:pPr>
+            <w:r>
+              <w:rPr>
+                <w:rFonts w:ascii="Arial" w:cs="Arial" w:eastAsia="Arial" w:hAnsi="Arial"/>
+                <w:b/>
+                <w:bCs/>
+                <w:sz w:val="18"/>
+                <w:szCs w:val="18"/>
+              </w:rPr>
+              <w:t xml:space="preserve">Kimyo klasteri, gaz, 10 kV tarmoq, temir yo‘l</w:t>
+            </w:r>
+          </w:p>
+        </w:tc>
+        <w:tc>
+          <w:tcPr>
+            <w:tcW w:type="dxa" w:w="2698"/>
+            <w:tcBorders>
+              <w:top w:val="single" w:color="B7C4CC" w:sz="4"/>
+              <w:left w:val="single" w:color="B7C4CC" w:sz="4"/>
+              <w:bottom w:val="single" w:color="B7C4CC" w:sz="4"/>
+              <w:right w:val="single" w:color="B7C4CC" w:sz="4"/>
+            </w:tcBorders>
+            <w:tcMar>
+              <w:top w:type="dxa" w:w="60"/>
+              <w:left w:type="dxa" w:w="90"/>
+              <w:bottom w:type="dxa" w:w="60"/>
+              <w:right w:type="dxa" w:w="90"/>
+            </w:tcMar>
+          </w:tcPr>
+          <w:p>
+            <w:pPr>
+              <w:jc w:val="left"/>
+            </w:pPr>
+            <w:r>
+              <w:rPr>
+                <w:rFonts w:ascii="Arial" w:cs="Arial" w:eastAsia="Arial" w:hAnsi="Arial"/>
+                <w:sz w:val="18"/>
+                <w:szCs w:val="18"/>
+              </w:rPr>
+              <w:t xml:space="preserve">Zona 2024-yilda +210,4 ga kengaytirilgan</w:t>
+            </w:r>
+          </w:p>
+        </w:tc>
+        <w:tc>
+          <w:tcPr>
+            <w:tcW w:type="dxa" w:w="2507"/>
+            <w:tcBorders>
+              <w:top w:val="single" w:color="B7C4CC" w:sz="4"/>
+              <w:left w:val="single" w:color="B7C4CC" w:sz="4"/>
+              <w:bottom w:val="single" w:color="B7C4CC" w:sz="4"/>
+              <w:right w:val="single" w:color="B7C4CC" w:sz="4"/>
+            </w:tcBorders>
+            <w:tcMar>
+              <w:top w:type="dxa" w:w="60"/>
+              <w:left w:type="dxa" w:w="90"/>
+              <w:bottom w:type="dxa" w:w="60"/>
+              <w:right w:type="dxa" w:w="90"/>
+            </w:tcMar>
+          </w:tcPr>
+          <w:p>
+            <w:pPr>
+              <w:jc w:val="left"/>
+            </w:pPr>
+            <w:r>
+              <w:rPr>
+                <w:rFonts w:ascii="Arial" w:cs="Arial" w:eastAsia="Arial" w:hAnsi="Arial"/>
+                <w:sz w:val="18"/>
+                <w:szCs w:val="18"/>
+              </w:rPr>
+              <w:t xml:space="preserve">Energetika, tog‘-kon sanoati</w:t>
+            </w:r>
+          </w:p>
+        </w:tc>
+      </w:tr>
+      <w:tr>
+        <w:tc>
+          <w:tcPr>
+            <w:tcW w:type="dxa" w:w="1542"/>
+            <w:tcBorders>
+              <w:top w:val="single" w:color="B7C4CC" w:sz="4"/>
+              <w:left w:val="single" w:color="B7C4CC" w:sz="4"/>
+              <w:bottom w:val="single" w:color="B7C4CC" w:sz="4"/>
+              <w:right w:val="single" w:color="B7C4CC" w:sz="4"/>
+            </w:tcBorders>
+            <w:shd w:fill="F4F8FA" w:color="auto" w:val="clear"/>
+            <w:tcMar>
+              <w:top w:type="dxa" w:w="60"/>
+              <w:left w:type="dxa" w:w="90"/>
+              <w:bottom w:type="dxa" w:w="60"/>
+              <w:right w:type="dxa" w:w="90"/>
+            </w:tcMar>
+          </w:tcPr>
+          <w:p>
+            <w:pPr>
+              <w:jc w:val="left"/>
+            </w:pPr>
+            <w:r>
+              <w:rPr>
+                <w:rFonts w:ascii="Arial" w:cs="Arial" w:eastAsia="Arial" w:hAnsi="Arial"/>
+                <w:sz w:val="18"/>
+                <w:szCs w:val="18"/>
+              </w:rPr>
+              <w:t xml:space="preserve">Huquqiy rejim</w:t>
+            </w:r>
+          </w:p>
+        </w:tc>
+        <w:tc>
+          <w:tcPr>
+            <w:tcW w:type="dxa" w:w="2891"/>
+            <w:tcBorders>
+              <w:top w:val="single" w:color="B7C4CC" w:sz="4"/>
+              <w:left w:val="single" w:color="B7C4CC" w:sz="4"/>
+              <w:bottom w:val="single" w:color="B7C4CC" w:sz="4"/>
+              <w:right w:val="single" w:color="B7C4CC" w:sz="4"/>
+            </w:tcBorders>
+            <w:shd w:fill="F4F8FA" w:color="auto" w:val="clear"/>
+            <w:tcMar>
+              <w:top w:type="dxa" w:w="60"/>
+              <w:left w:type="dxa" w:w="90"/>
+              <w:bottom w:type="dxa" w:w="60"/>
+              <w:right w:type="dxa" w:w="90"/>
+            </w:tcMar>
+          </w:tcPr>
+          <w:p>
+            <w:pPr>
+              <w:jc w:val="left"/>
+            </w:pPr>
+            <w:r>
+              <w:rPr>
+                <w:rFonts w:ascii="Arial" w:cs="Arial" w:eastAsia="Arial" w:hAnsi="Arial"/>
+                <w:sz w:val="18"/>
+                <w:szCs w:val="18"/>
+              </w:rPr>
+              <w:t xml:space="preserve">Texnopark: erkin sanoat zonasi rejimi, 30 yil (2022-yil qarori)</w:t>
+            </w:r>
+          </w:p>
+        </w:tc>
+        <w:tc>
+          <w:tcPr>
+            <w:tcW w:type="dxa" w:w="2698"/>
+            <w:tcBorders>
+              <w:top w:val="single" w:color="B7C4CC" w:sz="4"/>
+              <w:left w:val="single" w:color="B7C4CC" w:sz="4"/>
+              <w:bottom w:val="single" w:color="B7C4CC" w:sz="4"/>
+              <w:right w:val="single" w:color="B7C4CC" w:sz="4"/>
+            </w:tcBorders>
+            <w:shd w:fill="F4F8FA" w:color="auto" w:val="clear"/>
+            <w:tcMar>
+              <w:top w:type="dxa" w:w="60"/>
+              <w:left w:type="dxa" w:w="90"/>
+              <w:bottom w:type="dxa" w:w="60"/>
+              <w:right w:type="dxa" w:w="90"/>
+            </w:tcMar>
+          </w:tcPr>
+          <w:p>
+            <w:pPr>
+              <w:jc w:val="left"/>
+            </w:pPr>
+            <w:r>
+              <w:rPr>
+                <w:rFonts w:ascii="Arial" w:cs="Arial" w:eastAsia="Arial" w:hAnsi="Arial"/>
+                <w:sz w:val="18"/>
+                <w:szCs w:val="18"/>
+              </w:rPr>
+              <w:t xml:space="preserve">EIZ rejimi (2017-yildan)</w:t>
+            </w:r>
+          </w:p>
+        </w:tc>
+        <w:tc>
+          <w:tcPr>
+            <w:tcW w:type="dxa" w:w="2507"/>
+            <w:tcBorders>
+              <w:top w:val="single" w:color="B7C4CC" w:sz="4"/>
+              <w:left w:val="single" w:color="B7C4CC" w:sz="4"/>
+              <w:bottom w:val="single" w:color="B7C4CC" w:sz="4"/>
+              <w:right w:val="single" w:color="B7C4CC" w:sz="4"/>
+            </w:tcBorders>
+            <w:shd w:fill="F4F8FA" w:color="auto" w:val="clear"/>
+            <w:tcMar>
+              <w:top w:type="dxa" w:w="60"/>
+              <w:left w:type="dxa" w:w="90"/>
+              <w:bottom w:type="dxa" w:w="60"/>
+              <w:right w:type="dxa" w:w="90"/>
+            </w:tcMar>
+          </w:tcPr>
+          <w:p>
+            <w:pPr>
+              <w:jc w:val="left"/>
+            </w:pPr>
+            <w:r>
+              <w:rPr>
+                <w:rFonts w:ascii="Arial" w:cs="Arial" w:eastAsia="Arial" w:hAnsi="Arial"/>
+                <w:sz w:val="18"/>
+                <w:szCs w:val="18"/>
+              </w:rPr>
+              <w:t xml:space="preserve">EIZ rejimi (2016-yildan)</w:t>
+            </w:r>
+          </w:p>
+        </w:tc>
+      </w:tr>
+    </w:tbl>
+    <w:p>
+      <w:pPr>
+        <w:spacing w:after="120"/>
+      </w:pPr>
+    </w:p>
+    <w:p>
+      <w:pPr>
+        <w:spacing w:after="120" w:line="300"/>
+        <w:jc w:val="both"/>
+      </w:pPr>
+      <w:r>
+        <w:rPr>
+          <w:rFonts w:ascii="Arial" w:cs="Arial" w:eastAsia="Arial" w:hAnsi="Arial"/>
+          <w:b/>
+          <w:bCs/>
+        </w:rPr>
+        <w:t xml:space="preserve">Tavsiya: Toshkent viloyati, Chirchiq shahri — kimyo-industrial texnopark.</w:t>
+      </w:r>
+      <w:r>
+        <w:rPr>
+          <w:rFonts w:ascii="Arial" w:cs="Arial" w:eastAsia="Arial" w:hAnsi="Arial"/>
+        </w:rPr>
+        <w:t xml:space="preserve"> Asosiy mijozlar va xomashyo Toshkentda, ilmiy hamkor TKTI yaqin, kimyo korxonalari uchun gaz, elektr va temir yo‘l tayyor. Texnoparkka 30 yillik maxsus soliq, bojxona va valyuta rejimi belgilangan. </w:t>
+      </w:r>
+      <w:r>
+        <w:rPr>
+          <w:rFonts w:ascii="Arial" w:cs="Arial" w:eastAsia="Arial" w:hAnsi="Arial"/>
+          <w:b/>
+          <w:bCs/>
+        </w:rPr>
+        <w:t xml:space="preserve">Zaxira variant — Farg‘ona viloyati, «Qo‘qon» EIZ.</w:t>
+      </w:r>
+      <w:r>
+        <w:rPr>
+          <w:rFonts w:ascii="Arial" w:cs="Arial" w:eastAsia="Arial" w:hAnsi="Arial"/>
+        </w:rPr>
+        <w:t xml:space="preserve"> Bu yerda soapstok manbai yaqin va mulcha plyonka bozori katta, ammo Toshkent bozoriga logistika qimmatroq.</w:t>
+      </w:r>
+    </w:p>
+    <w:p>
+      <w:pPr>
+        <w:spacing w:after="160"/>
+      </w:pPr>
+      <w:r>
+        <w:rPr>
+          <w:rFonts w:ascii="Arial" w:cs="Arial" w:eastAsia="Arial" w:hAnsi="Arial"/>
+          <w:i/>
+          <w:iCs/>
+          <w:color w:val="555555"/>
+          <w:sz w:val="18"/>
+          <w:szCs w:val="18"/>
+        </w:rPr>
+        <w:t xml:space="preserve">Eslatma: Toshkent yog‘-moy kombinati 2025-yilda tugatilgan (Kun.uz, 2026-yil aprel). Shuning uchun Toshkent variantida asosiy xomashyo — restoran va oshxonalarning ishlatilgan yog‘i, soapstok esa vodiy zavodlaridan keltiriladi. Texnopark va EIZ ning amaldagi imtiyoz shartlarini direksiyalardan rasman so‘rab olish kerak.</w:t>
+      </w:r>
+    </w:p>
+    <w:p>
+      <w:pPr>
+        <w:pStyle w:val="Heading2"/>
+        <w:spacing w:after="120" w:before="240"/>
+      </w:pPr>
+      <w:r>
+        <w:rPr>
+          <w:rFonts w:ascii="Arial" w:cs="Arial" w:eastAsia="Arial" w:hAnsi="Arial"/>
+        </w:rPr>
+        <w:t xml:space="preserve">7.2. Necha gektar kerak: 1,8 ga</w:t>
+      </w:r>
+    </w:p>
+    <w:p>
+      <w:pPr>
+        <w:spacing w:after="120" w:line="300"/>
+        <w:jc w:val="both"/>
+      </w:pPr>
+      <w:r>
+        <w:rPr>
+          <w:rFonts w:ascii="Arial" w:cs="Arial" w:eastAsia="Arial" w:hAnsi="Arial"/>
+        </w:rPr>
+        <w:t xml:space="preserve">Zavod uchun </w:t>
+      </w:r>
+      <w:r>
+        <w:rPr>
+          <w:rFonts w:ascii="Arial" w:cs="Arial" w:eastAsia="Arial" w:hAnsi="Arial"/>
+          <w:b/>
+          <w:bCs/>
+        </w:rPr>
+        <w:t xml:space="preserve">150 × 120 m = 1,8 gektar</w:t>
+      </w:r>
+      <w:r>
+        <w:rPr>
+          <w:rFonts w:ascii="Arial" w:cs="Arial" w:eastAsia="Arial" w:hAnsi="Arial"/>
+        </w:rPr>
+        <w:t xml:space="preserve"> yer uchastkasi tavsiya etiladi. Faqat 1–2-faza uchun minimal maydon ≈ 1,2 ga. Qolgan 0,6 ga 3-faza kengayishi va yashil bufer uchun ajratilgan.</w:t>
+      </w:r>
+    </w:p>
+    <w:p>
+      <w:pPr>
+        <w:spacing w:after="60" w:before="120"/>
+        <w:jc w:val="center"/>
+      </w:pPr>
+      <w:r>
+        <w:drawing>
+          <wp:inline distT="0" distB="0" distL="0" distR="0">
+            <wp:extent cx="6096000" cy="3810000"/>
+            <wp:effectExtent t="0" r="0" b="0" l="0"/>
+            <wp:docPr id="1" name="site_plan.jpg" descr="5-rasm. BioPlast Tech bosh rejasi (shimol — yuqorida, kirish — janubdagi jamoat yo‘lidan)" title="5-rasm. BioPlast Tech bosh rejasi (shimol — yuqorida, kirish — janubdagi jamoat yo‘lidan)"/>
+            <wp:cNvGraphicFramePr>
+              <a:graphicFrameLocks xmlns:a="http://schemas.openxmlformats.org/drawingml/2006/main" noChangeAspect="1"/>
+            </wp:cNvGraphicFramePr>
+            <a:graphic xmlns:a="http://schemas.openxmlformats.org/drawingml/2006/main">
+              <a:graphicData uri="http://schemas.openxmlformats.org/drawingml/2006/picture">
+                <pic:pic xmlns:pic="http://schemas.openxmlformats.org/drawingml/2006/picture">
+                  <pic:nvPicPr>
+                    <pic:cNvPr id="0" name="" descr=""/>
+                    <pic:cNvPicPr>
+                      <a:picLocks noChangeAspect="1" noChangeArrowheads="1"/>
+                    </pic:cNvPicPr>
+                  </pic:nvPicPr>
+                  <pic:blipFill>
+                    <a:blip r:embed="rId9" cstate="none"/>
+                    <a:srcRect/>
+                    <a:stretch>
+                      <a:fillRect/>
+                    </a:stretch>
+                  </pic:blipFill>
+                  <pic:spPr bwMode="auto">
+                    <a:xfrm>
+                      <a:off x="0" y="0"/>
+                      <a:ext cx="6096000" cy="3810000"/>
+                    </a:xfrm>
+                    <a:prstGeom prst="rect">
+                      <a:avLst/>
+                    </a:prstGeom>
+                  </pic:spPr>
+                </pic:pic>
+              </a:graphicData>
+            </a:graphic>
+          </wp:inline>
+        </w:drawing>
+      </w:r>
+    </w:p>
+    <w:p>
+      <w:pPr>
+        <w:spacing w:after="200"/>
+        <w:jc w:val="center"/>
+      </w:pPr>
+      <w:r>
+        <w:rPr>
+          <w:rFonts w:ascii="Arial" w:cs="Arial" w:eastAsia="Arial" w:hAnsi="Arial"/>
+          <w:i/>
+          <w:iCs/>
+          <w:color w:val="555555"/>
+          <w:sz w:val="18"/>
+          <w:szCs w:val="18"/>
+        </w:rPr>
+        <w:t xml:space="preserve">5-rasm. BioPlast Tech bosh rejasi (shimol — yuqorida, kirish — janubdagi jamoat yo‘lidan)</w:t>
+      </w:r>
+    </w:p>
+    <w:tbl>
+      <w:tblPr>
+        <w:tblW w:type="dxa" w:w="9638"/>
+        <w:tblBorders>
+          <w:top w:val="single" w:color="auto" w:sz="4"/>
+          <w:left w:val="single" w:color="auto" w:sz="4"/>
+          <w:bottom w:val="single" w:color="auto" w:sz="4"/>
+          <w:right w:val="single" w:color="auto" w:sz="4"/>
+          <w:insideH w:val="single" w:color="auto" w:sz="4"/>
+          <w:insideV w:val="single" w:color="auto" w:sz="4"/>
+        </w:tblBorders>
+        <w:tblLayout w:type="fixed"/>
+      </w:tblPr>
+      <w:tblGrid>
+        <w:gridCol w:w="5975"/>
+        <w:gridCol w:w="1927"/>
+        <w:gridCol w:w="1736"/>
+      </w:tblGrid>
+      <w:tr>
+        <w:trPr>
+          <w:tblHeader/>
+        </w:trPr>
+        <w:tc>
+          <w:tcPr>
+            <w:tcW w:type="dxa" w:w="5975"/>
+            <w:tcBorders>
+              <w:top w:val="single" w:color="B7C4CC" w:sz="4"/>
+              <w:left w:val="single" w:color="B7C4CC" w:sz="4"/>
+              <w:bottom w:val="single" w:color="B7C4CC" w:sz="4"/>
+              <w:right w:val="single" w:color="B7C4CC" w:sz="4"/>
+            </w:tcBorders>
+            <w:shd w:fill="1F6F5C" w:color="auto" w:val="clear"/>
+            <w:tcMar>
+              <w:top w:type="dxa" w:w="60"/>
+              <w:left w:type="dxa" w:w="90"/>
+              <w:bottom w:type="dxa" w:w="60"/>
+              <w:right w:type="dxa" w:w="90"/>
+            </w:tcMar>
+          </w:tcPr>
+          <w:p>
+            <w:pPr>
+              <w:jc w:val="left"/>
+            </w:pPr>
+            <w:r>
+              <w:rPr>
+                <w:rFonts w:ascii="Arial" w:cs="Arial" w:eastAsia="Arial" w:hAnsi="Arial"/>
+                <w:b/>
+                <w:bCs/>
+                <w:color w:val="FFFFFF"/>
+                <w:sz w:val="18"/>
+                <w:szCs w:val="18"/>
+              </w:rPr>
+              <w:t xml:space="preserve">Hudud elementi</w:t>
+            </w:r>
+          </w:p>
+        </w:tc>
+        <w:tc>
+          <w:tcPr>
+            <w:tcW w:type="dxa" w:w="1927"/>
+            <w:tcBorders>
+              <w:top w:val="single" w:color="B7C4CC" w:sz="4"/>
+              <w:left w:val="single" w:color="B7C4CC" w:sz="4"/>
+              <w:bottom w:val="single" w:color="B7C4CC" w:sz="4"/>
+              <w:right w:val="single" w:color="B7C4CC" w:sz="4"/>
+            </w:tcBorders>
+            <w:shd w:fill="1F6F5C" w:color="auto" w:val="clear"/>
+            <w:tcMar>
+              <w:top w:type="dxa" w:w="60"/>
+              <w:left w:type="dxa" w:w="90"/>
+              <w:bottom w:type="dxa" w:w="60"/>
+              <w:right w:type="dxa" w:w="90"/>
+            </w:tcMar>
+          </w:tcPr>
+          <w:p>
+            <w:pPr>
+              <w:jc w:val="left"/>
+            </w:pPr>
+            <w:r>
+              <w:rPr>
+                <w:rFonts w:ascii="Arial" w:cs="Arial" w:eastAsia="Arial" w:hAnsi="Arial"/>
+                <w:b/>
+                <w:bCs/>
+                <w:color w:val="FFFFFF"/>
+                <w:sz w:val="18"/>
+                <w:szCs w:val="18"/>
+              </w:rPr>
+              <w:t xml:space="preserve">Maydon, m²</w:t>
+            </w:r>
+          </w:p>
+        </w:tc>
+        <w:tc>
+          <w:tcPr>
+            <w:tcW w:type="dxa" w:w="1736"/>
+            <w:tcBorders>
+              <w:top w:val="single" w:color="B7C4CC" w:sz="4"/>
+              <w:left w:val="single" w:color="B7C4CC" w:sz="4"/>
+              <w:bottom w:val="single" w:color="B7C4CC" w:sz="4"/>
+              <w:right w:val="single" w:color="B7C4CC" w:sz="4"/>
+            </w:tcBorders>
+            <w:shd w:fill="1F6F5C" w:color="auto" w:val="clear"/>
+            <w:tcMar>
+              <w:top w:type="dxa" w:w="60"/>
+              <w:left w:type="dxa" w:w="90"/>
+              <w:bottom w:type="dxa" w:w="60"/>
+              <w:right w:type="dxa" w:w="90"/>
+            </w:tcMar>
+          </w:tcPr>
+          <w:p>
+            <w:pPr>
+              <w:jc w:val="left"/>
+            </w:pPr>
+            <w:r>
+              <w:rPr>
+                <w:rFonts w:ascii="Arial" w:cs="Arial" w:eastAsia="Arial" w:hAnsi="Arial"/>
+                <w:b/>
+                <w:bCs/>
+                <w:color w:val="FFFFFF"/>
+                <w:sz w:val="18"/>
+                <w:szCs w:val="18"/>
+              </w:rPr>
+              <w:t xml:space="preserve">Ulush</w:t>
+            </w:r>
+          </w:p>
+        </w:tc>
+      </w:tr>
+      <w:tr>
+        <w:tc>
+          <w:tcPr>
+            <w:tcW w:type="dxa" w:w="5975"/>
+            <w:tcBorders>
+              <w:top w:val="single" w:color="B7C4CC" w:sz="4"/>
+              <w:left w:val="single" w:color="B7C4CC" w:sz="4"/>
+              <w:bottom w:val="single" w:color="B7C4CC" w:sz="4"/>
+              <w:right w:val="single" w:color="B7C4CC" w:sz="4"/>
+            </w:tcBorders>
+            <w:tcMar>
+              <w:top w:type="dxa" w:w="60"/>
+              <w:left w:type="dxa" w:w="90"/>
+              <w:bottom w:type="dxa" w:w="60"/>
+              <w:right w:type="dxa" w:w="90"/>
+            </w:tcMar>
+          </w:tcPr>
+          <w:p>
+            <w:pPr>
+              <w:jc w:val="left"/>
+            </w:pPr>
+            <w:r>
+              <w:rPr>
+                <w:rFonts w:ascii="Arial" w:cs="Arial" w:eastAsia="Arial" w:hAnsi="Arial"/>
+                <w:sz w:val="18"/>
+                <w:szCs w:val="18"/>
+              </w:rPr>
+              <w:t xml:space="preserve">Ishlab chiqarish binosi (54 × 28 × 8 m)</w:t>
+            </w:r>
+          </w:p>
+        </w:tc>
+        <w:tc>
+          <w:tcPr>
+            <w:tcW w:type="dxa" w:w="1927"/>
+            <w:tcBorders>
+              <w:top w:val="single" w:color="B7C4CC" w:sz="4"/>
+              <w:left w:val="single" w:color="B7C4CC" w:sz="4"/>
+              <w:bottom w:val="single" w:color="B7C4CC" w:sz="4"/>
+              <w:right w:val="single" w:color="B7C4CC" w:sz="4"/>
+            </w:tcBorders>
+            <w:tcMar>
+              <w:top w:type="dxa" w:w="60"/>
+              <w:left w:type="dxa" w:w="90"/>
+              <w:bottom w:type="dxa" w:w="60"/>
+              <w:right w:type="dxa" w:w="90"/>
+            </w:tcMar>
+          </w:tcPr>
+          <w:p>
+            <w:pPr>
+              <w:jc w:val="right"/>
+            </w:pPr>
+            <w:r>
+              <w:rPr>
+                <w:rFonts w:ascii="Arial" w:cs="Arial" w:eastAsia="Arial" w:hAnsi="Arial"/>
+                <w:sz w:val="18"/>
+                <w:szCs w:val="18"/>
+              </w:rPr>
+              <w:t xml:space="preserve">1 512</w:t>
+            </w:r>
+          </w:p>
+        </w:tc>
+        <w:tc>
+          <w:tcPr>
+            <w:tcW w:type="dxa" w:w="1736"/>
+            <w:tcBorders>
+              <w:top w:val="single" w:color="B7C4CC" w:sz="4"/>
+              <w:left w:val="single" w:color="B7C4CC" w:sz="4"/>
+              <w:bottom w:val="single" w:color="B7C4CC" w:sz="4"/>
+              <w:right w:val="single" w:color="B7C4CC" w:sz="4"/>
+            </w:tcBorders>
+            <w:tcMar>
+              <w:top w:type="dxa" w:w="60"/>
+              <w:left w:type="dxa" w:w="90"/>
+              <w:bottom w:type="dxa" w:w="60"/>
+              <w:right w:type="dxa" w:w="90"/>
+            </w:tcMar>
+          </w:tcPr>
+          <w:p>
+            <w:pPr>
+              <w:jc w:val="right"/>
+            </w:pPr>
+            <w:r>
+              <w:rPr>
+                <w:rFonts w:ascii="Arial" w:cs="Arial" w:eastAsia="Arial" w:hAnsi="Arial"/>
+                <w:sz w:val="18"/>
+                <w:szCs w:val="18"/>
+              </w:rPr>
+              <w:t xml:space="preserve">8%</w:t>
+            </w:r>
+          </w:p>
+        </w:tc>
+      </w:tr>
+      <w:tr>
+        <w:tc>
+          <w:tcPr>
+            <w:tcW w:type="dxa" w:w="5975"/>
+            <w:tcBorders>
+              <w:top w:val="single" w:color="B7C4CC" w:sz="4"/>
+              <w:left w:val="single" w:color="B7C4CC" w:sz="4"/>
+              <w:bottom w:val="single" w:color="B7C4CC" w:sz="4"/>
+              <w:right w:val="single" w:color="B7C4CC" w:sz="4"/>
+            </w:tcBorders>
+            <w:shd w:fill="F4F8FA" w:color="auto" w:val="clear"/>
+            <w:tcMar>
+              <w:top w:type="dxa" w:w="60"/>
+              <w:left w:type="dxa" w:w="90"/>
+              <w:bottom w:type="dxa" w:w="60"/>
+              <w:right w:type="dxa" w:w="90"/>
+            </w:tcMar>
+          </w:tcPr>
+          <w:p>
+            <w:pPr>
+              <w:jc w:val="left"/>
+            </w:pPr>
+            <w:r>
+              <w:rPr>
+                <w:rFonts w:ascii="Arial" w:cs="Arial" w:eastAsia="Arial" w:hAnsi="Arial"/>
+                <w:sz w:val="18"/>
+                <w:szCs w:val="18"/>
+              </w:rPr>
+              <w:t xml:space="preserve">Ombor (36 × 18 × 9 m, 2 rampa)</w:t>
+            </w:r>
+          </w:p>
+        </w:tc>
+        <w:tc>
+          <w:tcPr>
+            <w:tcW w:type="dxa" w:w="1927"/>
+            <w:tcBorders>
+              <w:top w:val="single" w:color="B7C4CC" w:sz="4"/>
+              <w:left w:val="single" w:color="B7C4CC" w:sz="4"/>
+              <w:bottom w:val="single" w:color="B7C4CC" w:sz="4"/>
+              <w:right w:val="single" w:color="B7C4CC" w:sz="4"/>
+            </w:tcBorders>
+            <w:shd w:fill="F4F8FA" w:color="auto" w:val="clear"/>
+            <w:tcMar>
+              <w:top w:type="dxa" w:w="60"/>
+              <w:left w:type="dxa" w:w="90"/>
+              <w:bottom w:type="dxa" w:w="60"/>
+              <w:right w:type="dxa" w:w="90"/>
+            </w:tcMar>
+          </w:tcPr>
+          <w:p>
+            <w:pPr>
+              <w:jc w:val="right"/>
+            </w:pPr>
+            <w:r>
+              <w:rPr>
+                <w:rFonts w:ascii="Arial" w:cs="Arial" w:eastAsia="Arial" w:hAnsi="Arial"/>
+                <w:sz w:val="18"/>
+                <w:szCs w:val="18"/>
+              </w:rPr>
+              <w:t xml:space="preserve">648</w:t>
+            </w:r>
+          </w:p>
+        </w:tc>
+        <w:tc>
+          <w:tcPr>
+            <w:tcW w:type="dxa" w:w="1736"/>
+            <w:tcBorders>
+              <w:top w:val="single" w:color="B7C4CC" w:sz="4"/>
+              <w:left w:val="single" w:color="B7C4CC" w:sz="4"/>
+              <w:bottom w:val="single" w:color="B7C4CC" w:sz="4"/>
+              <w:right w:val="single" w:color="B7C4CC" w:sz="4"/>
+            </w:tcBorders>
+            <w:shd w:fill="F4F8FA" w:color="auto" w:val="clear"/>
+            <w:tcMar>
+              <w:top w:type="dxa" w:w="60"/>
+              <w:left w:type="dxa" w:w="90"/>
+              <w:bottom w:type="dxa" w:w="60"/>
+              <w:right w:type="dxa" w:w="90"/>
+            </w:tcMar>
+          </w:tcPr>
+          <w:p>
+            <w:pPr>
+              <w:jc w:val="right"/>
+            </w:pPr>
+            <w:r>
+              <w:rPr>
+                <w:rFonts w:ascii="Arial" w:cs="Arial" w:eastAsia="Arial" w:hAnsi="Arial"/>
+                <w:sz w:val="18"/>
+                <w:szCs w:val="18"/>
+              </w:rPr>
+              <w:t xml:space="preserve">4%</w:t>
+            </w:r>
+          </w:p>
+        </w:tc>
+      </w:tr>
+      <w:tr>
+        <w:tc>
+          <w:tcPr>
+            <w:tcW w:type="dxa" w:w="5975"/>
+            <w:tcBorders>
+              <w:top w:val="single" w:color="B7C4CC" w:sz="4"/>
+              <w:left w:val="single" w:color="B7C4CC" w:sz="4"/>
+              <w:bottom w:val="single" w:color="B7C4CC" w:sz="4"/>
+              <w:right w:val="single" w:color="B7C4CC" w:sz="4"/>
+            </w:tcBorders>
+            <w:tcMar>
+              <w:top w:type="dxa" w:w="60"/>
+              <w:left w:type="dxa" w:w="90"/>
+              <w:bottom w:type="dxa" w:w="60"/>
+              <w:right w:type="dxa" w:w="90"/>
+            </w:tcMar>
+          </w:tcPr>
+          <w:p>
+            <w:pPr>
+              <w:jc w:val="left"/>
+            </w:pPr>
+            <w:r>
+              <w:rPr>
+                <w:rFonts w:ascii="Arial" w:cs="Arial" w:eastAsia="Arial" w:hAnsi="Arial"/>
+                <w:sz w:val="18"/>
+                <w:szCs w:val="18"/>
+              </w:rPr>
+              <w:t xml:space="preserve">Ma’muriy-maishiy bino (30 × 12 m, 2 qavat)</w:t>
+            </w:r>
+          </w:p>
+        </w:tc>
+        <w:tc>
+          <w:tcPr>
+            <w:tcW w:type="dxa" w:w="1927"/>
+            <w:tcBorders>
+              <w:top w:val="single" w:color="B7C4CC" w:sz="4"/>
+              <w:left w:val="single" w:color="B7C4CC" w:sz="4"/>
+              <w:bottom w:val="single" w:color="B7C4CC" w:sz="4"/>
+              <w:right w:val="single" w:color="B7C4CC" w:sz="4"/>
+            </w:tcBorders>
+            <w:tcMar>
+              <w:top w:type="dxa" w:w="60"/>
+              <w:left w:type="dxa" w:w="90"/>
+              <w:bottom w:type="dxa" w:w="60"/>
+              <w:right w:type="dxa" w:w="90"/>
+            </w:tcMar>
+          </w:tcPr>
+          <w:p>
+            <w:pPr>
+              <w:jc w:val="right"/>
+            </w:pPr>
+            <w:r>
+              <w:rPr>
+                <w:rFonts w:ascii="Arial" w:cs="Arial" w:eastAsia="Arial" w:hAnsi="Arial"/>
+                <w:sz w:val="18"/>
+                <w:szCs w:val="18"/>
+              </w:rPr>
+              <w:t xml:space="preserve">360</w:t>
+            </w:r>
+          </w:p>
+        </w:tc>
+        <w:tc>
+          <w:tcPr>
+            <w:tcW w:type="dxa" w:w="1736"/>
+            <w:tcBorders>
+              <w:top w:val="single" w:color="B7C4CC" w:sz="4"/>
+              <w:left w:val="single" w:color="B7C4CC" w:sz="4"/>
+              <w:bottom w:val="single" w:color="B7C4CC" w:sz="4"/>
+              <w:right w:val="single" w:color="B7C4CC" w:sz="4"/>
+            </w:tcBorders>
+            <w:tcMar>
+              <w:top w:type="dxa" w:w="60"/>
+              <w:left w:type="dxa" w:w="90"/>
+              <w:bottom w:type="dxa" w:w="60"/>
+              <w:right w:type="dxa" w:w="90"/>
+            </w:tcMar>
+          </w:tcPr>
+          <w:p>
+            <w:pPr>
+              <w:jc w:val="right"/>
+            </w:pPr>
+            <w:r>
+              <w:rPr>
+                <w:rFonts w:ascii="Arial" w:cs="Arial" w:eastAsia="Arial" w:hAnsi="Arial"/>
+                <w:sz w:val="18"/>
+                <w:szCs w:val="18"/>
+              </w:rPr>
+              <w:t xml:space="preserve">2%</w:t>
+            </w:r>
+          </w:p>
+        </w:tc>
+      </w:tr>
+      <w:tr>
+        <w:tc>
+          <w:tcPr>
+            <w:tcW w:type="dxa" w:w="5975"/>
+            <w:tcBorders>
+              <w:top w:val="single" w:color="B7C4CC" w:sz="4"/>
+              <w:left w:val="single" w:color="B7C4CC" w:sz="4"/>
+              <w:bottom w:val="single" w:color="B7C4CC" w:sz="4"/>
+              <w:right w:val="single" w:color="B7C4CC" w:sz="4"/>
+            </w:tcBorders>
+            <w:shd w:fill="F4F8FA" w:color="auto" w:val="clear"/>
+            <w:tcMar>
+              <w:top w:type="dxa" w:w="60"/>
+              <w:left w:type="dxa" w:w="90"/>
+              <w:bottom w:type="dxa" w:w="60"/>
+              <w:right w:type="dxa" w:w="90"/>
+            </w:tcMar>
+          </w:tcPr>
+          <w:p>
+            <w:pPr>
+              <w:jc w:val="left"/>
+            </w:pPr>
+            <w:r>
+              <w:rPr>
+                <w:rFonts w:ascii="Arial" w:cs="Arial" w:eastAsia="Arial" w:hAnsi="Arial"/>
+                <w:sz w:val="18"/>
+                <w:szCs w:val="18"/>
+              </w:rPr>
+              <w:t xml:space="preserve">KPP, yong‘in nasos stansiyasi</w:t>
+            </w:r>
+          </w:p>
+        </w:tc>
+        <w:tc>
+          <w:tcPr>
+            <w:tcW w:type="dxa" w:w="1927"/>
+            <w:tcBorders>
+              <w:top w:val="single" w:color="B7C4CC" w:sz="4"/>
+              <w:left w:val="single" w:color="B7C4CC" w:sz="4"/>
+              <w:bottom w:val="single" w:color="B7C4CC" w:sz="4"/>
+              <w:right w:val="single" w:color="B7C4CC" w:sz="4"/>
+            </w:tcBorders>
+            <w:shd w:fill="F4F8FA" w:color="auto" w:val="clear"/>
+            <w:tcMar>
+              <w:top w:type="dxa" w:w="60"/>
+              <w:left w:type="dxa" w:w="90"/>
+              <w:bottom w:type="dxa" w:w="60"/>
+              <w:right w:type="dxa" w:w="90"/>
+            </w:tcMar>
+          </w:tcPr>
+          <w:p>
+            <w:pPr>
+              <w:jc w:val="right"/>
+            </w:pPr>
+            <w:r>
+              <w:rPr>
+                <w:rFonts w:ascii="Arial" w:cs="Arial" w:eastAsia="Arial" w:hAnsi="Arial"/>
+                <w:sz w:val="18"/>
+                <w:szCs w:val="18"/>
+              </w:rPr>
+              <w:t xml:space="preserve">55</w:t>
+            </w:r>
+          </w:p>
+        </w:tc>
+        <w:tc>
+          <w:tcPr>
+            <w:tcW w:type="dxa" w:w="1736"/>
+            <w:tcBorders>
+              <w:top w:val="single" w:color="B7C4CC" w:sz="4"/>
+              <w:left w:val="single" w:color="B7C4CC" w:sz="4"/>
+              <w:bottom w:val="single" w:color="B7C4CC" w:sz="4"/>
+              <w:right w:val="single" w:color="B7C4CC" w:sz="4"/>
+            </w:tcBorders>
+            <w:shd w:fill="F4F8FA" w:color="auto" w:val="clear"/>
+            <w:tcMar>
+              <w:top w:type="dxa" w:w="60"/>
+              <w:left w:type="dxa" w:w="90"/>
+              <w:bottom w:type="dxa" w:w="60"/>
+              <w:right w:type="dxa" w:w="90"/>
+            </w:tcMar>
+          </w:tcPr>
+          <w:p>
+            <w:pPr>
+              <w:jc w:val="right"/>
+            </w:pPr>
+            <w:r>
+              <w:rPr>
+                <w:rFonts w:ascii="Arial" w:cs="Arial" w:eastAsia="Arial" w:hAnsi="Arial"/>
+                <w:sz w:val="18"/>
+                <w:szCs w:val="18"/>
+              </w:rPr>
+              <w:t xml:space="preserve">0,3%</w:t>
+            </w:r>
+          </w:p>
+        </w:tc>
+      </w:tr>
+      <w:tr>
+        <w:tc>
+          <w:tcPr>
+            <w:tcW w:type="dxa" w:w="5975"/>
+            <w:tcBorders>
+              <w:top w:val="single" w:color="B7C4CC" w:sz="4"/>
+              <w:left w:val="single" w:color="B7C4CC" w:sz="4"/>
+              <w:bottom w:val="single" w:color="B7C4CC" w:sz="4"/>
+              <w:right w:val="single" w:color="B7C4CC" w:sz="4"/>
+            </w:tcBorders>
+            <w:tcMar>
+              <w:top w:type="dxa" w:w="60"/>
+              <w:left w:type="dxa" w:w="90"/>
+              <w:bottom w:type="dxa" w:w="60"/>
+              <w:right w:type="dxa" w:w="90"/>
+            </w:tcMar>
+          </w:tcPr>
+          <w:p>
+            <w:pPr>
+              <w:jc w:val="left"/>
+            </w:pPr>
+            <w:r>
+              <w:rPr>
+                <w:rFonts w:ascii="Arial" w:cs="Arial" w:eastAsia="Arial" w:hAnsi="Arial"/>
+                <w:sz w:val="18"/>
+                <w:szCs w:val="18"/>
+              </w:rPr>
+              <w:t xml:space="preserve">Muhandislik inshootlari: yog‘ parki, KTP va generator, gaz shkafi, yong‘in suvi, oqova suv, sovutish minorasi, chiqindi maydoni</w:t>
+            </w:r>
+          </w:p>
+        </w:tc>
+        <w:tc>
+          <w:tcPr>
+            <w:tcW w:type="dxa" w:w="1927"/>
+            <w:tcBorders>
+              <w:top w:val="single" w:color="B7C4CC" w:sz="4"/>
+              <w:left w:val="single" w:color="B7C4CC" w:sz="4"/>
+              <w:bottom w:val="single" w:color="B7C4CC" w:sz="4"/>
+              <w:right w:val="single" w:color="B7C4CC" w:sz="4"/>
+            </w:tcBorders>
+            <w:tcMar>
+              <w:top w:type="dxa" w:w="60"/>
+              <w:left w:type="dxa" w:w="90"/>
+              <w:bottom w:type="dxa" w:w="60"/>
+              <w:right w:type="dxa" w:w="90"/>
+            </w:tcMar>
+          </w:tcPr>
+          <w:p>
+            <w:pPr>
+              <w:jc w:val="right"/>
+            </w:pPr>
+            <w:r>
+              <w:rPr>
+                <w:rFonts w:ascii="Arial" w:cs="Arial" w:eastAsia="Arial" w:hAnsi="Arial"/>
+                <w:sz w:val="18"/>
+                <w:szCs w:val="18"/>
+              </w:rPr>
+              <w:t xml:space="preserve">500</w:t>
+            </w:r>
+          </w:p>
+        </w:tc>
+        <w:tc>
+          <w:tcPr>
+            <w:tcW w:type="dxa" w:w="1736"/>
+            <w:tcBorders>
+              <w:top w:val="single" w:color="B7C4CC" w:sz="4"/>
+              <w:left w:val="single" w:color="B7C4CC" w:sz="4"/>
+              <w:bottom w:val="single" w:color="B7C4CC" w:sz="4"/>
+              <w:right w:val="single" w:color="B7C4CC" w:sz="4"/>
+            </w:tcBorders>
+            <w:tcMar>
+              <w:top w:type="dxa" w:w="60"/>
+              <w:left w:type="dxa" w:w="90"/>
+              <w:bottom w:type="dxa" w:w="60"/>
+              <w:right w:type="dxa" w:w="90"/>
+            </w:tcMar>
+          </w:tcPr>
+          <w:p>
+            <w:pPr>
+              <w:jc w:val="right"/>
+            </w:pPr>
+            <w:r>
+              <w:rPr>
+                <w:rFonts w:ascii="Arial" w:cs="Arial" w:eastAsia="Arial" w:hAnsi="Arial"/>
+                <w:sz w:val="18"/>
+                <w:szCs w:val="18"/>
+              </w:rPr>
+              <w:t xml:space="preserve">3%</w:t>
+            </w:r>
+          </w:p>
+        </w:tc>
+      </w:tr>
+      <w:tr>
+        <w:tc>
+          <w:tcPr>
+            <w:tcW w:type="dxa" w:w="5975"/>
+            <w:tcBorders>
+              <w:top w:val="single" w:color="B7C4CC" w:sz="4"/>
+              <w:left w:val="single" w:color="B7C4CC" w:sz="4"/>
+              <w:bottom w:val="single" w:color="B7C4CC" w:sz="4"/>
+              <w:right w:val="single" w:color="B7C4CC" w:sz="4"/>
+            </w:tcBorders>
+            <w:shd w:fill="F4F8FA" w:color="auto" w:val="clear"/>
+            <w:tcMar>
+              <w:top w:type="dxa" w:w="60"/>
+              <w:left w:type="dxa" w:w="90"/>
+              <w:bottom w:type="dxa" w:w="60"/>
+              <w:right w:type="dxa" w:w="90"/>
+            </w:tcMar>
+          </w:tcPr>
+          <w:p>
+            <w:pPr>
+              <w:jc w:val="left"/>
+            </w:pPr>
+            <w:r>
+              <w:rPr>
+                <w:rFonts w:ascii="Arial" w:cs="Arial" w:eastAsia="Arial" w:hAnsi="Arial"/>
+                <w:sz w:val="18"/>
+                <w:szCs w:val="18"/>
+              </w:rPr>
+              <w:t xml:space="preserve">Yo‘llar (6–7 m), yuk maydoni, avtoturargoh (18 joy), trotuarlar</w:t>
+            </w:r>
+          </w:p>
+        </w:tc>
+        <w:tc>
+          <w:tcPr>
+            <w:tcW w:type="dxa" w:w="1927"/>
+            <w:tcBorders>
+              <w:top w:val="single" w:color="B7C4CC" w:sz="4"/>
+              <w:left w:val="single" w:color="B7C4CC" w:sz="4"/>
+              <w:bottom w:val="single" w:color="B7C4CC" w:sz="4"/>
+              <w:right w:val="single" w:color="B7C4CC" w:sz="4"/>
+            </w:tcBorders>
+            <w:shd w:fill="F4F8FA" w:color="auto" w:val="clear"/>
+            <w:tcMar>
+              <w:top w:type="dxa" w:w="60"/>
+              <w:left w:type="dxa" w:w="90"/>
+              <w:bottom w:type="dxa" w:w="60"/>
+              <w:right w:type="dxa" w:w="90"/>
+            </w:tcMar>
+          </w:tcPr>
+          <w:p>
+            <w:pPr>
+              <w:jc w:val="right"/>
+            </w:pPr>
+            <w:r>
+              <w:rPr>
+                <w:rFonts w:ascii="Arial" w:cs="Arial" w:eastAsia="Arial" w:hAnsi="Arial"/>
+                <w:sz w:val="18"/>
+                <w:szCs w:val="18"/>
+              </w:rPr>
+              <w:t xml:space="preserve">4 520</w:t>
+            </w:r>
+          </w:p>
+        </w:tc>
+        <w:tc>
+          <w:tcPr>
+            <w:tcW w:type="dxa" w:w="1736"/>
+            <w:tcBorders>
+              <w:top w:val="single" w:color="B7C4CC" w:sz="4"/>
+              <w:left w:val="single" w:color="B7C4CC" w:sz="4"/>
+              <w:bottom w:val="single" w:color="B7C4CC" w:sz="4"/>
+              <w:right w:val="single" w:color="B7C4CC" w:sz="4"/>
+            </w:tcBorders>
+            <w:shd w:fill="F4F8FA" w:color="auto" w:val="clear"/>
+            <w:tcMar>
+              <w:top w:type="dxa" w:w="60"/>
+              <w:left w:type="dxa" w:w="90"/>
+              <w:bottom w:type="dxa" w:w="60"/>
+              <w:right w:type="dxa" w:w="90"/>
+            </w:tcMar>
+          </w:tcPr>
+          <w:p>
+            <w:pPr>
+              <w:jc w:val="right"/>
+            </w:pPr>
+            <w:r>
+              <w:rPr>
+                <w:rFonts w:ascii="Arial" w:cs="Arial" w:eastAsia="Arial" w:hAnsi="Arial"/>
+                <w:sz w:val="18"/>
+                <w:szCs w:val="18"/>
+              </w:rPr>
+              <w:t xml:space="preserve">25%</w:t>
+            </w:r>
+          </w:p>
+        </w:tc>
+      </w:tr>
+      <w:tr>
+        <w:tc>
+          <w:tcPr>
+            <w:tcW w:type="dxa" w:w="5975"/>
+            <w:tcBorders>
+              <w:top w:val="single" w:color="B7C4CC" w:sz="4"/>
+              <w:left w:val="single" w:color="B7C4CC" w:sz="4"/>
+              <w:bottom w:val="single" w:color="B7C4CC" w:sz="4"/>
+              <w:right w:val="single" w:color="B7C4CC" w:sz="4"/>
+            </w:tcBorders>
+            <w:tcMar>
+              <w:top w:type="dxa" w:w="60"/>
+              <w:left w:type="dxa" w:w="90"/>
+              <w:bottom w:type="dxa" w:w="60"/>
+              <w:right w:type="dxa" w:w="90"/>
+            </w:tcMar>
+          </w:tcPr>
+          <w:p>
+            <w:pPr>
+              <w:jc w:val="left"/>
+            </w:pPr>
+            <w:r>
+              <w:rPr>
+                <w:rFonts w:ascii="Arial" w:cs="Arial" w:eastAsia="Arial" w:hAnsi="Arial"/>
+                <w:sz w:val="18"/>
+                <w:szCs w:val="18"/>
+              </w:rPr>
+              <w:t xml:space="preserve">3-faza zaxira maydoni (40 × 30 m li bino uchun)</w:t>
+            </w:r>
+          </w:p>
+        </w:tc>
+        <w:tc>
+          <w:tcPr>
+            <w:tcW w:type="dxa" w:w="1927"/>
+            <w:tcBorders>
+              <w:top w:val="single" w:color="B7C4CC" w:sz="4"/>
+              <w:left w:val="single" w:color="B7C4CC" w:sz="4"/>
+              <w:bottom w:val="single" w:color="B7C4CC" w:sz="4"/>
+              <w:right w:val="single" w:color="B7C4CC" w:sz="4"/>
+            </w:tcBorders>
+            <w:tcMar>
+              <w:top w:type="dxa" w:w="60"/>
+              <w:left w:type="dxa" w:w="90"/>
+              <w:bottom w:type="dxa" w:w="60"/>
+              <w:right w:type="dxa" w:w="90"/>
+            </w:tcMar>
+          </w:tcPr>
+          <w:p>
+            <w:pPr>
+              <w:jc w:val="right"/>
+            </w:pPr>
+            <w:r>
+              <w:rPr>
+                <w:rFonts w:ascii="Arial" w:cs="Arial" w:eastAsia="Arial" w:hAnsi="Arial"/>
+                <w:sz w:val="18"/>
+                <w:szCs w:val="18"/>
+              </w:rPr>
+              <w:t xml:space="preserve">1 540</w:t>
+            </w:r>
+          </w:p>
+        </w:tc>
+        <w:tc>
+          <w:tcPr>
+            <w:tcW w:type="dxa" w:w="1736"/>
+            <w:tcBorders>
+              <w:top w:val="single" w:color="B7C4CC" w:sz="4"/>
+              <w:left w:val="single" w:color="B7C4CC" w:sz="4"/>
+              <w:bottom w:val="single" w:color="B7C4CC" w:sz="4"/>
+              <w:right w:val="single" w:color="B7C4CC" w:sz="4"/>
+            </w:tcBorders>
+            <w:tcMar>
+              <w:top w:type="dxa" w:w="60"/>
+              <w:left w:type="dxa" w:w="90"/>
+              <w:bottom w:type="dxa" w:w="60"/>
+              <w:right w:type="dxa" w:w="90"/>
+            </w:tcMar>
+          </w:tcPr>
+          <w:p>
+            <w:pPr>
+              <w:jc w:val="right"/>
+            </w:pPr>
+            <w:r>
+              <w:rPr>
+                <w:rFonts w:ascii="Arial" w:cs="Arial" w:eastAsia="Arial" w:hAnsi="Arial"/>
+                <w:sz w:val="18"/>
+                <w:szCs w:val="18"/>
+              </w:rPr>
+              <w:t xml:space="preserve">9%</w:t>
+            </w:r>
+          </w:p>
+        </w:tc>
+      </w:tr>
+      <w:tr>
+        <w:tc>
+          <w:tcPr>
+            <w:tcW w:type="dxa" w:w="5975"/>
+            <w:tcBorders>
+              <w:top w:val="single" w:color="B7C4CC" w:sz="4"/>
+              <w:left w:val="single" w:color="B7C4CC" w:sz="4"/>
+              <w:bottom w:val="single" w:color="B7C4CC" w:sz="4"/>
+              <w:right w:val="single" w:color="B7C4CC" w:sz="4"/>
+            </w:tcBorders>
+            <w:shd w:fill="F4F8FA" w:color="auto" w:val="clear"/>
+            <w:tcMar>
+              <w:top w:type="dxa" w:w="60"/>
+              <w:left w:type="dxa" w:w="90"/>
+              <w:bottom w:type="dxa" w:w="60"/>
+              <w:right w:type="dxa" w:w="90"/>
+            </w:tcMar>
+          </w:tcPr>
+          <w:p>
+            <w:pPr>
+              <w:jc w:val="left"/>
+            </w:pPr>
+            <w:r>
+              <w:rPr>
+                <w:rFonts w:ascii="Arial" w:cs="Arial" w:eastAsia="Arial" w:hAnsi="Arial"/>
+                <w:sz w:val="18"/>
+                <w:szCs w:val="18"/>
+              </w:rPr>
+              <w:t xml:space="preserve">Ko‘kalamzor va yashil bufer</w:t>
+            </w:r>
+          </w:p>
+        </w:tc>
+        <w:tc>
+          <w:tcPr>
+            <w:tcW w:type="dxa" w:w="1927"/>
+            <w:tcBorders>
+              <w:top w:val="single" w:color="B7C4CC" w:sz="4"/>
+              <w:left w:val="single" w:color="B7C4CC" w:sz="4"/>
+              <w:bottom w:val="single" w:color="B7C4CC" w:sz="4"/>
+              <w:right w:val="single" w:color="B7C4CC" w:sz="4"/>
+            </w:tcBorders>
+            <w:shd w:fill="F4F8FA" w:color="auto" w:val="clear"/>
+            <w:tcMar>
+              <w:top w:type="dxa" w:w="60"/>
+              <w:left w:type="dxa" w:w="90"/>
+              <w:bottom w:type="dxa" w:w="60"/>
+              <w:right w:type="dxa" w:w="90"/>
+            </w:tcMar>
+          </w:tcPr>
+          <w:p>
+            <w:pPr>
+              <w:jc w:val="right"/>
+            </w:pPr>
+            <w:r>
+              <w:rPr>
+                <w:rFonts w:ascii="Arial" w:cs="Arial" w:eastAsia="Arial" w:hAnsi="Arial"/>
+                <w:sz w:val="18"/>
+                <w:szCs w:val="18"/>
+              </w:rPr>
+              <w:t xml:space="preserve">8 865</w:t>
+            </w:r>
+          </w:p>
+        </w:tc>
+        <w:tc>
+          <w:tcPr>
+            <w:tcW w:type="dxa" w:w="1736"/>
+            <w:tcBorders>
+              <w:top w:val="single" w:color="B7C4CC" w:sz="4"/>
+              <w:left w:val="single" w:color="B7C4CC" w:sz="4"/>
+              <w:bottom w:val="single" w:color="B7C4CC" w:sz="4"/>
+              <w:right w:val="single" w:color="B7C4CC" w:sz="4"/>
+            </w:tcBorders>
+            <w:shd w:fill="F4F8FA" w:color="auto" w:val="clear"/>
+            <w:tcMar>
+              <w:top w:type="dxa" w:w="60"/>
+              <w:left w:type="dxa" w:w="90"/>
+              <w:bottom w:type="dxa" w:w="60"/>
+              <w:right w:type="dxa" w:w="90"/>
+            </w:tcMar>
+          </w:tcPr>
+          <w:p>
+            <w:pPr>
+              <w:jc w:val="right"/>
+            </w:pPr>
+            <w:r>
+              <w:rPr>
+                <w:rFonts w:ascii="Arial" w:cs="Arial" w:eastAsia="Arial" w:hAnsi="Arial"/>
+                <w:sz w:val="18"/>
+                <w:szCs w:val="18"/>
+              </w:rPr>
+              <w:t xml:space="preserve">49%</w:t>
+            </w:r>
+          </w:p>
+        </w:tc>
+      </w:tr>
+      <w:tr>
+        <w:tc>
+          <w:tcPr>
+            <w:tcW w:type="dxa" w:w="5975"/>
+            <w:tcBorders>
+              <w:top w:val="single" w:color="B7C4CC" w:sz="4"/>
+              <w:left w:val="single" w:color="B7C4CC" w:sz="4"/>
+              <w:bottom w:val="single" w:color="B7C4CC" w:sz="4"/>
+              <w:right w:val="single" w:color="B7C4CC" w:sz="4"/>
+            </w:tcBorders>
+            <w:shd w:fill="D9EAD3" w:color="auto" w:val="clear"/>
+            <w:tcMar>
+              <w:top w:type="dxa" w:w="60"/>
+              <w:left w:type="dxa" w:w="90"/>
+              <w:bottom w:type="dxa" w:w="60"/>
+              <w:right w:type="dxa" w:w="90"/>
+            </w:tcMar>
+          </w:tcPr>
+          <w:p>
+            <w:pPr>
+              <w:jc w:val="left"/>
+            </w:pPr>
+            <w:r>
+              <w:rPr>
+                <w:rFonts w:ascii="Arial" w:cs="Arial" w:eastAsia="Arial" w:hAnsi="Arial"/>
+                <w:b/>
+                <w:bCs/>
+                <w:sz w:val="18"/>
+                <w:szCs w:val="18"/>
+              </w:rPr>
+              <w:t xml:space="preserve">Jami</w:t>
+            </w:r>
+          </w:p>
+        </w:tc>
+        <w:tc>
+          <w:tcPr>
+            <w:tcW w:type="dxa" w:w="1927"/>
+            <w:tcBorders>
+              <w:top w:val="single" w:color="B7C4CC" w:sz="4"/>
+              <w:left w:val="single" w:color="B7C4CC" w:sz="4"/>
+              <w:bottom w:val="single" w:color="B7C4CC" w:sz="4"/>
+              <w:right w:val="single" w:color="B7C4CC" w:sz="4"/>
+            </w:tcBorders>
+            <w:shd w:fill="D9EAD3" w:color="auto" w:val="clear"/>
+            <w:tcMar>
+              <w:top w:type="dxa" w:w="60"/>
+              <w:left w:type="dxa" w:w="90"/>
+              <w:bottom w:type="dxa" w:w="60"/>
+              <w:right w:type="dxa" w:w="90"/>
+            </w:tcMar>
+          </w:tcPr>
+          <w:p>
+            <w:pPr>
+              <w:jc w:val="right"/>
+            </w:pPr>
+            <w:r>
+              <w:rPr>
+                <w:rFonts w:ascii="Arial" w:cs="Arial" w:eastAsia="Arial" w:hAnsi="Arial"/>
+                <w:b/>
+                <w:bCs/>
+                <w:sz w:val="18"/>
+                <w:szCs w:val="18"/>
+              </w:rPr>
+              <w:t xml:space="preserve">18 000</w:t>
+            </w:r>
+          </w:p>
+        </w:tc>
+        <w:tc>
+          <w:tcPr>
+            <w:tcW w:type="dxa" w:w="1736"/>
+            <w:tcBorders>
+              <w:top w:val="single" w:color="B7C4CC" w:sz="4"/>
+              <w:left w:val="single" w:color="B7C4CC" w:sz="4"/>
+              <w:bottom w:val="single" w:color="B7C4CC" w:sz="4"/>
+              <w:right w:val="single" w:color="B7C4CC" w:sz="4"/>
+            </w:tcBorders>
+            <w:shd w:fill="D9EAD3" w:color="auto" w:val="clear"/>
+            <w:tcMar>
+              <w:top w:type="dxa" w:w="60"/>
+              <w:left w:type="dxa" w:w="90"/>
+              <w:bottom w:type="dxa" w:w="60"/>
+              <w:right w:type="dxa" w:w="90"/>
+            </w:tcMar>
+          </w:tcPr>
+          <w:p>
+            <w:pPr>
+              <w:jc w:val="right"/>
+            </w:pPr>
+            <w:r>
+              <w:rPr>
+                <w:rFonts w:ascii="Arial" w:cs="Arial" w:eastAsia="Arial" w:hAnsi="Arial"/>
+                <w:b/>
+                <w:bCs/>
+                <w:sz w:val="18"/>
+                <w:szCs w:val="18"/>
+              </w:rPr>
+              <w:t xml:space="preserve">100%</w:t>
+            </w:r>
+          </w:p>
+        </w:tc>
+      </w:tr>
+    </w:tbl>
+    <w:p>
+      <w:pPr>
+        <w:spacing w:after="120"/>
+      </w:pPr>
+    </w:p>
+    <w:p>
+      <w:pPr>
+        <w:spacing w:after="120" w:line="300"/>
+        <w:jc w:val="both"/>
+      </w:pPr>
+      <w:r>
+        <w:rPr>
+          <w:rFonts w:ascii="Arial" w:cs="Arial" w:eastAsia="Arial" w:hAnsi="Arial"/>
+        </w:rPr>
+        <w:t xml:space="preserve">Qurilish zichligi ≈ 17%. Bino atrofida 6–7 m li yong‘in o‘tish yo‘li bor. Yuk transporti (sisterna, mahsulot mashinalari) va yengil avtomobillar alohida harakatlanadi.</w:t>
+      </w:r>
+    </w:p>
+    <w:p>
+      <w:pPr>
+        <w:pStyle w:val="Heading2"/>
+        <w:spacing w:after="120" w:before="240"/>
+      </w:pPr>
+      <w:r>
+        <w:rPr>
+          <w:rFonts w:ascii="Arial" w:cs="Arial" w:eastAsia="Arial" w:hAnsi="Arial"/>
+        </w:rPr>
+        <w:t xml:space="preserve">7.3. Hududdagi obyektlar va ularning vazifasi</w:t>
+      </w:r>
+    </w:p>
+    <w:tbl>
+      <w:tblPr>
+        <w:tblW w:type="dxa" w:w="9638"/>
+        <w:tblBorders>
+          <w:top w:val="single" w:color="auto" w:sz="4"/>
+          <w:left w:val="single" w:color="auto" w:sz="4"/>
+          <w:bottom w:val="single" w:color="auto" w:sz="4"/>
+          <w:right w:val="single" w:color="auto" w:sz="4"/>
+          <w:insideH w:val="single" w:color="auto" w:sz="4"/>
+          <w:insideV w:val="single" w:color="auto" w:sz="4"/>
+        </w:tblBorders>
+        <w:tblLayout w:type="fixed"/>
+      </w:tblPr>
+      <w:tblGrid>
+        <w:gridCol w:w="2891"/>
+        <w:gridCol w:w="6747"/>
+      </w:tblGrid>
+      <w:tr>
+        <w:trPr>
+          <w:tblHeader/>
+        </w:trPr>
+        <w:tc>
+          <w:tcPr>
+            <w:tcW w:type="dxa" w:w="2891"/>
+            <w:tcBorders>
+              <w:top w:val="single" w:color="B7C4CC" w:sz="4"/>
+              <w:left w:val="single" w:color="B7C4CC" w:sz="4"/>
+              <w:bottom w:val="single" w:color="B7C4CC" w:sz="4"/>
+              <w:right w:val="single" w:color="B7C4CC" w:sz="4"/>
+            </w:tcBorders>
+            <w:shd w:fill="1F6F5C" w:color="auto" w:val="clear"/>
+            <w:tcMar>
+              <w:top w:type="dxa" w:w="60"/>
+              <w:left w:type="dxa" w:w="90"/>
+              <w:bottom w:type="dxa" w:w="60"/>
+              <w:right w:type="dxa" w:w="90"/>
+            </w:tcMar>
+          </w:tcPr>
+          <w:p>
+            <w:pPr>
+              <w:jc w:val="left"/>
+            </w:pPr>
+            <w:r>
+              <w:rPr>
+                <w:rFonts w:ascii="Arial" w:cs="Arial" w:eastAsia="Arial" w:hAnsi="Arial"/>
+                <w:b/>
+                <w:bCs/>
+                <w:color w:val="FFFFFF"/>
+                <w:sz w:val="18"/>
+                <w:szCs w:val="18"/>
+              </w:rPr>
+              <w:t xml:space="preserve">Obyekt</w:t>
+            </w:r>
+          </w:p>
+        </w:tc>
+        <w:tc>
+          <w:tcPr>
+            <w:tcW w:type="dxa" w:w="6747"/>
+            <w:tcBorders>
+              <w:top w:val="single" w:color="B7C4CC" w:sz="4"/>
+              <w:left w:val="single" w:color="B7C4CC" w:sz="4"/>
+              <w:bottom w:val="single" w:color="B7C4CC" w:sz="4"/>
+              <w:right w:val="single" w:color="B7C4CC" w:sz="4"/>
+            </w:tcBorders>
+            <w:shd w:fill="1F6F5C" w:color="auto" w:val="clear"/>
+            <w:tcMar>
+              <w:top w:type="dxa" w:w="60"/>
+              <w:left w:type="dxa" w:w="90"/>
+              <w:bottom w:type="dxa" w:w="60"/>
+              <w:right w:type="dxa" w:w="90"/>
+            </w:tcMar>
+          </w:tcPr>
+          <w:p>
+            <w:pPr>
+              <w:jc w:val="left"/>
+            </w:pPr>
+            <w:r>
+              <w:rPr>
+                <w:rFonts w:ascii="Arial" w:cs="Arial" w:eastAsia="Arial" w:hAnsi="Arial"/>
+                <w:b/>
+                <w:bCs/>
+                <w:color w:val="FFFFFF"/>
+                <w:sz w:val="18"/>
+                <w:szCs w:val="18"/>
+              </w:rPr>
+              <w:t xml:space="preserve">Vazifasi va asosiy parametrlari</w:t>
+            </w:r>
+          </w:p>
+        </w:tc>
+      </w:tr>
+      <w:tr>
+        <w:tc>
+          <w:tcPr>
+            <w:tcW w:type="dxa" w:w="2891"/>
+            <w:tcBorders>
+              <w:top w:val="single" w:color="B7C4CC" w:sz="4"/>
+              <w:left w:val="single" w:color="B7C4CC" w:sz="4"/>
+              <w:bottom w:val="single" w:color="B7C4CC" w:sz="4"/>
+              <w:right w:val="single" w:color="B7C4CC" w:sz="4"/>
+            </w:tcBorders>
+            <w:tcMar>
+              <w:top w:type="dxa" w:w="60"/>
+              <w:left w:type="dxa" w:w="90"/>
+              <w:bottom w:type="dxa" w:w="60"/>
+              <w:right w:type="dxa" w:w="90"/>
+            </w:tcMar>
+          </w:tcPr>
+          <w:p>
+            <w:pPr>
+              <w:jc w:val="left"/>
+            </w:pPr>
+            <w:r>
+              <w:rPr>
+                <w:rFonts w:ascii="Arial" w:cs="Arial" w:eastAsia="Arial" w:hAnsi="Arial"/>
+                <w:sz w:val="18"/>
+                <w:szCs w:val="18"/>
+              </w:rPr>
+              <w:t xml:space="preserve">KPP va shlagbaum</w:t>
+            </w:r>
+          </w:p>
+        </w:tc>
+        <w:tc>
+          <w:tcPr>
+            <w:tcW w:type="dxa" w:w="6747"/>
+            <w:tcBorders>
+              <w:top w:val="single" w:color="B7C4CC" w:sz="4"/>
+              <w:left w:val="single" w:color="B7C4CC" w:sz="4"/>
+              <w:bottom w:val="single" w:color="B7C4CC" w:sz="4"/>
+              <w:right w:val="single" w:color="B7C4CC" w:sz="4"/>
+            </w:tcBorders>
+            <w:tcMar>
+              <w:top w:type="dxa" w:w="60"/>
+              <w:left w:type="dxa" w:w="90"/>
+              <w:bottom w:type="dxa" w:w="60"/>
+              <w:right w:type="dxa" w:w="90"/>
+            </w:tcMar>
+          </w:tcPr>
+          <w:p>
+            <w:pPr>
+              <w:jc w:val="left"/>
+            </w:pPr>
+            <w:r>
+              <w:rPr>
+                <w:rFonts w:ascii="Arial" w:cs="Arial" w:eastAsia="Arial" w:hAnsi="Arial"/>
+                <w:sz w:val="18"/>
+                <w:szCs w:val="18"/>
+              </w:rPr>
+              <w:t xml:space="preserve">Xodimlar turniketdan elektron karta bilan o‘tadi; yuk mashinalari hujjat tekshiruvidan so‘ng tarozi tomon yo‘naltiriladi; 24/7 videokuzatuv</w:t>
+            </w:r>
+          </w:p>
+        </w:tc>
+      </w:tr>
+      <w:tr>
+        <w:tc>
+          <w:tcPr>
+            <w:tcW w:type="dxa" w:w="2891"/>
+            <w:tcBorders>
+              <w:top w:val="single" w:color="B7C4CC" w:sz="4"/>
+              <w:left w:val="single" w:color="B7C4CC" w:sz="4"/>
+              <w:bottom w:val="single" w:color="B7C4CC" w:sz="4"/>
+              <w:right w:val="single" w:color="B7C4CC" w:sz="4"/>
+            </w:tcBorders>
+            <w:shd w:fill="F4F8FA" w:color="auto" w:val="clear"/>
+            <w:tcMar>
+              <w:top w:type="dxa" w:w="60"/>
+              <w:left w:type="dxa" w:w="90"/>
+              <w:bottom w:type="dxa" w:w="60"/>
+              <w:right w:type="dxa" w:w="90"/>
+            </w:tcMar>
+          </w:tcPr>
+          <w:p>
+            <w:pPr>
+              <w:jc w:val="left"/>
+            </w:pPr>
+            <w:r>
+              <w:rPr>
+                <w:rFonts w:ascii="Arial" w:cs="Arial" w:eastAsia="Arial" w:hAnsi="Arial"/>
+                <w:sz w:val="18"/>
+                <w:szCs w:val="18"/>
+              </w:rPr>
+              <w:t xml:space="preserve">Avtotarozi 60 t (18 × 3,5 m)</w:t>
+            </w:r>
+          </w:p>
+        </w:tc>
+        <w:tc>
+          <w:tcPr>
+            <w:tcW w:type="dxa" w:w="6747"/>
+            <w:tcBorders>
+              <w:top w:val="single" w:color="B7C4CC" w:sz="4"/>
+              <w:left w:val="single" w:color="B7C4CC" w:sz="4"/>
+              <w:bottom w:val="single" w:color="B7C4CC" w:sz="4"/>
+              <w:right w:val="single" w:color="B7C4CC" w:sz="4"/>
+            </w:tcBorders>
+            <w:shd w:fill="F4F8FA" w:color="auto" w:val="clear"/>
+            <w:tcMar>
+              <w:top w:type="dxa" w:w="60"/>
+              <w:left w:type="dxa" w:w="90"/>
+              <w:bottom w:type="dxa" w:w="60"/>
+              <w:right w:type="dxa" w:w="90"/>
+            </w:tcMar>
+          </w:tcPr>
+          <w:p>
+            <w:pPr>
+              <w:jc w:val="left"/>
+            </w:pPr>
+            <w:r>
+              <w:rPr>
+                <w:rFonts w:ascii="Arial" w:cs="Arial" w:eastAsia="Arial" w:hAnsi="Arial"/>
+                <w:sz w:val="18"/>
+                <w:szCs w:val="18"/>
+              </w:rPr>
+              <w:t xml:space="preserve">Kirishda yuk bilan, chiqishda bo‘sh tortiladi; ma’lumot hisob tizimiga yoziladi</w:t>
+            </w:r>
+          </w:p>
+        </w:tc>
+      </w:tr>
+      <w:tr>
+        <w:tc>
+          <w:tcPr>
+            <w:tcW w:type="dxa" w:w="2891"/>
+            <w:tcBorders>
+              <w:top w:val="single" w:color="B7C4CC" w:sz="4"/>
+              <w:left w:val="single" w:color="B7C4CC" w:sz="4"/>
+              <w:bottom w:val="single" w:color="B7C4CC" w:sz="4"/>
+              <w:right w:val="single" w:color="B7C4CC" w:sz="4"/>
+            </w:tcBorders>
+            <w:tcMar>
+              <w:top w:type="dxa" w:w="60"/>
+              <w:left w:type="dxa" w:w="90"/>
+              <w:bottom w:type="dxa" w:w="60"/>
+              <w:right w:type="dxa" w:w="90"/>
+            </w:tcMar>
+          </w:tcPr>
+          <w:p>
+            <w:pPr>
+              <w:jc w:val="left"/>
+            </w:pPr>
+            <w:r>
+              <w:rPr>
+                <w:rFonts w:ascii="Arial" w:cs="Arial" w:eastAsia="Arial" w:hAnsi="Arial"/>
+                <w:sz w:val="18"/>
+                <w:szCs w:val="18"/>
+              </w:rPr>
+              <w:t xml:space="preserve">Yog‘ idishlari parki</w:t>
+            </w:r>
+          </w:p>
+        </w:tc>
+        <w:tc>
+          <w:tcPr>
+            <w:tcW w:type="dxa" w:w="6747"/>
+            <w:tcBorders>
+              <w:top w:val="single" w:color="B7C4CC" w:sz="4"/>
+              <w:left w:val="single" w:color="B7C4CC" w:sz="4"/>
+              <w:bottom w:val="single" w:color="B7C4CC" w:sz="4"/>
+              <w:right w:val="single" w:color="B7C4CC" w:sz="4"/>
+            </w:tcBorders>
+            <w:tcMar>
+              <w:top w:type="dxa" w:w="60"/>
+              <w:left w:type="dxa" w:w="90"/>
+              <w:bottom w:type="dxa" w:w="60"/>
+              <w:right w:type="dxa" w:w="90"/>
+            </w:tcMar>
+          </w:tcPr>
+          <w:p>
+            <w:pPr>
+              <w:jc w:val="left"/>
+            </w:pPr>
+            <w:r>
+              <w:rPr>
+                <w:rFonts w:ascii="Arial" w:cs="Arial" w:eastAsia="Arial" w:hAnsi="Arial"/>
+                <w:sz w:val="18"/>
+                <w:szCs w:val="18"/>
+              </w:rPr>
+              <w:t xml:space="preserve">2 × 10 m³ isitiladigan idish, beton obvalovka (eng katta idishning ≥110%), sisterna tushirish maydonchasi; estakada orqali sexga</w:t>
+            </w:r>
+          </w:p>
+        </w:tc>
+      </w:tr>
+      <w:tr>
+        <w:tc>
+          <w:tcPr>
+            <w:tcW w:type="dxa" w:w="2891"/>
+            <w:tcBorders>
+              <w:top w:val="single" w:color="B7C4CC" w:sz="4"/>
+              <w:left w:val="single" w:color="B7C4CC" w:sz="4"/>
+              <w:bottom w:val="single" w:color="B7C4CC" w:sz="4"/>
+              <w:right w:val="single" w:color="B7C4CC" w:sz="4"/>
+            </w:tcBorders>
+            <w:shd w:fill="F4F8FA" w:color="auto" w:val="clear"/>
+            <w:tcMar>
+              <w:top w:type="dxa" w:w="60"/>
+              <w:left w:type="dxa" w:w="90"/>
+              <w:bottom w:type="dxa" w:w="60"/>
+              <w:right w:type="dxa" w:w="90"/>
+            </w:tcMar>
+          </w:tcPr>
+          <w:p>
+            <w:pPr>
+              <w:jc w:val="left"/>
+            </w:pPr>
+            <w:r>
+              <w:rPr>
+                <w:rFonts w:ascii="Arial" w:cs="Arial" w:eastAsia="Arial" w:hAnsi="Arial"/>
+                <w:sz w:val="18"/>
+                <w:szCs w:val="18"/>
+              </w:rPr>
+              <w:t xml:space="preserve">Ishlab chiqarish binosi</w:t>
+            </w:r>
+          </w:p>
+        </w:tc>
+        <w:tc>
+          <w:tcPr>
+            <w:tcW w:type="dxa" w:w="6747"/>
+            <w:tcBorders>
+              <w:top w:val="single" w:color="B7C4CC" w:sz="4"/>
+              <w:left w:val="single" w:color="B7C4CC" w:sz="4"/>
+              <w:bottom w:val="single" w:color="B7C4CC" w:sz="4"/>
+              <w:right w:val="single" w:color="B7C4CC" w:sz="4"/>
+            </w:tcBorders>
+            <w:shd w:fill="F4F8FA" w:color="auto" w:val="clear"/>
+            <w:tcMar>
+              <w:top w:type="dxa" w:w="60"/>
+              <w:left w:type="dxa" w:w="90"/>
+              <w:bottom w:type="dxa" w:w="60"/>
+              <w:right w:type="dxa" w:w="90"/>
+            </w:tcMar>
+          </w:tcPr>
+          <w:p>
+            <w:pPr>
+              <w:jc w:val="left"/>
+            </w:pPr>
+            <w:r>
+              <w:rPr>
+                <w:rFonts w:ascii="Arial" w:cs="Arial" w:eastAsia="Arial" w:hAnsi="Arial"/>
+                <w:sz w:val="18"/>
+                <w:szCs w:val="18"/>
+              </w:rPr>
+              <w:t xml:space="preserve">Metall karkas, 100 mm PIR sendvich panel, epoksid qoplamali pol; ichida biotexnologiya, ajratish-quritish, plyonka va utilita zonalari</w:t>
+            </w:r>
+          </w:p>
+        </w:tc>
+      </w:tr>
+      <w:tr>
+        <w:tc>
+          <w:tcPr>
+            <w:tcW w:type="dxa" w:w="2891"/>
+            <w:tcBorders>
+              <w:top w:val="single" w:color="B7C4CC" w:sz="4"/>
+              <w:left w:val="single" w:color="B7C4CC" w:sz="4"/>
+              <w:bottom w:val="single" w:color="B7C4CC" w:sz="4"/>
+              <w:right w:val="single" w:color="B7C4CC" w:sz="4"/>
+            </w:tcBorders>
+            <w:tcMar>
+              <w:top w:type="dxa" w:w="60"/>
+              <w:left w:type="dxa" w:w="90"/>
+              <w:bottom w:type="dxa" w:w="60"/>
+              <w:right w:type="dxa" w:w="90"/>
+            </w:tcMar>
+          </w:tcPr>
+          <w:p>
+            <w:pPr>
+              <w:jc w:val="left"/>
+            </w:pPr>
+            <w:r>
+              <w:rPr>
+                <w:rFonts w:ascii="Arial" w:cs="Arial" w:eastAsia="Arial" w:hAnsi="Arial"/>
+                <w:sz w:val="18"/>
+                <w:szCs w:val="18"/>
+              </w:rPr>
+              <w:t xml:space="preserve">Ombor</w:t>
+            </w:r>
+          </w:p>
+        </w:tc>
+        <w:tc>
+          <w:tcPr>
+            <w:tcW w:type="dxa" w:w="6747"/>
+            <w:tcBorders>
+              <w:top w:val="single" w:color="B7C4CC" w:sz="4"/>
+              <w:left w:val="single" w:color="B7C4CC" w:sz="4"/>
+              <w:bottom w:val="single" w:color="B7C4CC" w:sz="4"/>
+              <w:right w:val="single" w:color="B7C4CC" w:sz="4"/>
+            </w:tcBorders>
+            <w:tcMar>
+              <w:top w:type="dxa" w:w="60"/>
+              <w:left w:type="dxa" w:w="90"/>
+              <w:bottom w:type="dxa" w:w="60"/>
+              <w:right w:type="dxa" w:w="90"/>
+            </w:tcMar>
+          </w:tcPr>
+          <w:p>
+            <w:pPr>
+              <w:jc w:val="left"/>
+            </w:pPr>
+            <w:r>
+              <w:rPr>
+                <w:rFonts w:ascii="Arial" w:cs="Arial" w:eastAsia="Arial" w:hAnsi="Arial"/>
+                <w:sz w:val="18"/>
+                <w:szCs w:val="18"/>
+              </w:rPr>
+              <w:t xml:space="preserve">≈700 paddon o‘rni, 4 yarusli stellajlar, elektr pogruzchik, 2 jo‘natish rampasi; harorat &lt; 30 °C</w:t>
+            </w:r>
+          </w:p>
+        </w:tc>
+      </w:tr>
+      <w:tr>
+        <w:tc>
+          <w:tcPr>
+            <w:tcW w:type="dxa" w:w="2891"/>
+            <w:tcBorders>
+              <w:top w:val="single" w:color="B7C4CC" w:sz="4"/>
+              <w:left w:val="single" w:color="B7C4CC" w:sz="4"/>
+              <w:bottom w:val="single" w:color="B7C4CC" w:sz="4"/>
+              <w:right w:val="single" w:color="B7C4CC" w:sz="4"/>
+            </w:tcBorders>
+            <w:shd w:fill="F4F8FA" w:color="auto" w:val="clear"/>
+            <w:tcMar>
+              <w:top w:type="dxa" w:w="60"/>
+              <w:left w:type="dxa" w:w="90"/>
+              <w:bottom w:type="dxa" w:w="60"/>
+              <w:right w:type="dxa" w:w="90"/>
+            </w:tcMar>
+          </w:tcPr>
+          <w:p>
+            <w:pPr>
+              <w:jc w:val="left"/>
+            </w:pPr>
+            <w:r>
+              <w:rPr>
+                <w:rFonts w:ascii="Arial" w:cs="Arial" w:eastAsia="Arial" w:hAnsi="Arial"/>
+                <w:sz w:val="18"/>
+                <w:szCs w:val="18"/>
+              </w:rPr>
+              <w:t xml:space="preserve">Transformator podstansiyasi + dizel-generator</w:t>
+            </w:r>
+          </w:p>
+        </w:tc>
+        <w:tc>
+          <w:tcPr>
+            <w:tcW w:type="dxa" w:w="6747"/>
+            <w:tcBorders>
+              <w:top w:val="single" w:color="B7C4CC" w:sz="4"/>
+              <w:left w:val="single" w:color="B7C4CC" w:sz="4"/>
+              <w:bottom w:val="single" w:color="B7C4CC" w:sz="4"/>
+              <w:right w:val="single" w:color="B7C4CC" w:sz="4"/>
+            </w:tcBorders>
+            <w:shd w:fill="F4F8FA" w:color="auto" w:val="clear"/>
+            <w:tcMar>
+              <w:top w:type="dxa" w:w="60"/>
+              <w:left w:type="dxa" w:w="90"/>
+              <w:bottom w:type="dxa" w:w="60"/>
+              <w:right w:type="dxa" w:w="90"/>
+            </w:tcMar>
+          </w:tcPr>
+          <w:p>
+            <w:pPr>
+              <w:jc w:val="left"/>
+            </w:pPr>
+            <w:r>
+              <w:rPr>
+                <w:rFonts w:ascii="Arial" w:cs="Arial" w:eastAsia="Arial" w:hAnsi="Arial"/>
+                <w:sz w:val="18"/>
+                <w:szCs w:val="18"/>
+              </w:rPr>
+              <w:t xml:space="preserve">630 kVA (10/0,4 kV); o‘rnatilgan quvvat ≈450 kVt; 200 kVA generator elektr uzilsa fermenterlarni 10–15 soniyada ta’minlaydi (partiya buzilmasligi uchun)</w:t>
+            </w:r>
+          </w:p>
+        </w:tc>
+      </w:tr>
+      <w:tr>
+        <w:tc>
+          <w:tcPr>
+            <w:tcW w:type="dxa" w:w="2891"/>
+            <w:tcBorders>
+              <w:top w:val="single" w:color="B7C4CC" w:sz="4"/>
+              <w:left w:val="single" w:color="B7C4CC" w:sz="4"/>
+              <w:bottom w:val="single" w:color="B7C4CC" w:sz="4"/>
+              <w:right w:val="single" w:color="B7C4CC" w:sz="4"/>
+            </w:tcBorders>
+            <w:tcMar>
+              <w:top w:type="dxa" w:w="60"/>
+              <w:left w:type="dxa" w:w="90"/>
+              <w:bottom w:type="dxa" w:w="60"/>
+              <w:right w:type="dxa" w:w="90"/>
+            </w:tcMar>
+          </w:tcPr>
+          <w:p>
+            <w:pPr>
+              <w:jc w:val="left"/>
+            </w:pPr>
+            <w:r>
+              <w:rPr>
+                <w:rFonts w:ascii="Arial" w:cs="Arial" w:eastAsia="Arial" w:hAnsi="Arial"/>
+                <w:sz w:val="18"/>
+                <w:szCs w:val="18"/>
+              </w:rPr>
+              <w:t xml:space="preserve">Gaz taqsimlash shkafi</w:t>
+            </w:r>
+          </w:p>
+        </w:tc>
+        <w:tc>
+          <w:tcPr>
+            <w:tcW w:type="dxa" w:w="6747"/>
+            <w:tcBorders>
+              <w:top w:val="single" w:color="B7C4CC" w:sz="4"/>
+              <w:left w:val="single" w:color="B7C4CC" w:sz="4"/>
+              <w:bottom w:val="single" w:color="B7C4CC" w:sz="4"/>
+              <w:right w:val="single" w:color="B7C4CC" w:sz="4"/>
+            </w:tcBorders>
+            <w:tcMar>
+              <w:top w:type="dxa" w:w="60"/>
+              <w:left w:type="dxa" w:w="90"/>
+              <w:bottom w:type="dxa" w:w="60"/>
+              <w:right w:type="dxa" w:w="90"/>
+            </w:tcMar>
+          </w:tcPr>
+          <w:p>
+            <w:pPr>
+              <w:jc w:val="left"/>
+            </w:pPr>
+            <w:r>
+              <w:rPr>
+                <w:rFonts w:ascii="Arial" w:cs="Arial" w:eastAsia="Arial" w:hAnsi="Arial"/>
+                <w:sz w:val="18"/>
+                <w:szCs w:val="18"/>
+              </w:rPr>
+              <w:t xml:space="preserve">Bosimni pasaytiradi, sarfni hisoblaydi; ≈80–100 m³/soat (bug‘ qozoni va quritgich)</w:t>
+            </w:r>
+          </w:p>
+        </w:tc>
+      </w:tr>
+      <w:tr>
+        <w:tc>
+          <w:tcPr>
+            <w:tcW w:type="dxa" w:w="2891"/>
+            <w:tcBorders>
+              <w:top w:val="single" w:color="B7C4CC" w:sz="4"/>
+              <w:left w:val="single" w:color="B7C4CC" w:sz="4"/>
+              <w:bottom w:val="single" w:color="B7C4CC" w:sz="4"/>
+              <w:right w:val="single" w:color="B7C4CC" w:sz="4"/>
+            </w:tcBorders>
+            <w:shd w:fill="F4F8FA" w:color="auto" w:val="clear"/>
+            <w:tcMar>
+              <w:top w:type="dxa" w:w="60"/>
+              <w:left w:type="dxa" w:w="90"/>
+              <w:bottom w:type="dxa" w:w="60"/>
+              <w:right w:type="dxa" w:w="90"/>
+            </w:tcMar>
+          </w:tcPr>
+          <w:p>
+            <w:pPr>
+              <w:jc w:val="left"/>
+            </w:pPr>
+            <w:r>
+              <w:rPr>
+                <w:rFonts w:ascii="Arial" w:cs="Arial" w:eastAsia="Arial" w:hAnsi="Arial"/>
+                <w:sz w:val="18"/>
+                <w:szCs w:val="18"/>
+              </w:rPr>
+              <w:t xml:space="preserve">Yong‘in suvi zaxirasi</w:t>
+            </w:r>
+          </w:p>
+        </w:tc>
+        <w:tc>
+          <w:tcPr>
+            <w:tcW w:type="dxa" w:w="6747"/>
+            <w:tcBorders>
+              <w:top w:val="single" w:color="B7C4CC" w:sz="4"/>
+              <w:left w:val="single" w:color="B7C4CC" w:sz="4"/>
+              <w:bottom w:val="single" w:color="B7C4CC" w:sz="4"/>
+              <w:right w:val="single" w:color="B7C4CC" w:sz="4"/>
+            </w:tcBorders>
+            <w:shd w:fill="F4F8FA" w:color="auto" w:val="clear"/>
+            <w:tcMar>
+              <w:top w:type="dxa" w:w="60"/>
+              <w:left w:type="dxa" w:w="90"/>
+              <w:bottom w:type="dxa" w:w="60"/>
+              <w:right w:type="dxa" w:w="90"/>
+            </w:tcMar>
+          </w:tcPr>
+          <w:p>
+            <w:pPr>
+              <w:jc w:val="left"/>
+            </w:pPr>
+            <w:r>
+              <w:rPr>
+                <w:rFonts w:ascii="Arial" w:cs="Arial" w:eastAsia="Arial" w:hAnsi="Arial"/>
+                <w:sz w:val="18"/>
+                <w:szCs w:val="18"/>
+              </w:rPr>
+              <w:t xml:space="preserve">2 × 150 m³ rezervuar, nasos stansiyasi, halqa gidrant tarmog‘i (hajm loyihada aniqlanadi)</w:t>
+            </w:r>
+          </w:p>
+        </w:tc>
+      </w:tr>
+      <w:tr>
+        <w:tc>
+          <w:tcPr>
+            <w:tcW w:type="dxa" w:w="2891"/>
+            <w:tcBorders>
+              <w:top w:val="single" w:color="B7C4CC" w:sz="4"/>
+              <w:left w:val="single" w:color="B7C4CC" w:sz="4"/>
+              <w:bottom w:val="single" w:color="B7C4CC" w:sz="4"/>
+              <w:right w:val="single" w:color="B7C4CC" w:sz="4"/>
+            </w:tcBorders>
+            <w:tcMar>
+              <w:top w:type="dxa" w:w="60"/>
+              <w:left w:type="dxa" w:w="90"/>
+              <w:bottom w:type="dxa" w:w="60"/>
+              <w:right w:type="dxa" w:w="90"/>
+            </w:tcMar>
+          </w:tcPr>
+          <w:p>
+            <w:pPr>
+              <w:jc w:val="left"/>
+            </w:pPr>
+            <w:r>
+              <w:rPr>
+                <w:rFonts w:ascii="Arial" w:cs="Arial" w:eastAsia="Arial" w:hAnsi="Arial"/>
+                <w:sz w:val="18"/>
+                <w:szCs w:val="18"/>
+              </w:rPr>
+              <w:t xml:space="preserve">Oqova suvni dastlabki tozalash</w:t>
+            </w:r>
+          </w:p>
+        </w:tc>
+        <w:tc>
+          <w:tcPr>
+            <w:tcW w:type="dxa" w:w="6747"/>
+            <w:tcBorders>
+              <w:top w:val="single" w:color="B7C4CC" w:sz="4"/>
+              <w:left w:val="single" w:color="B7C4CC" w:sz="4"/>
+              <w:bottom w:val="single" w:color="B7C4CC" w:sz="4"/>
+              <w:right w:val="single" w:color="B7C4CC" w:sz="4"/>
+            </w:tcBorders>
+            <w:tcMar>
+              <w:top w:type="dxa" w:w="60"/>
+              <w:left w:type="dxa" w:w="90"/>
+              <w:bottom w:type="dxa" w:w="60"/>
+              <w:right w:type="dxa" w:w="90"/>
+            </w:tcMar>
+          </w:tcPr>
+          <w:p>
+            <w:pPr>
+              <w:jc w:val="left"/>
+            </w:pPr>
+            <w:r>
+              <w:rPr>
+                <w:rFonts w:ascii="Arial" w:cs="Arial" w:eastAsia="Arial" w:hAnsi="Arial"/>
+                <w:sz w:val="18"/>
+                <w:szCs w:val="18"/>
+              </w:rPr>
+              <w:t xml:space="preserve">Neytrallash, yog‘ ushlagich, flotatsiya; cho‘kma biogaz yoki kompostga</w:t>
+            </w:r>
+          </w:p>
+        </w:tc>
+      </w:tr>
+      <w:tr>
+        <w:tc>
+          <w:tcPr>
+            <w:tcW w:type="dxa" w:w="2891"/>
+            <w:tcBorders>
+              <w:top w:val="single" w:color="B7C4CC" w:sz="4"/>
+              <w:left w:val="single" w:color="B7C4CC" w:sz="4"/>
+              <w:bottom w:val="single" w:color="B7C4CC" w:sz="4"/>
+              <w:right w:val="single" w:color="B7C4CC" w:sz="4"/>
+            </w:tcBorders>
+            <w:shd w:fill="F4F8FA" w:color="auto" w:val="clear"/>
+            <w:tcMar>
+              <w:top w:type="dxa" w:w="60"/>
+              <w:left w:type="dxa" w:w="90"/>
+              <w:bottom w:type="dxa" w:w="60"/>
+              <w:right w:type="dxa" w:w="90"/>
+            </w:tcMar>
+          </w:tcPr>
+          <w:p>
+            <w:pPr>
+              <w:jc w:val="left"/>
+            </w:pPr>
+            <w:r>
+              <w:rPr>
+                <w:rFonts w:ascii="Arial" w:cs="Arial" w:eastAsia="Arial" w:hAnsi="Arial"/>
+                <w:sz w:val="18"/>
+                <w:szCs w:val="18"/>
+              </w:rPr>
+              <w:t xml:space="preserve">Ma’muriy-maishiy bino</w:t>
+            </w:r>
+          </w:p>
+        </w:tc>
+        <w:tc>
+          <w:tcPr>
+            <w:tcW w:type="dxa" w:w="6747"/>
+            <w:tcBorders>
+              <w:top w:val="single" w:color="B7C4CC" w:sz="4"/>
+              <w:left w:val="single" w:color="B7C4CC" w:sz="4"/>
+              <w:bottom w:val="single" w:color="B7C4CC" w:sz="4"/>
+              <w:right w:val="single" w:color="B7C4CC" w:sz="4"/>
+            </w:tcBorders>
+            <w:shd w:fill="F4F8FA" w:color="auto" w:val="clear"/>
+            <w:tcMar>
+              <w:top w:type="dxa" w:w="60"/>
+              <w:left w:type="dxa" w:w="90"/>
+              <w:bottom w:type="dxa" w:w="60"/>
+              <w:right w:type="dxa" w:w="90"/>
+            </w:tcMar>
+          </w:tcPr>
+          <w:p>
+            <w:pPr>
+              <w:jc w:val="left"/>
+            </w:pPr>
+            <w:r>
+              <w:rPr>
+                <w:rFonts w:ascii="Arial" w:cs="Arial" w:eastAsia="Arial" w:hAnsi="Arial"/>
+                <w:sz w:val="18"/>
+                <w:szCs w:val="18"/>
+              </w:rPr>
+              <w:t xml:space="preserve">Ofislar, kiyinish xonalari va dush, oshxona (40 o‘rin), tibbiy punkt, o‘quv xonasi</w:t>
+            </w:r>
+          </w:p>
+        </w:tc>
+      </w:tr>
+      <w:tr>
+        <w:tc>
+          <w:tcPr>
+            <w:tcW w:type="dxa" w:w="2891"/>
+            <w:tcBorders>
+              <w:top w:val="single" w:color="B7C4CC" w:sz="4"/>
+              <w:left w:val="single" w:color="B7C4CC" w:sz="4"/>
+              <w:bottom w:val="single" w:color="B7C4CC" w:sz="4"/>
+              <w:right w:val="single" w:color="B7C4CC" w:sz="4"/>
+            </w:tcBorders>
+            <w:tcMar>
+              <w:top w:type="dxa" w:w="60"/>
+              <w:left w:type="dxa" w:w="90"/>
+              <w:bottom w:type="dxa" w:w="60"/>
+              <w:right w:type="dxa" w:w="90"/>
+            </w:tcMar>
+          </w:tcPr>
+          <w:p>
+            <w:pPr>
+              <w:jc w:val="left"/>
+            </w:pPr>
+            <w:r>
+              <w:rPr>
+                <w:rFonts w:ascii="Arial" w:cs="Arial" w:eastAsia="Arial" w:hAnsi="Arial"/>
+                <w:sz w:val="18"/>
+                <w:szCs w:val="18"/>
+              </w:rPr>
+              <w:t xml:space="preserve">3-faza zaxira maydoni</w:t>
+            </w:r>
+          </w:p>
+        </w:tc>
+        <w:tc>
+          <w:tcPr>
+            <w:tcW w:type="dxa" w:w="6747"/>
+            <w:tcBorders>
+              <w:top w:val="single" w:color="B7C4CC" w:sz="4"/>
+              <w:left w:val="single" w:color="B7C4CC" w:sz="4"/>
+              <w:bottom w:val="single" w:color="B7C4CC" w:sz="4"/>
+              <w:right w:val="single" w:color="B7C4CC" w:sz="4"/>
+            </w:tcBorders>
+            <w:tcMar>
+              <w:top w:type="dxa" w:w="60"/>
+              <w:left w:type="dxa" w:w="90"/>
+              <w:bottom w:type="dxa" w:w="60"/>
+              <w:right w:type="dxa" w:w="90"/>
+            </w:tcMar>
+          </w:tcPr>
+          <w:p>
+            <w:pPr>
+              <w:jc w:val="left"/>
+            </w:pPr>
+            <w:r>
+              <w:rPr>
+                <w:rFonts w:ascii="Arial" w:cs="Arial" w:eastAsia="Arial" w:hAnsi="Arial"/>
+                <w:sz w:val="18"/>
+                <w:szCs w:val="18"/>
+              </w:rPr>
+              <w:t xml:space="preserve">40 × 30 m li bino: 4 × 50 m³ fermenter, PHA ≈500 t/yil</w:t>
             </w:r>
           </w:p>
         </w:tc>
@@ -16207,7 +18756,1111 @@
         <w:rPr>
           <w:rFonts w:ascii="Arial" w:cs="Arial" w:eastAsia="Arial" w:hAnsi="Arial"/>
         </w:rPr>
-        <w:t xml:space="preserve">7.2. Xodimlar</w:t>
+        <w:t xml:space="preserve">7.4. Muhandislik ta’minoti va me’yorlar</w:t>
+      </w:r>
+    </w:p>
+    <w:tbl>
+      <w:tblPr>
+        <w:tblW w:type="dxa" w:w="9638"/>
+        <w:tblBorders>
+          <w:top w:val="single" w:color="auto" w:sz="4"/>
+          <w:left w:val="single" w:color="auto" w:sz="4"/>
+          <w:bottom w:val="single" w:color="auto" w:sz="4"/>
+          <w:right w:val="single" w:color="auto" w:sz="4"/>
+          <w:insideH w:val="single" w:color="auto" w:sz="4"/>
+          <w:insideV w:val="single" w:color="auto" w:sz="4"/>
+        </w:tblBorders>
+        <w:tblLayout w:type="fixed"/>
+      </w:tblPr>
+      <w:tblGrid>
+        <w:gridCol w:w="2891"/>
+        <w:gridCol w:w="6747"/>
+      </w:tblGrid>
+      <w:tr>
+        <w:trPr>
+          <w:tblHeader/>
+        </w:trPr>
+        <w:tc>
+          <w:tcPr>
+            <w:tcW w:type="dxa" w:w="2891"/>
+            <w:tcBorders>
+              <w:top w:val="single" w:color="B7C4CC" w:sz="4"/>
+              <w:left w:val="single" w:color="B7C4CC" w:sz="4"/>
+              <w:bottom w:val="single" w:color="B7C4CC" w:sz="4"/>
+              <w:right w:val="single" w:color="B7C4CC" w:sz="4"/>
+            </w:tcBorders>
+            <w:shd w:fill="1F6F5C" w:color="auto" w:val="clear"/>
+            <w:tcMar>
+              <w:top w:type="dxa" w:w="60"/>
+              <w:left w:type="dxa" w:w="90"/>
+              <w:bottom w:type="dxa" w:w="60"/>
+              <w:right w:type="dxa" w:w="90"/>
+            </w:tcMar>
+          </w:tcPr>
+          <w:p>
+            <w:pPr>
+              <w:jc w:val="left"/>
+            </w:pPr>
+            <w:r>
+              <w:rPr>
+                <w:rFonts w:ascii="Arial" w:cs="Arial" w:eastAsia="Arial" w:hAnsi="Arial"/>
+                <w:b/>
+                <w:bCs/>
+                <w:color w:val="FFFFFF"/>
+                <w:sz w:val="18"/>
+                <w:szCs w:val="18"/>
+              </w:rPr>
+              <w:t xml:space="preserve">Talab</w:t>
+            </w:r>
+          </w:p>
+        </w:tc>
+        <w:tc>
+          <w:tcPr>
+            <w:tcW w:type="dxa" w:w="6747"/>
+            <w:tcBorders>
+              <w:top w:val="single" w:color="B7C4CC" w:sz="4"/>
+              <w:left w:val="single" w:color="B7C4CC" w:sz="4"/>
+              <w:bottom w:val="single" w:color="B7C4CC" w:sz="4"/>
+              <w:right w:val="single" w:color="B7C4CC" w:sz="4"/>
+            </w:tcBorders>
+            <w:shd w:fill="1F6F5C" w:color="auto" w:val="clear"/>
+            <w:tcMar>
+              <w:top w:type="dxa" w:w="60"/>
+              <w:left w:type="dxa" w:w="90"/>
+              <w:bottom w:type="dxa" w:w="60"/>
+              <w:right w:type="dxa" w:w="90"/>
+            </w:tcMar>
+          </w:tcPr>
+          <w:p>
+            <w:pPr>
+              <w:jc w:val="left"/>
+            </w:pPr>
+            <w:r>
+              <w:rPr>
+                <w:rFonts w:ascii="Arial" w:cs="Arial" w:eastAsia="Arial" w:hAnsi="Arial"/>
+                <w:b/>
+                <w:bCs/>
+                <w:color w:val="FFFFFF"/>
+                <w:sz w:val="18"/>
+                <w:szCs w:val="18"/>
+              </w:rPr>
+              <w:t xml:space="preserve">Miqdor</w:t>
+            </w:r>
+          </w:p>
+        </w:tc>
+      </w:tr>
+      <w:tr>
+        <w:tc>
+          <w:tcPr>
+            <w:tcW w:type="dxa" w:w="2891"/>
+            <w:tcBorders>
+              <w:top w:val="single" w:color="B7C4CC" w:sz="4"/>
+              <w:left w:val="single" w:color="B7C4CC" w:sz="4"/>
+              <w:bottom w:val="single" w:color="B7C4CC" w:sz="4"/>
+              <w:right w:val="single" w:color="B7C4CC" w:sz="4"/>
+            </w:tcBorders>
+            <w:tcMar>
+              <w:top w:type="dxa" w:w="60"/>
+              <w:left w:type="dxa" w:w="90"/>
+              <w:bottom w:type="dxa" w:w="60"/>
+              <w:right w:type="dxa" w:w="90"/>
+            </w:tcMar>
+          </w:tcPr>
+          <w:p>
+            <w:pPr>
+              <w:jc w:val="left"/>
+            </w:pPr>
+            <w:r>
+              <w:rPr>
+                <w:rFonts w:ascii="Arial" w:cs="Arial" w:eastAsia="Arial" w:hAnsi="Arial"/>
+                <w:sz w:val="18"/>
+                <w:szCs w:val="18"/>
+              </w:rPr>
+              <w:t xml:space="preserve">Elektr quvvati</w:t>
+            </w:r>
+          </w:p>
+        </w:tc>
+        <w:tc>
+          <w:tcPr>
+            <w:tcW w:type="dxa" w:w="6747"/>
+            <w:tcBorders>
+              <w:top w:val="single" w:color="B7C4CC" w:sz="4"/>
+              <w:left w:val="single" w:color="B7C4CC" w:sz="4"/>
+              <w:bottom w:val="single" w:color="B7C4CC" w:sz="4"/>
+              <w:right w:val="single" w:color="B7C4CC" w:sz="4"/>
+            </w:tcBorders>
+            <w:tcMar>
+              <w:top w:type="dxa" w:w="60"/>
+              <w:left w:type="dxa" w:w="90"/>
+              <w:bottom w:type="dxa" w:w="60"/>
+              <w:right w:type="dxa" w:w="90"/>
+            </w:tcMar>
+          </w:tcPr>
+          <w:p>
+            <w:pPr>
+              <w:jc w:val="left"/>
+            </w:pPr>
+            <w:r>
+              <w:rPr>
+                <w:rFonts w:ascii="Arial" w:cs="Arial" w:eastAsia="Arial" w:hAnsi="Arial"/>
+                <w:sz w:val="18"/>
+                <w:szCs w:val="18"/>
+              </w:rPr>
+              <w:t xml:space="preserve">≈450 kVt o‘rnatilgan; yiliga ≈1,5–2 mln kVt·soat; 10 kV ga ulanish</w:t>
+            </w:r>
+          </w:p>
+        </w:tc>
+      </w:tr>
+      <w:tr>
+        <w:tc>
+          <w:tcPr>
+            <w:tcW w:type="dxa" w:w="2891"/>
+            <w:tcBorders>
+              <w:top w:val="single" w:color="B7C4CC" w:sz="4"/>
+              <w:left w:val="single" w:color="B7C4CC" w:sz="4"/>
+              <w:bottom w:val="single" w:color="B7C4CC" w:sz="4"/>
+              <w:right w:val="single" w:color="B7C4CC" w:sz="4"/>
+            </w:tcBorders>
+            <w:shd w:fill="F4F8FA" w:color="auto" w:val="clear"/>
+            <w:tcMar>
+              <w:top w:type="dxa" w:w="60"/>
+              <w:left w:type="dxa" w:w="90"/>
+              <w:bottom w:type="dxa" w:w="60"/>
+              <w:right w:type="dxa" w:w="90"/>
+            </w:tcMar>
+          </w:tcPr>
+          <w:p>
+            <w:pPr>
+              <w:jc w:val="left"/>
+            </w:pPr>
+            <w:r>
+              <w:rPr>
+                <w:rFonts w:ascii="Arial" w:cs="Arial" w:eastAsia="Arial" w:hAnsi="Arial"/>
+                <w:sz w:val="18"/>
+                <w:szCs w:val="18"/>
+              </w:rPr>
+              <w:t xml:space="preserve">Tabiiy gaz</w:t>
+            </w:r>
+          </w:p>
+        </w:tc>
+        <w:tc>
+          <w:tcPr>
+            <w:tcW w:type="dxa" w:w="6747"/>
+            <w:tcBorders>
+              <w:top w:val="single" w:color="B7C4CC" w:sz="4"/>
+              <w:left w:val="single" w:color="B7C4CC" w:sz="4"/>
+              <w:bottom w:val="single" w:color="B7C4CC" w:sz="4"/>
+              <w:right w:val="single" w:color="B7C4CC" w:sz="4"/>
+            </w:tcBorders>
+            <w:shd w:fill="F4F8FA" w:color="auto" w:val="clear"/>
+            <w:tcMar>
+              <w:top w:type="dxa" w:w="60"/>
+              <w:left w:type="dxa" w:w="90"/>
+              <w:bottom w:type="dxa" w:w="60"/>
+              <w:right w:type="dxa" w:w="90"/>
+            </w:tcMar>
+          </w:tcPr>
+          <w:p>
+            <w:pPr>
+              <w:jc w:val="left"/>
+            </w:pPr>
+            <w:r>
+              <w:rPr>
+                <w:rFonts w:ascii="Arial" w:cs="Arial" w:eastAsia="Arial" w:hAnsi="Arial"/>
+                <w:sz w:val="18"/>
+                <w:szCs w:val="18"/>
+              </w:rPr>
+              <w:t xml:space="preserve">≈80–100 m³/soat (bug‘ qozoni 1 t/soat + quritgich gorelkasi)</w:t>
+            </w:r>
+          </w:p>
+        </w:tc>
+      </w:tr>
+      <w:tr>
+        <w:tc>
+          <w:tcPr>
+            <w:tcW w:type="dxa" w:w="2891"/>
+            <w:tcBorders>
+              <w:top w:val="single" w:color="B7C4CC" w:sz="4"/>
+              <w:left w:val="single" w:color="B7C4CC" w:sz="4"/>
+              <w:bottom w:val="single" w:color="B7C4CC" w:sz="4"/>
+              <w:right w:val="single" w:color="B7C4CC" w:sz="4"/>
+            </w:tcBorders>
+            <w:tcMar>
+              <w:top w:type="dxa" w:w="60"/>
+              <w:left w:type="dxa" w:w="90"/>
+              <w:bottom w:type="dxa" w:w="60"/>
+              <w:right w:type="dxa" w:w="90"/>
+            </w:tcMar>
+          </w:tcPr>
+          <w:p>
+            <w:pPr>
+              <w:jc w:val="left"/>
+            </w:pPr>
+            <w:r>
+              <w:rPr>
+                <w:rFonts w:ascii="Arial" w:cs="Arial" w:eastAsia="Arial" w:hAnsi="Arial"/>
+                <w:sz w:val="18"/>
+                <w:szCs w:val="18"/>
+              </w:rPr>
+              <w:t xml:space="preserve">Suv</w:t>
+            </w:r>
+          </w:p>
+        </w:tc>
+        <w:tc>
+          <w:tcPr>
+            <w:tcW w:type="dxa" w:w="6747"/>
+            <w:tcBorders>
+              <w:top w:val="single" w:color="B7C4CC" w:sz="4"/>
+              <w:left w:val="single" w:color="B7C4CC" w:sz="4"/>
+              <w:bottom w:val="single" w:color="B7C4CC" w:sz="4"/>
+              <w:right w:val="single" w:color="B7C4CC" w:sz="4"/>
+            </w:tcBorders>
+            <w:tcMar>
+              <w:top w:type="dxa" w:w="60"/>
+              <w:left w:type="dxa" w:w="90"/>
+              <w:bottom w:type="dxa" w:w="60"/>
+              <w:right w:type="dxa" w:w="90"/>
+            </w:tcMar>
+          </w:tcPr>
+          <w:p>
+            <w:pPr>
+              <w:jc w:val="left"/>
+            </w:pPr>
+            <w:r>
+              <w:rPr>
+                <w:rFonts w:ascii="Arial" w:cs="Arial" w:eastAsia="Arial" w:hAnsi="Arial"/>
+                <w:sz w:val="18"/>
+                <w:szCs w:val="18"/>
+              </w:rPr>
+              <w:t xml:space="preserve">≈30–50 m³/sutka; kanalizatsiyaga ulanish</w:t>
+            </w:r>
+          </w:p>
+        </w:tc>
+      </w:tr>
+      <w:tr>
+        <w:tc>
+          <w:tcPr>
+            <w:tcW w:type="dxa" w:w="2891"/>
+            <w:tcBorders>
+              <w:top w:val="single" w:color="B7C4CC" w:sz="4"/>
+              <w:left w:val="single" w:color="B7C4CC" w:sz="4"/>
+              <w:bottom w:val="single" w:color="B7C4CC" w:sz="4"/>
+              <w:right w:val="single" w:color="B7C4CC" w:sz="4"/>
+            </w:tcBorders>
+            <w:shd w:fill="F4F8FA" w:color="auto" w:val="clear"/>
+            <w:tcMar>
+              <w:top w:type="dxa" w:w="60"/>
+              <w:left w:type="dxa" w:w="90"/>
+              <w:bottom w:type="dxa" w:w="60"/>
+              <w:right w:type="dxa" w:w="90"/>
+            </w:tcMar>
+          </w:tcPr>
+          <w:p>
+            <w:pPr>
+              <w:jc w:val="left"/>
+            </w:pPr>
+            <w:r>
+              <w:rPr>
+                <w:rFonts w:ascii="Arial" w:cs="Arial" w:eastAsia="Arial" w:hAnsi="Arial"/>
+                <w:sz w:val="18"/>
+                <w:szCs w:val="18"/>
+              </w:rPr>
+              <w:t xml:space="preserve">Sanitariya himoya zonasi</w:t>
+            </w:r>
+          </w:p>
+        </w:tc>
+        <w:tc>
+          <w:tcPr>
+            <w:tcW w:type="dxa" w:w="6747"/>
+            <w:tcBorders>
+              <w:top w:val="single" w:color="B7C4CC" w:sz="4"/>
+              <w:left w:val="single" w:color="B7C4CC" w:sz="4"/>
+              <w:bottom w:val="single" w:color="B7C4CC" w:sz="4"/>
+              <w:right w:val="single" w:color="B7C4CC" w:sz="4"/>
+            </w:tcBorders>
+            <w:shd w:fill="F4F8FA" w:color="auto" w:val="clear"/>
+            <w:tcMar>
+              <w:top w:type="dxa" w:w="60"/>
+              <w:left w:type="dxa" w:w="90"/>
+              <w:bottom w:type="dxa" w:w="60"/>
+              <w:right w:type="dxa" w:w="90"/>
+            </w:tcMar>
+          </w:tcPr>
+          <w:p>
+            <w:pPr>
+              <w:jc w:val="left"/>
+            </w:pPr>
+            <w:r>
+              <w:rPr>
+                <w:rFonts w:ascii="Arial" w:cs="Arial" w:eastAsia="Arial" w:hAnsi="Arial"/>
+                <w:sz w:val="18"/>
+                <w:szCs w:val="18"/>
+              </w:rPr>
+              <w:t xml:space="preserve">Loyihada 300 m deb olingan (plastmassa ishlab chiqarish analogi); aniq kenglik sanitariya ekspertizasida belgilanadi</w:t>
+            </w:r>
+          </w:p>
+        </w:tc>
+      </w:tr>
+      <w:tr>
+        <w:tc>
+          <w:tcPr>
+            <w:tcW w:type="dxa" w:w="2891"/>
+            <w:tcBorders>
+              <w:top w:val="single" w:color="B7C4CC" w:sz="4"/>
+              <w:left w:val="single" w:color="B7C4CC" w:sz="4"/>
+              <w:bottom w:val="single" w:color="B7C4CC" w:sz="4"/>
+              <w:right w:val="single" w:color="B7C4CC" w:sz="4"/>
+            </w:tcBorders>
+            <w:tcMar>
+              <w:top w:type="dxa" w:w="60"/>
+              <w:left w:type="dxa" w:w="90"/>
+              <w:bottom w:type="dxa" w:w="60"/>
+              <w:right w:type="dxa" w:w="90"/>
+            </w:tcMar>
+          </w:tcPr>
+          <w:p>
+            <w:pPr>
+              <w:jc w:val="left"/>
+            </w:pPr>
+            <w:r>
+              <w:rPr>
+                <w:rFonts w:ascii="Arial" w:cs="Arial" w:eastAsia="Arial" w:hAnsi="Arial"/>
+                <w:sz w:val="18"/>
+                <w:szCs w:val="18"/>
+              </w:rPr>
+              <w:t xml:space="preserve">Yer olish</w:t>
+            </w:r>
+          </w:p>
+        </w:tc>
+        <w:tc>
+          <w:tcPr>
+            <w:tcW w:type="dxa" w:w="6747"/>
+            <w:tcBorders>
+              <w:top w:val="single" w:color="B7C4CC" w:sz="4"/>
+              <w:left w:val="single" w:color="B7C4CC" w:sz="4"/>
+              <w:bottom w:val="single" w:color="B7C4CC" w:sz="4"/>
+              <w:right w:val="single" w:color="B7C4CC" w:sz="4"/>
+            </w:tcBorders>
+            <w:tcMar>
+              <w:top w:type="dxa" w:w="60"/>
+              <w:left w:type="dxa" w:w="90"/>
+              <w:bottom w:type="dxa" w:w="60"/>
+              <w:right w:type="dxa" w:w="90"/>
+            </w:tcMar>
+          </w:tcPr>
+          <w:p>
+            <w:pPr>
+              <w:jc w:val="left"/>
+            </w:pPr>
+            <w:r>
+              <w:rPr>
+                <w:rFonts w:ascii="Arial" w:cs="Arial" w:eastAsia="Arial" w:hAnsi="Arial"/>
+                <w:sz w:val="18"/>
+                <w:szCs w:val="18"/>
+              </w:rPr>
+              <w:t xml:space="preserve">Texnopark/EIZ direksiyasiga ariza → ekspert kengashi → yer ijarasi → topografiya va geologiya → texnik shartlar → loyiha-smeta, ekologik va sanitariya ekspertizasi → qurilish ruxsatnomasi</w:t>
+            </w:r>
+          </w:p>
+        </w:tc>
+      </w:tr>
+    </w:tbl>
+    <w:p>
+      <w:pPr>
+        <w:spacing w:after="120"/>
+      </w:pPr>
+    </w:p>
+    <w:p>
+      <w:pPr>
+        <w:pStyle w:val="Heading2"/>
+        <w:spacing w:after="120" w:before="240"/>
+      </w:pPr>
+      <w:r>
+        <w:rPr>
+          <w:rFonts w:ascii="Arial" w:cs="Arial" w:eastAsia="Arial" w:hAnsi="Arial"/>
+        </w:rPr>
+        <w:t xml:space="preserve">7.5. Ijara yoki o‘z hududida qurish</w:t>
+      </w:r>
+    </w:p>
+    <w:p>
+      <w:pPr>
+        <w:spacing w:after="120" w:line="300"/>
+        <w:jc w:val="both"/>
+      </w:pPr>
+      <w:r>
+        <w:rPr>
+          <w:rFonts w:ascii="Arial" w:cs="Arial" w:eastAsia="Arial" w:hAnsi="Arial"/>
+        </w:rPr>
+        <w:t xml:space="preserve">Moliyaviy modelning asosiy ssenariysi (</w:t>
+      </w:r>
+      <w:r>
+        <w:rPr>
+          <w:rFonts w:ascii="Arial" w:cs="Arial" w:eastAsia="Arial" w:hAnsi="Arial"/>
+          <w:b/>
+          <w:bCs/>
+        </w:rPr>
+        <w:t xml:space="preserve">A variant</w:t>
+      </w:r>
+      <w:r>
+        <w:rPr>
+          <w:rFonts w:ascii="Arial" w:cs="Arial" w:eastAsia="Arial" w:hAnsi="Arial"/>
+        </w:rPr>
+        <w:t xml:space="preserve">) — texnopark yoki sanoat zonasida tayyor 1 500 m² binoni ijaraga olish ($72 ming/yil). Bosh reja esa </w:t>
+      </w:r>
+      <w:r>
+        <w:rPr>
+          <w:rFonts w:ascii="Arial" w:cs="Arial" w:eastAsia="Arial" w:hAnsi="Arial"/>
+          <w:b/>
+          <w:bCs/>
+        </w:rPr>
+        <w:t xml:space="preserve">B variant</w:t>
+      </w:r>
+      <w:r>
+        <w:rPr>
+          <w:rFonts w:ascii="Arial" w:cs="Arial" w:eastAsia="Arial" w:hAnsi="Arial"/>
+        </w:rPr>
+        <w:t xml:space="preserve"> — 1,8 ga yerda o‘z zavodini qurish uchun mo‘ljallangan maqsadli joylashuv. B variant uchun qo‘shimcha kapital xarajatlar taxminan quyidagicha:</w:t>
+      </w:r>
+    </w:p>
+    <w:tbl>
+      <w:tblPr>
+        <w:tblW w:type="dxa" w:w="9638"/>
+        <w:tblBorders>
+          <w:top w:val="single" w:color="auto" w:sz="4"/>
+          <w:left w:val="single" w:color="auto" w:sz="4"/>
+          <w:bottom w:val="single" w:color="auto" w:sz="4"/>
+          <w:right w:val="single" w:color="auto" w:sz="4"/>
+          <w:insideH w:val="single" w:color="auto" w:sz="4"/>
+          <w:insideV w:val="single" w:color="auto" w:sz="4"/>
+        </w:tblBorders>
+        <w:tblLayout w:type="fixed"/>
+      </w:tblPr>
+      <w:tblGrid>
+        <w:gridCol w:w="6746"/>
+        <w:gridCol w:w="2892"/>
+      </w:tblGrid>
+      <w:tr>
+        <w:trPr>
+          <w:tblHeader/>
+        </w:trPr>
+        <w:tc>
+          <w:tcPr>
+            <w:tcW w:type="dxa" w:w="6746"/>
+            <w:tcBorders>
+              <w:top w:val="single" w:color="B7C4CC" w:sz="4"/>
+              <w:left w:val="single" w:color="B7C4CC" w:sz="4"/>
+              <w:bottom w:val="single" w:color="B7C4CC" w:sz="4"/>
+              <w:right w:val="single" w:color="B7C4CC" w:sz="4"/>
+            </w:tcBorders>
+            <w:shd w:fill="1F6F5C" w:color="auto" w:val="clear"/>
+            <w:tcMar>
+              <w:top w:type="dxa" w:w="60"/>
+              <w:left w:type="dxa" w:w="90"/>
+              <w:bottom w:type="dxa" w:w="60"/>
+              <w:right w:type="dxa" w:w="90"/>
+            </w:tcMar>
+          </w:tcPr>
+          <w:p>
+            <w:pPr>
+              <w:jc w:val="left"/>
+            </w:pPr>
+            <w:r>
+              <w:rPr>
+                <w:rFonts w:ascii="Arial" w:cs="Arial" w:eastAsia="Arial" w:hAnsi="Arial"/>
+                <w:b/>
+                <w:bCs/>
+                <w:color w:val="FFFFFF"/>
+                <w:sz w:val="18"/>
+                <w:szCs w:val="18"/>
+              </w:rPr>
+              <w:t xml:space="preserve">B variant: qo‘shimcha qurilish xarajatlari (taxmin)</w:t>
+            </w:r>
+          </w:p>
+        </w:tc>
+        <w:tc>
+          <w:tcPr>
+            <w:tcW w:type="dxa" w:w="2892"/>
+            <w:tcBorders>
+              <w:top w:val="single" w:color="B7C4CC" w:sz="4"/>
+              <w:left w:val="single" w:color="B7C4CC" w:sz="4"/>
+              <w:bottom w:val="single" w:color="B7C4CC" w:sz="4"/>
+              <w:right w:val="single" w:color="B7C4CC" w:sz="4"/>
+            </w:tcBorders>
+            <w:shd w:fill="1F6F5C" w:color="auto" w:val="clear"/>
+            <w:tcMar>
+              <w:top w:type="dxa" w:w="60"/>
+              <w:left w:type="dxa" w:w="90"/>
+              <w:bottom w:type="dxa" w:w="60"/>
+              <w:right w:type="dxa" w:w="90"/>
+            </w:tcMar>
+          </w:tcPr>
+          <w:p>
+            <w:pPr>
+              <w:jc w:val="left"/>
+            </w:pPr>
+            <w:r>
+              <w:rPr>
+                <w:rFonts w:ascii="Arial" w:cs="Arial" w:eastAsia="Arial" w:hAnsi="Arial"/>
+                <w:b/>
+                <w:bCs/>
+                <w:color w:val="FFFFFF"/>
+                <w:sz w:val="18"/>
+                <w:szCs w:val="18"/>
+              </w:rPr>
+              <w:t xml:space="preserve">$</w:t>
+            </w:r>
+          </w:p>
+        </w:tc>
+      </w:tr>
+      <w:tr>
+        <w:tc>
+          <w:tcPr>
+            <w:tcW w:type="dxa" w:w="6746"/>
+            <w:tcBorders>
+              <w:top w:val="single" w:color="B7C4CC" w:sz="4"/>
+              <w:left w:val="single" w:color="B7C4CC" w:sz="4"/>
+              <w:bottom w:val="single" w:color="B7C4CC" w:sz="4"/>
+              <w:right w:val="single" w:color="B7C4CC" w:sz="4"/>
+            </w:tcBorders>
+            <w:tcMar>
+              <w:top w:type="dxa" w:w="60"/>
+              <w:left w:type="dxa" w:w="90"/>
+              <w:bottom w:type="dxa" w:w="60"/>
+              <w:right w:type="dxa" w:w="90"/>
+            </w:tcMar>
+          </w:tcPr>
+          <w:p>
+            <w:pPr>
+              <w:jc w:val="left"/>
+            </w:pPr>
+            <w:r>
+              <w:rPr>
+                <w:rFonts w:ascii="Arial" w:cs="Arial" w:eastAsia="Arial" w:hAnsi="Arial"/>
+                <w:sz w:val="18"/>
+                <w:szCs w:val="18"/>
+              </w:rPr>
+              <w:t xml:space="preserve">Ishlab chiqarish binosi, 1 512 m² × $250–350</w:t>
+            </w:r>
+          </w:p>
+        </w:tc>
+        <w:tc>
+          <w:tcPr>
+            <w:tcW w:type="dxa" w:w="2892"/>
+            <w:tcBorders>
+              <w:top w:val="single" w:color="B7C4CC" w:sz="4"/>
+              <w:left w:val="single" w:color="B7C4CC" w:sz="4"/>
+              <w:bottom w:val="single" w:color="B7C4CC" w:sz="4"/>
+              <w:right w:val="single" w:color="B7C4CC" w:sz="4"/>
+            </w:tcBorders>
+            <w:tcMar>
+              <w:top w:type="dxa" w:w="60"/>
+              <w:left w:type="dxa" w:w="90"/>
+              <w:bottom w:type="dxa" w:w="60"/>
+              <w:right w:type="dxa" w:w="90"/>
+            </w:tcMar>
+          </w:tcPr>
+          <w:p>
+            <w:pPr>
+              <w:jc w:val="right"/>
+            </w:pPr>
+            <w:r>
+              <w:rPr>
+                <w:rFonts w:ascii="Arial" w:cs="Arial" w:eastAsia="Arial" w:hAnsi="Arial"/>
+                <w:sz w:val="18"/>
+                <w:szCs w:val="18"/>
+              </w:rPr>
+              <w:t xml:space="preserve">380–530 ming</w:t>
+            </w:r>
+          </w:p>
+        </w:tc>
+      </w:tr>
+      <w:tr>
+        <w:tc>
+          <w:tcPr>
+            <w:tcW w:type="dxa" w:w="6746"/>
+            <w:tcBorders>
+              <w:top w:val="single" w:color="B7C4CC" w:sz="4"/>
+              <w:left w:val="single" w:color="B7C4CC" w:sz="4"/>
+              <w:bottom w:val="single" w:color="B7C4CC" w:sz="4"/>
+              <w:right w:val="single" w:color="B7C4CC" w:sz="4"/>
+            </w:tcBorders>
+            <w:shd w:fill="F4F8FA" w:color="auto" w:val="clear"/>
+            <w:tcMar>
+              <w:top w:type="dxa" w:w="60"/>
+              <w:left w:type="dxa" w:w="90"/>
+              <w:bottom w:type="dxa" w:w="60"/>
+              <w:right w:type="dxa" w:w="90"/>
+            </w:tcMar>
+          </w:tcPr>
+          <w:p>
+            <w:pPr>
+              <w:jc w:val="left"/>
+            </w:pPr>
+            <w:r>
+              <w:rPr>
+                <w:rFonts w:ascii="Arial" w:cs="Arial" w:eastAsia="Arial" w:hAnsi="Arial"/>
+                <w:sz w:val="18"/>
+                <w:szCs w:val="18"/>
+              </w:rPr>
+              <w:t xml:space="preserve">Ombor, 648 m² × $180–250</w:t>
+            </w:r>
+          </w:p>
+        </w:tc>
+        <w:tc>
+          <w:tcPr>
+            <w:tcW w:type="dxa" w:w="2892"/>
+            <w:tcBorders>
+              <w:top w:val="single" w:color="B7C4CC" w:sz="4"/>
+              <w:left w:val="single" w:color="B7C4CC" w:sz="4"/>
+              <w:bottom w:val="single" w:color="B7C4CC" w:sz="4"/>
+              <w:right w:val="single" w:color="B7C4CC" w:sz="4"/>
+            </w:tcBorders>
+            <w:shd w:fill="F4F8FA" w:color="auto" w:val="clear"/>
+            <w:tcMar>
+              <w:top w:type="dxa" w:w="60"/>
+              <w:left w:type="dxa" w:w="90"/>
+              <w:bottom w:type="dxa" w:w="60"/>
+              <w:right w:type="dxa" w:w="90"/>
+            </w:tcMar>
+          </w:tcPr>
+          <w:p>
+            <w:pPr>
+              <w:jc w:val="right"/>
+            </w:pPr>
+            <w:r>
+              <w:rPr>
+                <w:rFonts w:ascii="Arial" w:cs="Arial" w:eastAsia="Arial" w:hAnsi="Arial"/>
+                <w:sz w:val="18"/>
+                <w:szCs w:val="18"/>
+              </w:rPr>
+              <w:t xml:space="preserve">120–160 ming</w:t>
+            </w:r>
+          </w:p>
+        </w:tc>
+      </w:tr>
+      <w:tr>
+        <w:tc>
+          <w:tcPr>
+            <w:tcW w:type="dxa" w:w="6746"/>
+            <w:tcBorders>
+              <w:top w:val="single" w:color="B7C4CC" w:sz="4"/>
+              <w:left w:val="single" w:color="B7C4CC" w:sz="4"/>
+              <w:bottom w:val="single" w:color="B7C4CC" w:sz="4"/>
+              <w:right w:val="single" w:color="B7C4CC" w:sz="4"/>
+            </w:tcBorders>
+            <w:tcMar>
+              <w:top w:type="dxa" w:w="60"/>
+              <w:left w:type="dxa" w:w="90"/>
+              <w:bottom w:type="dxa" w:w="60"/>
+              <w:right w:type="dxa" w:w="90"/>
+            </w:tcMar>
+          </w:tcPr>
+          <w:p>
+            <w:pPr>
+              <w:jc w:val="left"/>
+            </w:pPr>
+            <w:r>
+              <w:rPr>
+                <w:rFonts w:ascii="Arial" w:cs="Arial" w:eastAsia="Arial" w:hAnsi="Arial"/>
+                <w:sz w:val="18"/>
+                <w:szCs w:val="18"/>
+              </w:rPr>
+              <w:t xml:space="preserve">Ma’muriy-maishiy bino, 720 m² × $300–400</w:t>
+            </w:r>
+          </w:p>
+        </w:tc>
+        <w:tc>
+          <w:tcPr>
+            <w:tcW w:type="dxa" w:w="2892"/>
+            <w:tcBorders>
+              <w:top w:val="single" w:color="B7C4CC" w:sz="4"/>
+              <w:left w:val="single" w:color="B7C4CC" w:sz="4"/>
+              <w:bottom w:val="single" w:color="B7C4CC" w:sz="4"/>
+              <w:right w:val="single" w:color="B7C4CC" w:sz="4"/>
+            </w:tcBorders>
+            <w:tcMar>
+              <w:top w:type="dxa" w:w="60"/>
+              <w:left w:type="dxa" w:w="90"/>
+              <w:bottom w:type="dxa" w:w="60"/>
+              <w:right w:type="dxa" w:w="90"/>
+            </w:tcMar>
+          </w:tcPr>
+          <w:p>
+            <w:pPr>
+              <w:jc w:val="right"/>
+            </w:pPr>
+            <w:r>
+              <w:rPr>
+                <w:rFonts w:ascii="Arial" w:cs="Arial" w:eastAsia="Arial" w:hAnsi="Arial"/>
+                <w:sz w:val="18"/>
+                <w:szCs w:val="18"/>
+              </w:rPr>
+              <w:t xml:space="preserve">220–290 ming</w:t>
+            </w:r>
+          </w:p>
+        </w:tc>
+      </w:tr>
+      <w:tr>
+        <w:tc>
+          <w:tcPr>
+            <w:tcW w:type="dxa" w:w="6746"/>
+            <w:tcBorders>
+              <w:top w:val="single" w:color="B7C4CC" w:sz="4"/>
+              <w:left w:val="single" w:color="B7C4CC" w:sz="4"/>
+              <w:bottom w:val="single" w:color="B7C4CC" w:sz="4"/>
+              <w:right w:val="single" w:color="B7C4CC" w:sz="4"/>
+            </w:tcBorders>
+            <w:shd w:fill="F4F8FA" w:color="auto" w:val="clear"/>
+            <w:tcMar>
+              <w:top w:type="dxa" w:w="60"/>
+              <w:left w:type="dxa" w:w="90"/>
+              <w:bottom w:type="dxa" w:w="60"/>
+              <w:right w:type="dxa" w:w="90"/>
+            </w:tcMar>
+          </w:tcPr>
+          <w:p>
+            <w:pPr>
+              <w:jc w:val="left"/>
+            </w:pPr>
+            <w:r>
+              <w:rPr>
+                <w:rFonts w:ascii="Arial" w:cs="Arial" w:eastAsia="Arial" w:hAnsi="Arial"/>
+                <w:sz w:val="18"/>
+                <w:szCs w:val="18"/>
+              </w:rPr>
+              <w:t xml:space="preserve">Yo‘llar va maydonchalar, 4 520 m² × $20–30</w:t>
+            </w:r>
+          </w:p>
+        </w:tc>
+        <w:tc>
+          <w:tcPr>
+            <w:tcW w:type="dxa" w:w="2892"/>
+            <w:tcBorders>
+              <w:top w:val="single" w:color="B7C4CC" w:sz="4"/>
+              <w:left w:val="single" w:color="B7C4CC" w:sz="4"/>
+              <w:bottom w:val="single" w:color="B7C4CC" w:sz="4"/>
+              <w:right w:val="single" w:color="B7C4CC" w:sz="4"/>
+            </w:tcBorders>
+            <w:shd w:fill="F4F8FA" w:color="auto" w:val="clear"/>
+            <w:tcMar>
+              <w:top w:type="dxa" w:w="60"/>
+              <w:left w:type="dxa" w:w="90"/>
+              <w:bottom w:type="dxa" w:w="60"/>
+              <w:right w:type="dxa" w:w="90"/>
+            </w:tcMar>
+          </w:tcPr>
+          <w:p>
+            <w:pPr>
+              <w:jc w:val="right"/>
+            </w:pPr>
+            <w:r>
+              <w:rPr>
+                <w:rFonts w:ascii="Arial" w:cs="Arial" w:eastAsia="Arial" w:hAnsi="Arial"/>
+                <w:sz w:val="18"/>
+                <w:szCs w:val="18"/>
+              </w:rPr>
+              <w:t xml:space="preserve">90–135 ming</w:t>
+            </w:r>
+          </w:p>
+        </w:tc>
+      </w:tr>
+      <w:tr>
+        <w:tc>
+          <w:tcPr>
+            <w:tcW w:type="dxa" w:w="6746"/>
+            <w:tcBorders>
+              <w:top w:val="single" w:color="B7C4CC" w:sz="4"/>
+              <w:left w:val="single" w:color="B7C4CC" w:sz="4"/>
+              <w:bottom w:val="single" w:color="B7C4CC" w:sz="4"/>
+              <w:right w:val="single" w:color="B7C4CC" w:sz="4"/>
+            </w:tcBorders>
+            <w:tcMar>
+              <w:top w:type="dxa" w:w="60"/>
+              <w:left w:type="dxa" w:w="90"/>
+              <w:bottom w:type="dxa" w:w="60"/>
+              <w:right w:type="dxa" w:w="90"/>
+            </w:tcMar>
+          </w:tcPr>
+          <w:p>
+            <w:pPr>
+              <w:jc w:val="left"/>
+            </w:pPr>
+            <w:r>
+              <w:rPr>
+                <w:rFonts w:ascii="Arial" w:cs="Arial" w:eastAsia="Arial" w:hAnsi="Arial"/>
+                <w:sz w:val="18"/>
+                <w:szCs w:val="18"/>
+              </w:rPr>
+              <w:t xml:space="preserve">To‘siq, KPP, avtotarozi</w:t>
+            </w:r>
+          </w:p>
+        </w:tc>
+        <w:tc>
+          <w:tcPr>
+            <w:tcW w:type="dxa" w:w="2892"/>
+            <w:tcBorders>
+              <w:top w:val="single" w:color="B7C4CC" w:sz="4"/>
+              <w:left w:val="single" w:color="B7C4CC" w:sz="4"/>
+              <w:bottom w:val="single" w:color="B7C4CC" w:sz="4"/>
+              <w:right w:val="single" w:color="B7C4CC" w:sz="4"/>
+            </w:tcBorders>
+            <w:tcMar>
+              <w:top w:type="dxa" w:w="60"/>
+              <w:left w:type="dxa" w:w="90"/>
+              <w:bottom w:type="dxa" w:w="60"/>
+              <w:right w:type="dxa" w:w="90"/>
+            </w:tcMar>
+          </w:tcPr>
+          <w:p>
+            <w:pPr>
+              <w:jc w:val="right"/>
+            </w:pPr>
+            <w:r>
+              <w:rPr>
+                <w:rFonts w:ascii="Arial" w:cs="Arial" w:eastAsia="Arial" w:hAnsi="Arial"/>
+                <w:sz w:val="18"/>
+                <w:szCs w:val="18"/>
+              </w:rPr>
+              <w:t xml:space="preserve">50–70 ming</w:t>
+            </w:r>
+          </w:p>
+        </w:tc>
+      </w:tr>
+      <w:tr>
+        <w:tc>
+          <w:tcPr>
+            <w:tcW w:type="dxa" w:w="6746"/>
+            <w:tcBorders>
+              <w:top w:val="single" w:color="B7C4CC" w:sz="4"/>
+              <w:left w:val="single" w:color="B7C4CC" w:sz="4"/>
+              <w:bottom w:val="single" w:color="B7C4CC" w:sz="4"/>
+              <w:right w:val="single" w:color="B7C4CC" w:sz="4"/>
+            </w:tcBorders>
+            <w:shd w:fill="F4F8FA" w:color="auto" w:val="clear"/>
+            <w:tcMar>
+              <w:top w:type="dxa" w:w="60"/>
+              <w:left w:type="dxa" w:w="90"/>
+              <w:bottom w:type="dxa" w:w="60"/>
+              <w:right w:type="dxa" w:w="90"/>
+            </w:tcMar>
+          </w:tcPr>
+          <w:p>
+            <w:pPr>
+              <w:jc w:val="left"/>
+            </w:pPr>
+            <w:r>
+              <w:rPr>
+                <w:rFonts w:ascii="Arial" w:cs="Arial" w:eastAsia="Arial" w:hAnsi="Arial"/>
+                <w:sz w:val="18"/>
+                <w:szCs w:val="18"/>
+              </w:rPr>
+              <w:t xml:space="preserve">Tashqi tarmoqlar: KTP va generator, gaz, suv, kanalizatsiya, yong‘in suvi</w:t>
+            </w:r>
+          </w:p>
+        </w:tc>
+        <w:tc>
+          <w:tcPr>
+            <w:tcW w:type="dxa" w:w="2892"/>
+            <w:tcBorders>
+              <w:top w:val="single" w:color="B7C4CC" w:sz="4"/>
+              <w:left w:val="single" w:color="B7C4CC" w:sz="4"/>
+              <w:bottom w:val="single" w:color="B7C4CC" w:sz="4"/>
+              <w:right w:val="single" w:color="B7C4CC" w:sz="4"/>
+            </w:tcBorders>
+            <w:shd w:fill="F4F8FA" w:color="auto" w:val="clear"/>
+            <w:tcMar>
+              <w:top w:type="dxa" w:w="60"/>
+              <w:left w:type="dxa" w:w="90"/>
+              <w:bottom w:type="dxa" w:w="60"/>
+              <w:right w:type="dxa" w:w="90"/>
+            </w:tcMar>
+          </w:tcPr>
+          <w:p>
+            <w:pPr>
+              <w:jc w:val="right"/>
+            </w:pPr>
+            <w:r>
+              <w:rPr>
+                <w:rFonts w:ascii="Arial" w:cs="Arial" w:eastAsia="Arial" w:hAnsi="Arial"/>
+                <w:sz w:val="18"/>
+                <w:szCs w:val="18"/>
+              </w:rPr>
+              <w:t xml:space="preserve">180–250 ming</w:t>
+            </w:r>
+          </w:p>
+        </w:tc>
+      </w:tr>
+      <w:tr>
+        <w:tc>
+          <w:tcPr>
+            <w:tcW w:type="dxa" w:w="6746"/>
+            <w:tcBorders>
+              <w:top w:val="single" w:color="B7C4CC" w:sz="4"/>
+              <w:left w:val="single" w:color="B7C4CC" w:sz="4"/>
+              <w:bottom w:val="single" w:color="B7C4CC" w:sz="4"/>
+              <w:right w:val="single" w:color="B7C4CC" w:sz="4"/>
+            </w:tcBorders>
+            <w:tcMar>
+              <w:top w:type="dxa" w:w="60"/>
+              <w:left w:type="dxa" w:w="90"/>
+              <w:bottom w:type="dxa" w:w="60"/>
+              <w:right w:type="dxa" w:w="90"/>
+            </w:tcMar>
+          </w:tcPr>
+          <w:p>
+            <w:pPr>
+              <w:jc w:val="left"/>
+            </w:pPr>
+            <w:r>
+              <w:rPr>
+                <w:rFonts w:ascii="Arial" w:cs="Arial" w:eastAsia="Arial" w:hAnsi="Arial"/>
+                <w:sz w:val="18"/>
+                <w:szCs w:val="18"/>
+              </w:rPr>
+              <w:t xml:space="preserve">Loyihalash va ekspertizalar</w:t>
+            </w:r>
+          </w:p>
+        </w:tc>
+        <w:tc>
+          <w:tcPr>
+            <w:tcW w:type="dxa" w:w="2892"/>
+            <w:tcBorders>
+              <w:top w:val="single" w:color="B7C4CC" w:sz="4"/>
+              <w:left w:val="single" w:color="B7C4CC" w:sz="4"/>
+              <w:bottom w:val="single" w:color="B7C4CC" w:sz="4"/>
+              <w:right w:val="single" w:color="B7C4CC" w:sz="4"/>
+            </w:tcBorders>
+            <w:tcMar>
+              <w:top w:type="dxa" w:w="60"/>
+              <w:left w:type="dxa" w:w="90"/>
+              <w:bottom w:type="dxa" w:w="60"/>
+              <w:right w:type="dxa" w:w="90"/>
+            </w:tcMar>
+          </w:tcPr>
+          <w:p>
+            <w:pPr>
+              <w:jc w:val="right"/>
+            </w:pPr>
+            <w:r>
+              <w:rPr>
+                <w:rFonts w:ascii="Arial" w:cs="Arial" w:eastAsia="Arial" w:hAnsi="Arial"/>
+                <w:sz w:val="18"/>
+                <w:szCs w:val="18"/>
+              </w:rPr>
+              <w:t xml:space="preserve">40–60 ming</w:t>
+            </w:r>
+          </w:p>
+        </w:tc>
+      </w:tr>
+      <w:tr>
+        <w:tc>
+          <w:tcPr>
+            <w:tcW w:type="dxa" w:w="6746"/>
+            <w:tcBorders>
+              <w:top w:val="single" w:color="B7C4CC" w:sz="4"/>
+              <w:left w:val="single" w:color="B7C4CC" w:sz="4"/>
+              <w:bottom w:val="single" w:color="B7C4CC" w:sz="4"/>
+              <w:right w:val="single" w:color="B7C4CC" w:sz="4"/>
+            </w:tcBorders>
+            <w:shd w:fill="D9EAD3" w:color="auto" w:val="clear"/>
+            <w:tcMar>
+              <w:top w:type="dxa" w:w="60"/>
+              <w:left w:type="dxa" w:w="90"/>
+              <w:bottom w:type="dxa" w:w="60"/>
+              <w:right w:type="dxa" w:w="90"/>
+            </w:tcMar>
+          </w:tcPr>
+          <w:p>
+            <w:pPr>
+              <w:jc w:val="left"/>
+            </w:pPr>
+            <w:r>
+              <w:rPr>
+                <w:rFonts w:ascii="Arial" w:cs="Arial" w:eastAsia="Arial" w:hAnsi="Arial"/>
+                <w:b/>
+                <w:bCs/>
+                <w:sz w:val="18"/>
+                <w:szCs w:val="18"/>
+              </w:rPr>
+              <w:t xml:space="preserve">Jami qo‘shimcha</w:t>
+            </w:r>
+          </w:p>
+        </w:tc>
+        <w:tc>
+          <w:tcPr>
+            <w:tcW w:type="dxa" w:w="2892"/>
+            <w:tcBorders>
+              <w:top w:val="single" w:color="B7C4CC" w:sz="4"/>
+              <w:left w:val="single" w:color="B7C4CC" w:sz="4"/>
+              <w:bottom w:val="single" w:color="B7C4CC" w:sz="4"/>
+              <w:right w:val="single" w:color="B7C4CC" w:sz="4"/>
+            </w:tcBorders>
+            <w:shd w:fill="D9EAD3" w:color="auto" w:val="clear"/>
+            <w:tcMar>
+              <w:top w:type="dxa" w:w="60"/>
+              <w:left w:type="dxa" w:w="90"/>
+              <w:bottom w:type="dxa" w:w="60"/>
+              <w:right w:type="dxa" w:w="90"/>
+            </w:tcMar>
+          </w:tcPr>
+          <w:p>
+            <w:pPr>
+              <w:jc w:val="right"/>
+            </w:pPr>
+            <w:r>
+              <w:rPr>
+                <w:rFonts w:ascii="Arial" w:cs="Arial" w:eastAsia="Arial" w:hAnsi="Arial"/>
+                <w:b/>
+                <w:bCs/>
+                <w:sz w:val="18"/>
+                <w:szCs w:val="18"/>
+              </w:rPr>
+              <w:t xml:space="preserve">≈ 1,1–1,5 mln</w:t>
+            </w:r>
+          </w:p>
+        </w:tc>
+      </w:tr>
+    </w:tbl>
+    <w:p>
+      <w:pPr>
+        <w:spacing w:after="120"/>
+      </w:pPr>
+    </w:p>
+    <w:p>
+      <w:pPr>
+        <w:spacing w:after="120" w:line="300"/>
+        <w:jc w:val="both"/>
+      </w:pPr>
+      <w:r>
+        <w:rPr>
+          <w:rFonts w:ascii="Arial" w:cs="Arial" w:eastAsia="Arial" w:hAnsi="Arial"/>
+        </w:rPr>
+        <w:t xml:space="preserve">Tavsiya: 1–2-fazada </w:t>
+      </w:r>
+      <w:r>
+        <w:rPr>
+          <w:rFonts w:ascii="Arial" w:cs="Arial" w:eastAsia="Arial" w:hAnsi="Arial"/>
+          <w:b/>
+          <w:bCs/>
+        </w:rPr>
+        <w:t xml:space="preserve">A variant</w:t>
+      </w:r>
+      <w:r>
+        <w:rPr>
+          <w:rFonts w:ascii="Arial" w:cs="Arial" w:eastAsia="Arial" w:hAnsi="Arial"/>
+        </w:rPr>
+        <w:t xml:space="preserve"> (ijara) — investitsiya kam, ishga tushish tez. O‘z hududiga (B variant) 3-faza boshlanganda yoki strategik investor qurilishni moliyalashtirganda o‘tiladi. Yuqoridagi narxlar mahalliy smeta bilan aniqlanishi kerak.</w:t>
+      </w:r>
+    </w:p>
+    <w:p>
+      <w:pPr>
+        <w:pStyle w:val="Heading2"/>
+        <w:spacing w:after="120" w:before="240"/>
+      </w:pPr>
+      <w:r>
+        <w:rPr>
+          <w:rFonts w:ascii="Arial" w:cs="Arial" w:eastAsia="Arial" w:hAnsi="Arial"/>
+        </w:rPr>
+        <w:t xml:space="preserve">7.6. Xodimlar</w:t>
       </w:r>
     </w:p>
     <w:tbl>
@@ -20379,7 +24032,7 @@
                     </pic:cNvPicPr>
                   </pic:nvPicPr>
                   <pic:blipFill>
-                    <a:blip r:embed="rId9" cstate="none"/>
+                    <a:blip r:embed="rId10" cstate="none"/>
                     <a:srcRect/>
                     <a:stretch>
                       <a:fillRect/>
@@ -23919,7 +27572,7 @@
                     </pic:cNvPicPr>
                   </pic:nvPicPr>
                   <pic:blipFill>
-                    <a:blip r:embed="rId10" cstate="none"/>
+                    <a:blip r:embed="rId11" cstate="none"/>
                     <a:srcRect/>
                     <a:stretch>
                       <a:fillRect/>
@@ -23982,7 +27635,7 @@
                     </pic:cNvPicPr>
                   </pic:nvPicPr>
                   <pic:blipFill>
-                    <a:blip r:embed="rId11" cstate="none"/>
+                    <a:blip r:embed="rId12" cstate="none"/>
                     <a:srcRect/>
                     <a:stretch>
                       <a:fillRect/>
@@ -28672,7 +32325,7 @@
         </w:rPr>
         <w:t xml:space="preserve">OECD Global Plastics Outlook (2022) bo‘yicha AFP xabari — </w:t>
       </w:r>
-      <w:hyperlink w:history="1" r:id="rIdlsymuzhwtse0mhdeajlvz">
+      <w:hyperlink w:history="1" r:id="rIdw8gj-yhidq2awauxhrqjk">
         <w:r>
           <w:rPr>
             <w:rStyle w:val="Hyperlink"/>
@@ -28697,7 +32350,7 @@
         </w:rPr>
         <w:t xml:space="preserve">Kun.uz — O‘zbekiston 2027-yildan paketlarni taqiqlashni rejalashtirmoqda (10.01.2025) — </w:t>
       </w:r>
-      <w:hyperlink w:history="1" r:id="rIdumeej2itpcqbcszhkqn5u">
+      <w:hyperlink w:history="1" r:id="rIdd6eqxs3hufqgy7xl7meal">
         <w:r>
           <w:rPr>
             <w:rStyle w:val="Hyperlink"/>
@@ -28722,7 +32375,7 @@
         </w:rPr>
         <w:t xml:space="preserve">Gazeta.uz — plastik paketlar bo‘yicha dastur loyihasi (11.01.2025) — </w:t>
       </w:r>
-      <w:hyperlink w:history="1" r:id="rIdi4frcieorznckqf8bplmp">
+      <w:hyperlink w:history="1" r:id="rIddlzgmqms-ctdfbv71aj5v">
         <w:r>
           <w:rPr>
             <w:rStyle w:val="Hyperlink"/>
@@ -28747,7 +32400,7 @@
         </w:rPr>
         <w:t xml:space="preserve">Kun.uz — elektr va gaz tariflari 1-iyundan (15.05.2026) — </w:t>
       </w:r>
-      <w:hyperlink w:history="1" r:id="rIdwdnzluhocrgrty8wyzgj6">
+      <w:hyperlink w:history="1" r:id="rIdxde5ygdjphqhko83iov-7">
         <w:r>
           <w:rPr>
             <w:rStyle w:val="Hyperlink"/>
@@ -28772,7 +32425,7 @@
         </w:rPr>
         <w:t xml:space="preserve">Interfax — tariflar oshishi (15.05.2026) — </w:t>
       </w:r>
-      <w:hyperlink w:history="1" r:id="rIdrz7_g_3dwzi-nyodrxg5u">
+      <w:hyperlink w:history="1" r:id="rId5upqt4fj0pgz6awoygaml">
         <w:r>
           <w:rPr>
             <w:rStyle w:val="Hyperlink"/>
@@ -28797,7 +32450,7 @@
         </w:rPr>
         <w:t xml:space="preserve">Zamin.uz — valyuta kurslari, 22.10.2026 — </w:t>
       </w:r>
-      <w:hyperlink w:history="1" r:id="rIdbvvwb3hug_r0tgwyvyrce">
+      <w:hyperlink w:history="1" r:id="rIdrbtdulxleach9jycxqiel">
         <w:r>
           <w:rPr>
             <w:rStyle w:val="Hyperlink"/>
@@ -28822,7 +32475,7 @@
         </w:rPr>
         <w:t xml:space="preserve">IMARC — PHA narx indeksi — </w:t>
       </w:r>
-      <w:hyperlink w:history="1" r:id="rIdupq01jp8fcvt4mkkj7j7d">
+      <w:hyperlink w:history="1" r:id="rIdbksj6nwdnwr0adfvphomj">
         <w:r>
           <w:rPr>
             <w:rStyle w:val="Hyperlink"/>
@@ -28847,7 +32500,7 @@
         </w:rPr>
         <w:t xml:space="preserve">Mordor Intelligence — PHA bozori — </w:t>
       </w:r>
-      <w:hyperlink w:history="1" r:id="rIdu3bqp4houapmjtksmy5o7">
+      <w:hyperlink w:history="1" r:id="rId46wesznp9ua0dw_wo-thq">
         <w:r>
           <w:rPr>
             <w:rStyle w:val="Hyperlink"/>
@@ -28872,7 +32525,7 @@
         </w:rPr>
         <w:t xml:space="preserve">Intratec — PLA narxlari — </w:t>
       </w:r>
-      <w:hyperlink w:history="1" r:id="rIdonkl8wkefkrxr77witfcv">
+      <w:hyperlink w:history="1" r:id="rIdfnee9y_8m7auvupqc69jz">
         <w:r>
           <w:rPr>
             <w:rStyle w:val="Hyperlink"/>
@@ -28897,7 +32550,7 @@
         </w:rPr>
         <w:t xml:space="preserve">CICC — PBAT narxi (Longbridge) — </w:t>
       </w:r>
-      <w:hyperlink w:history="1" r:id="rIdmhsh4-ozjaupujzsg-28i">
+      <w:hyperlink w:history="1" r:id="rIdzhwfx94iajxhe2ghi7m1o">
         <w:r>
           <w:rPr>
             <w:rStyle w:val="Hyperlink"/>
@@ -28922,7 +32575,7 @@
         </w:rPr>
         <w:t xml:space="preserve">DSMZ — Cupriavidus necator H16 (DSM 428) — </w:t>
       </w:r>
-      <w:hyperlink w:history="1" r:id="rIdevitksmpmrzoicmg4fppn">
+      <w:hyperlink w:history="1" r:id="rId7nee_p6vp9kkfiv8z8gud">
         <w:r>
           <w:rPr>
             <w:rStyle w:val="Hyperlink"/>
@@ -28947,7 +32600,7 @@
         </w:rPr>
         <w:t xml:space="preserve">Frontiers in Bioeng. &amp; Biotech. (2022) — C. necator dan PHB olish sharhi — </w:t>
       </w:r>
-      <w:hyperlink w:history="1" r:id="rId6kto_wifb1z_o_h5l5dki">
+      <w:hyperlink w:history="1" r:id="rIdv8tzjysjlkrthmawk6h7k">
         <w:r>
           <w:rPr>
             <w:rStyle w:val="Hyperlink"/>
@@ -28972,7 +32625,7 @@
         </w:rPr>
         <w:t xml:space="preserve">nova-institute — biologik parchalanish sertifikatlari sharhi — </w:t>
       </w:r>
-      <w:hyperlink w:history="1" r:id="rIdgmo8skylysgt_edypp8ti">
+      <w:hyperlink w:history="1" r:id="rIdvug_nar_hcyf2v2nsjxya">
         <w:r>
           <w:rPr>
             <w:rStyle w:val="Hyperlink"/>
@@ -28997,7 +32650,7 @@
         </w:rPr>
         <w:t xml:space="preserve">TÜV AUSTRIA — Green Marks (OK compost) — </w:t>
       </w:r>
-      <w:hyperlink w:history="1" r:id="rIddcteglbp4n8c7mjjbocxb">
+      <w:hyperlink w:history="1" r:id="rIddgobfw2cetpzrrtdnadzd">
         <w:r>
           <w:rPr>
             <w:rStyle w:val="Hyperlink"/>
@@ -29022,7 +32675,7 @@
         </w:rPr>
         <w:t xml:space="preserve">WageIndicator — O‘zbekistonda eng kam ish haqi — </w:t>
       </w:r>
-      <w:hyperlink w:history="1" r:id="rIdxe0ifoyt26iwla3tys8bx">
+      <w:hyperlink w:history="1" r:id="rIdasjnitpot1ycwck_mjfb4">
         <w:r>
           <w:rPr>
             <w:rStyle w:val="Hyperlink"/>
@@ -29045,9 +32698,84 @@
         <w:rPr>
           <w:rFonts w:ascii="Arial" w:cs="Arial" w:eastAsia="Arial" w:hAnsi="Arial"/>
         </w:rPr>
+        <w:t xml:space="preserve">Kun.uz — Chirchiqda kimyo-industrial texnoparki tashkil etiladi (2022) — </w:t>
+      </w:r>
+      <w:hyperlink w:history="1" r:id="rIdi-5tx5osmlz7injy5fps9">
+        <w:r>
+          <w:rPr>
+            <w:rStyle w:val="Hyperlink"/>
+            <w:rFonts w:ascii="Arial" w:cs="Arial" w:eastAsia="Arial" w:hAnsi="Arial"/>
+          </w:rPr>
+          <w:t xml:space="preserve">https://kun.uz/news/2022/02/08/chirchiqda-kimyo-industrial-texnoparki-tashkil-etiladi</w:t>
+        </w:r>
+      </w:hyperlink>
+    </w:p>
+    <w:p>
+      <w:pPr>
+        <w:pStyle w:val="ListParagraph"/>
+        <w:numPr>
+          <w:ilvl w:val="0"/>
+          <w:numId w:val="2"/>
+        </w:numPr>
+        <w:spacing w:after="40"/>
+      </w:pPr>
+      <w:r>
+        <w:rPr>
+          <w:rFonts w:ascii="Arial" w:cs="Arial" w:eastAsia="Arial" w:hAnsi="Arial"/>
+        </w:rPr>
+        <w:t xml:space="preserve">UzA — «Qo‘qon» EIZ hududi kengaytiriladi (2024) — </w:t>
+      </w:r>
+      <w:hyperlink w:history="1" r:id="rIdshzqaq78m0phw-1cqol8m">
+        <w:r>
+          <w:rPr>
+            <w:rStyle w:val="Hyperlink"/>
+            <w:rFonts w:ascii="Arial" w:cs="Arial" w:eastAsia="Arial" w:hAnsi="Arial"/>
+          </w:rPr>
+          <w:t xml:space="preserve">https://uza.uz/posts/614860</w:t>
+        </w:r>
+      </w:hyperlink>
+    </w:p>
+    <w:p>
+      <w:pPr>
+        <w:pStyle w:val="ListParagraph"/>
+        <w:numPr>
+          <w:ilvl w:val="0"/>
+          <w:numId w:val="2"/>
+        </w:numPr>
+        <w:spacing w:after="40"/>
+      </w:pPr>
+      <w:r>
+        <w:rPr>
+          <w:rFonts w:ascii="Arial" w:cs="Arial" w:eastAsia="Arial" w:hAnsi="Arial"/>
+        </w:rPr>
+        <w:t xml:space="preserve">Kun.uz — Toshkent yog‘-moy kombinati tugatildi (2026) — </w:t>
+      </w:r>
+      <w:hyperlink w:history="1" r:id="rIdcoyeox4xknr_eye2dbqfp">
+        <w:r>
+          <w:rPr>
+            <w:rStyle w:val="Hyperlink"/>
+            <w:rFonts w:ascii="Arial" w:cs="Arial" w:eastAsia="Arial" w:hAnsi="Arial"/>
+          </w:rPr>
+          <w:t xml:space="preserve">https://kun.uz/news/2026/04/20/10-mlrd-qarzi-bilan-tugatilgan-zavod-toshkent-yog-moy-kombinatining-ishchilari-chorasiz-qoldirildi</w:t>
+        </w:r>
+      </w:hyperlink>
+    </w:p>
+    <w:p>
+      <w:pPr>
+        <w:pStyle w:val="ListParagraph"/>
+        <w:numPr>
+          <w:ilvl w:val="0"/>
+          <w:numId w:val="2"/>
+        </w:numPr>
+        <w:spacing w:after="40"/>
+      </w:pPr>
+      <w:r>
+        <w:rPr>
+          <w:rFonts w:ascii="Arial" w:cs="Arial" w:eastAsia="Arial" w:hAnsi="Arial"/>
+        </w:rPr>
         <w:t xml:space="preserve">Kun.uz — o‘rtacha ish haqi 6,8 mln so‘m (28.04.2026) — </w:t>
       </w:r>
-      <w:hyperlink w:history="1" r:id="rIdscbivqlh37agalq2kski_">
+      <w:hyperlink w:history="1" r:id="rIdgryj4zwp0owfo1plbwjvd">
         <w:r>
           <w:rPr>
             <w:rStyle w:val="Hyperlink"/>

</xml_diff>